<commit_message>
Art in: spire core and cradle, energy keeper, stream wire icon, section ring, rune frame and centre seal (ink and glow), command icons with a dark rim; the spire pylon is a flush 3x3 console; art prompts: Avir style as a synthesis (fewer stars), new core and pylon prompts
Co-Authored-By: Claude Opus 5.5 <noreply@anthropic.com>
Claude-Session: https://claude.ai/code/session_01YCWNLtj9zFsogxZeNiDKcG
</commit_message>
<xml_diff>
--- a/Промпты-арт.docx
+++ b/Промпты-арт.docx
@@ -20,7 +20,7 @@
         <w:pStyle w:val="ListBullet"/>
       </w:pPr>
       <w:r>
-        <w:t>стиль Авир небесный (звёзды, орбиты, созвездия, луны), не звериный;</w:t>
+        <w:t>стиль Авир — синтез, а не что-то одно: обработанный тёмный камень, серебро и старое золото, бледная фиолетовая эссенция, птичьи мотивы (перья, изгибы как у когтя или крыла) и лишь лёгкие небесные акценты (одна-две звезды, полумесяц, линия орбиты). Никаких карт созвездий по всей поверхности;</w:t>
       </w:r>
     </w:p>
     <w:p>
@@ -41,7 +41,20 @@
     </w:p>
     <w:p>
       <w:r>
-        <w:t>Сейчас в моде стоят заглушки; путь файла указан у каждого промпта.</w:t>
+        <w:t>Общая приписка о стиле (вставлять в каждый промпт):</w:t>
+      </w:r>
+    </w:p>
+    <w:p>
+      <w:pPr>
+        <w:pStyle w:val="IntenseQuote"/>
+      </w:pPr>
+      <w:r>
+        <w:t>Avir style: a synthesis of dark worked stone, polished silver and antique gold, pale violet essentium and bird-like motifs (feathers, talon and wing curves), with only light celestial accents - one or two small stars, a crescent or a single orbit line, never a star map.</w:t>
+      </w:r>
+    </w:p>
+    <w:p>
+      <w:r>
+        <w:t>Уже нарисовано и стоит в моде: ядро Шпиля, колыбель Шпиля, хранитель энергии, иконка провода, линия секции круга, рамка и печать круга (обе версии), лист иконок кнопок.</w:t>
       </w:r>
     </w:p>
     <w:p>
@@ -57,7 +70,7 @@
         <w:pStyle w:val="Heading2"/>
       </w:pPr>
       <w:r>
-        <w:t>Ядро Шпиля</w:t>
+        <w:t>Ядро Шпиля (переделка: меньше созвездий)</w:t>
       </w:r>
     </w:p>
     <w:p>
@@ -76,7 +89,7 @@
         <w:pStyle w:val="IntenseQuote"/>
       </w:pPr>
       <w:r>
-        <w:t>A great engraved sphere seen from slightly above, transparent background: polished pale essentium with a soft violet sheen, its surface carved with fine orbit lines and small constellations, nine tiny inlaid silver stars around its equator, a faint inner glow. Painterly RimWorld item style, soft even lighting, a thin dark outline around the whole object. 512×512.</w:t>
+        <w:t>A great sphere of polished pale violet essentium seen from slightly above, transparent background: a band of engraved silver around its equator set with three small feather-shaped inlays of antique gold, two thin silver orbit lines crossing its surface, one small eight-pointed star sigil on its face, a soft inner glow showing through the stone. Avir style: a synthesis of dark worked stone, polished silver and antique gold, pale violet essentium and bird-like motifs, with only light celestial accents, never a star map. Painterly RimWorld item style, soft even lighting, a thin dark outline around the whole object. 512×512.</w:t>
       </w:r>
     </w:p>
     <w:p>
@@ -84,34 +97,7 @@
         <w:pStyle w:val="Heading2"/>
       </w:pPr>
       <w:r>
-        <w:t>Колыбель Шпиля (5×5)</w:t>
-      </w:r>
-    </w:p>
-    <w:p>
-      <w:r>
-        <w:t xml:space="preserve">Файл: </w:t>
-      </w:r>
-      <w:r>
-        <w:rPr>
-          <w:rFonts w:ascii="Consolas" w:hAnsi="Consolas"/>
-        </w:rPr>
-        <w:t>Textures/Things/Building/Spire/SpireCradle.png</w:t>
-      </w:r>
-    </w:p>
-    <w:p>
-      <w:pPr>
-        <w:pStyle w:val="IntenseQuote"/>
-      </w:pPr>
-      <w:r>
-        <w:t>A round ceremonial platform sunk flush into the ground, seen from directly above, transparent background: a wide disc of dark worked stone with a silver ring at its rim, nine round hollows set evenly in a circle around a small glowing violet centre, and fifteen tiny silver studs spaced around the outer edge. Engraved orbit lines and small constellations between the hollows. Celestial, not animalistic. Painterly RimWorld building style, a thin dark outline around the whole object. 1024×1024.</w:t>
-      </w:r>
-    </w:p>
-    <w:p>
-      <w:pPr>
-        <w:pStyle w:val="Heading2"/>
-      </w:pPr>
-      <w:r>
-        <w:t>Пилон Шпиля (2×2)</w:t>
+        <w:t>Пилон Шпиля (консоль 3×3, вровень с землёй)</w:t>
       </w:r>
     </w:p>
     <w:p>
@@ -130,7 +116,7 @@
         <w:pStyle w:val="IntenseQuote"/>
       </w:pPr>
       <w:r>
-        <w:t>A tall slender engraved needle of polished silver and pale essentium rising from a small round base of dark worked stone, seen in the RimWorld top-down 3/4 view facing south; thin orbit rings carved around the needle at three heights, a single small star of violet light at its tip, faint constellation lines on the base. Celestial, not animalistic. Painterly RimWorld building style, a thin dark outline around the whole object. 512×768.</w:t>
+        <w:t>A round console set flush into the ground, seen from directly above, transparent background, like a ritual work table sunk into the floor: a wide ring of dark worked stone edged with polished silver; in its middle a low round working seat surrounded by a horseshoe of small instruments, levers and a lens of pale violet essentium; three curved feather-shaped silver inlays sweeping around the ring, one small crescent and one small star as accents. Avir style: a synthesis of dark worked stone, polished silver and antique gold, pale violet essentium and bird-like motifs, with only light celestial accents, never a star map. Painterly RimWorld building style, top-down, a thin dark outline around the whole object. 1024×1024.</w:t>
       </w:r>
     </w:p>
     <w:p>
@@ -139,60 +125,6 @@
       </w:pPr>
       <w:r>
         <w:t>Ритуалистика</w:t>
-      </w:r>
-    </w:p>
-    <w:p>
-      <w:pPr>
-        <w:pStyle w:val="Heading2"/>
-      </w:pPr>
-      <w:r>
-        <w:t>Хранитель энергии</w:t>
-      </w:r>
-    </w:p>
-    <w:p>
-      <w:r>
-        <w:t xml:space="preserve">Файл: </w:t>
-      </w:r>
-      <w:r>
-        <w:rPr>
-          <w:rFonts w:ascii="Consolas" w:hAnsi="Consolas"/>
-        </w:rPr>
-        <w:t>Textures/Things/Building/Ritualistics/EnergyKeeper.png</w:t>
-      </w:r>
-    </w:p>
-    <w:p>
-      <w:pPr>
-        <w:pStyle w:val="IntenseQuote"/>
-      </w:pPr>
-      <w:r>
-        <w:t>A tiny light set flush into a stone floor, seen from directly above, transparent background: a round socket of dark polished stone with a thin silver ring around it, eight tiny engraved stars spaced evenly on the ring, and a smooth pale crystal dome in the centre giving off a soft white glow. Painterly RimWorld style, even lighting, a thin dark outline around the whole object. 256×256.</w:t>
-      </w:r>
-    </w:p>
-    <w:p>
-      <w:pPr>
-        <w:pStyle w:val="Heading2"/>
-      </w:pPr>
-      <w:r>
-        <w:t>Провод потока (только чертёж; построенный провод невидим)</w:t>
-      </w:r>
-    </w:p>
-    <w:p>
-      <w:r>
-        <w:t xml:space="preserve">Файл: </w:t>
-      </w:r>
-      <w:r>
-        <w:rPr>
-          <w:rFonts w:ascii="Consolas" w:hAnsi="Consolas"/>
-        </w:rPr>
-        <w:t>Textures/Things/Building/Ritualistics/StreamWire.png</w:t>
-      </w:r>
-    </w:p>
-    <w:p>
-      <w:pPr>
-        <w:pStyle w:val="IntenseQuote"/>
-      </w:pPr>
-      <w:r>
-        <w:t>A small architect menu icon in the style of RimWorld's power conduit: a thin straight line of polished dark silver inlaid in a narrow groove, crossed by a second one into a plus-shaped joint, with one tiny dim violet point at the crossing. Muted colours that sit quietly beside vanilla icons - no glow, no bright purple. Transparent background, painterly RimWorld style, a thin dark outline. 128×128.</w:t>
       </w:r>
     </w:p>
     <w:p>
@@ -219,115 +151,7 @@
         <w:pStyle w:val="IntenseQuote"/>
       </w:pPr>
       <w:r>
-        <w:t>Top-down vortex in the flat painterly style of RimWorld: a simple swirl of 5–6 broad, soft, slightly desaturated violet bands spiralling into a darker centre, a few small grey stones caught in the arms, faint star-dust. Transparent background, no lines or threads crossing it, nothing touching the edges of the image. 512×512.</w:t>
-      </w:r>
-    </w:p>
-    <w:p>
-      <w:pPr>
-        <w:pStyle w:val="Heading2"/>
-      </w:pPr>
-      <w:r>
-        <w:t>Круг ритуала: линия секции</w:t>
-      </w:r>
-    </w:p>
-    <w:p>
-      <w:r>
-        <w:t xml:space="preserve">Файл: </w:t>
-      </w:r>
-      <w:r>
-        <w:rPr>
-          <w:rFonts w:ascii="Consolas" w:hAnsi="Consolas"/>
-        </w:rPr>
-        <w:t>Textures/UI/Ritualistics/Circle/SectionRing.png</w:t>
-      </w:r>
-      <w:r>
-        <w:t xml:space="preserve"> (подхватится сам; без него рисуется простая линия). Рисуется на каждой границе секции и как обод круга — и в книге, и на полу; красится в цвет ритуала, поэтому белая.</w:t>
-      </w:r>
-    </w:p>
-    <w:p>
-      <w:pPr>
-        <w:pStyle w:val="IntenseQuote"/>
-      </w:pPr>
-      <w:r>
-        <w:t>A single perfectly round ornamental ring, seen flat and centred, transparent background, pure white so it can be tinted in game: a fine double line with tiny eight-pointed stars and small crescent notches spaced evenly along it, like an astrolabe ring. The outer edge of the ring touches 98% of the image width; the line is thin (about 1.5% of the diameter) and the middle of the image is completely empty. Crisp, symmetric, no shading, no text. 1024×1024.</w:t>
-      </w:r>
-    </w:p>
-    <w:p>
-      <w:pPr>
-        <w:pStyle w:val="Heading2"/>
-      </w:pPr>
-      <w:r>
-        <w:t>Круг ритуала: рамка руны в секции (две версии)</w:t>
-      </w:r>
-    </w:p>
-    <w:p>
-      <w:r>
-        <w:t xml:space="preserve">Файлы: </w:t>
-      </w:r>
-      <w:r>
-        <w:rPr>
-          <w:rFonts w:ascii="Consolas" w:hAnsi="Consolas"/>
-        </w:rPr>
-        <w:t>Textures/UI/Ritualistics/Runes/Minor/Ink/Minor_Frame.png</w:t>
-      </w:r>
-      <w:r>
-        <w:t xml:space="preserve"> (чернила) и </w:t>
-      </w:r>
-      <w:r>
-        <w:rPr>
-          <w:rFonts w:ascii="Consolas" w:hAnsi="Consolas"/>
-        </w:rPr>
-        <w:t>.../Glow/Minor_Frame.png</w:t>
-      </w:r>
-      <w:r>
-        <w:t xml:space="preserve"> (свечение).</w:t>
-      </w:r>
-    </w:p>
-    <w:p>
-      <w:pPr>
-        <w:pStyle w:val="IntenseQuote"/>
-      </w:pPr>
-      <w:r>
-        <w:t>A small ornamental frame that holds one rune, seen flat and centred, transparent background: a rounded diamond made of a thin double line, with a tiny eight-pointed star at each of its four points and a faint orbit arc sweeping across one corner; the inside is completely empty and takes about 60% of the image. Version A: dark iron-gall ink lines. Version B: the same lines in pure white with a soft glow, so it can be tinted. Crisp and symmetric, fits inside a square, no text. 256×256.</w:t>
-      </w:r>
-    </w:p>
-    <w:p>
-      <w:pPr>
-        <w:pStyle w:val="Heading2"/>
-      </w:pPr>
-      <w:r>
-        <w:t>Круг ритуала: печать в центре (две версии)</w:t>
-      </w:r>
-    </w:p>
-    <w:p>
-      <w:r>
-        <w:t xml:space="preserve">Файлы: </w:t>
-      </w:r>
-      <w:r>
-        <w:rPr>
-          <w:rFonts w:ascii="Consolas" w:hAnsi="Consolas"/>
-        </w:rPr>
-        <w:t>Textures/UI/Ritualistics/Runes/Minor/Ink/Minor_Core.png</w:t>
-      </w:r>
-      <w:r>
-        <w:t xml:space="preserve"> и </w:t>
-      </w:r>
-      <w:r>
-        <w:rPr>
-          <w:rFonts w:ascii="Consolas" w:hAnsi="Consolas"/>
-        </w:rPr>
-        <w:t>.../Glow/Minor_Core.png</w:t>
-      </w:r>
-      <w:r>
-        <w:t>.</w:t>
-      </w:r>
-    </w:p>
-    <w:p>
-      <w:pPr>
-        <w:pStyle w:val="IntenseQuote"/>
-      </w:pPr>
-      <w:r>
-        <w:t>A round central seal for a ritual circle, seen flat and centred, transparent background: an eight-pointed star inside two thin concentric rings, a tiny crescent moon and a dot between each pair of star points, the very centre left as a small empty circle where the performer stands. Version A: dark iron-gall ink lines. Version B: pure white lines with a soft glow, so it can be tinted. Crisp, symmetric, no text. 512×512.</w:t>
+        <w:t>Top-down vortex in the flat painterly style of RimWorld: a simple swirl of 5–6 broad, soft, slightly desaturated violet bands spiralling into a darker centre, a few small grey stones caught in the arms, faint dust. Transparent background, no lines or threads crossing it, nothing touching the edges of the image. 512×512.</w:t>
       </w:r>
     </w:p>
     <w:p>
@@ -384,7 +208,7 @@
         <w:t>Textures/Things/Mote/Avir/EssentiumBeam.png</w:t>
       </w:r>
       <w:r>
-        <w:t xml:space="preserve"> (растягивается от наводки до цели и красится в золото или лунное серебро, поэтому белый).</w:t>
+        <w:t xml:space="preserve"> (растягивается от наводки до цели и красится в золото или лунное серебро, поэтому белый)</w:t>
       </w:r>
     </w:p>
     <w:p>
@@ -392,7 +216,7 @@
         <w:pStyle w:val="IntenseQuote"/>
       </w:pPr>
       <w:r>
-        <w:t>A single straight beam of pure light, seen flat and vertical, filling the image top to bottom, transparent background, pure white so it can be tinted in game: a narrow blinding core about one fifth of the image width, wrapped in a soft glow that fades to nothing at the left and right edges; faint drifting star-motes and thin streaks along its length, evenly spread so it can be stretched; no ends, no flares, no outline. 128×512.</w:t>
+        <w:t>A single straight beam of pure light, seen flat and vertical, filling the image top to bottom, transparent background, pure white so it can be tinted in game: a narrow blinding core about one fifth of the image width, wrapped in a soft glow that fades to nothing at the left and right edges; faint drifting motes and thin streaks along its length, evenly spread so it can be stretched; no ends, no flares, no outline. 128×512.</w:t>
       </w:r>
     </w:p>
     <w:p>
@@ -414,7 +238,7 @@
         <w:t>Textures/Things/Building/Artifactorics/EssentiumProjector_Top.png</w:t>
       </w:r>
       <w:r>
-        <w:t xml:space="preserve">. Важно: ствол на картинке смотрит </w:t>
+        <w:t xml:space="preserve">. Ствол на картинке смотрит </w:t>
       </w:r>
       <w:r>
         <w:rPr>
@@ -431,7 +255,7 @@
         <w:pStyle w:val="IntenseQuote"/>
       </w:pPr>
       <w:r>
-        <w:t>The turning head of a heavy celestial light-projector, seen from directly above, transparent background: a round swivel of dark worked stone with an antique gold ring in the centre of the image, and from it a long slender emitter of gold and pale essentium pointing to the RIGHT, ending in a small violet crystal lens; fine engraved orbit lines and tiny stars along it. Painterly RimWorld turret style, soft even lighting, a thin dark outline around the whole object. 512×512.</w:t>
+        <w:t>The turning head of a heavy light-projector, seen from directly above, transparent background: a round swivel of dark worked stone with an antique gold ring in the centre of the image, and from it a long slender emitter of gold and pale essentium pointing to the RIGHT, shaped like a folded wing with feather-like plates along it, ending in a small violet crystal lens. Avir style: a synthesis of dark worked stone, polished silver and antique gold, pale violet essentium and bird-like motifs, with only light celestial accents, never a star map. Painterly RimWorld turret style, soft even lighting, a thin dark outline around the whole object. 512×512.</w:t>
       </w:r>
     </w:p>
     <w:p>
@@ -439,210 +263,12 @@
         <w:pStyle w:val="Heading1"/>
       </w:pPr>
       <w:r>
-        <w:t>Иконки кнопок (гизмо) — один промпт на весь набор</w:t>
+        <w:t>Иконки кнопок</w:t>
       </w:r>
     </w:p>
     <w:p>
       <w:r>
-        <w:t xml:space="preserve">Сейчас на этих кнопках заглушки. Генерировать одним листом: так все иконки выйдут в одном стиле. Потом лист режется на отдельные файлы 256×256 в </w:t>
-      </w:r>
-      <w:r>
-        <w:rPr>
-          <w:rFonts w:ascii="Consolas" w:hAnsi="Consolas"/>
-        </w:rPr>
-        <w:t>Textures/UI/Commands/Avir/</w:t>
-      </w:r>
-      <w:r>
-        <w:t xml:space="preserve"> с именами из списка ниже (номер в промпте = номер в списке); код подхватит их сам.</w:t>
-      </w:r>
-    </w:p>
-    <w:p>
-      <w:pPr>
-        <w:pStyle w:val="IntenseQuote"/>
-      </w:pPr>
-      <w:r>
-        <w:t>A sprite sheet of 11 matching command button icons for the video game RimWorld, arranged in a neat grid of 4 columns and 3 rows on a plain transparent background, with generous empty space between them so they can be cut apart. All icons share one style: the Avir style - celestial, not animalistic (stars, orbits, crescent moons, pale violet essentium, polished silver, a little antique gold), flat painterly shading like vanilla RimWorld icons, one clear centred silhouette per icon readable at 64 pixels, a thin dark outline around every icon, no text, no frames, no background tiles. The icons, left to right, top to bottom:</w:t>
-      </w:r>
-    </w:p>
-    <w:p>
-      <w:pPr>
-        <w:pStyle w:val="IntenseQuote"/>
-      </w:pPr>
-      <w:r>
-        <w:t>1. a round engraved stone disc lifting off the ground, three short streaks of violet light beneath it, a few small stars above;</w:t>
-      </w:r>
-    </w:p>
-    <w:p>
-      <w:pPr>
-        <w:pStyle w:val="IntenseQuote"/>
-      </w:pPr>
-      <w:r>
-        <w:t>2. a square patch of pale violet ground with a fine dotted outline and a small silver plus-shaped star at its upper right corner;</w:t>
-      </w:r>
-    </w:p>
-    <w:p>
-      <w:pPr>
-        <w:pStyle w:val="IntenseQuote"/>
-      </w:pPr>
-      <w:r>
-        <w:t>3. the same dotted square patch of pale violet ground, crossed out by one thin silver diagonal stroke;</w:t>
-      </w:r>
-    </w:p>
-    <w:p>
-      <w:pPr>
-        <w:pStyle w:val="IntenseQuote"/>
-      </w:pPr>
-      <w:r>
-        <w:t>4. a glowing engraved sphere of pale essentium sinking into a round dark hollow, a small downward chevron of light above it;</w:t>
-      </w:r>
-    </w:p>
-    <w:p>
-      <w:pPr>
-        <w:pStyle w:val="IntenseQuote"/>
-      </w:pPr>
-      <w:r>
-        <w:t>5. the same sphere rising out of the round dark hollow, a small upward chevron of light below it;</w:t>
-      </w:r>
-    </w:p>
-    <w:p>
-      <w:pPr>
-        <w:pStyle w:val="IntenseQuote"/>
-      </w:pPr>
-      <w:r>
-        <w:t>6. a translucent violet dome over a tiny round platform, a ring of small stars along the dome's edge;</w:t>
-      </w:r>
-    </w:p>
-    <w:p>
-      <w:pPr>
-        <w:pStyle w:val="IntenseQuote"/>
-      </w:pPr>
-      <w:r>
-        <w:t>7. the same dome split into three soft colour wedges (violet, gold, pale blue), a tiny silver brush tip touching it;</w:t>
-      </w:r>
-    </w:p>
-    <w:p>
-      <w:pPr>
-        <w:pStyle w:val="IntenseQuote"/>
-      </w:pPr>
-      <w:r>
-        <w:t>8. a golden beam sweeping in an arc from a small round emitter, three faint fan lines marking narrow, medium and wide;</w:t>
-      </w:r>
-    </w:p>
-    <w:p>
-      <w:pPr>
-        <w:pStyle w:val="IntenseQuote"/>
-      </w:pPr>
-      <w:r>
-        <w:t>9. a small round floor light with a pale glowing dome, thin rays going out from it to three tiny gem points around it;</w:t>
-      </w:r>
-    </w:p>
-    <w:p>
-      <w:pPr>
-        <w:pStyle w:val="IntenseQuote"/>
-      </w:pPr>
-      <w:r>
-        <w:t>10. five small stars joined by fine silver lines into a constellation, one larger gem-like star in the middle;</w:t>
-      </w:r>
-    </w:p>
-    <w:p>
-      <w:pPr>
-        <w:pStyle w:val="IntenseQuote"/>
-      </w:pPr>
-      <w:r>
-        <w:t>11. a soft nest of pale down seen from above with a small sleeping chick curled in it, one tiny crescent moon above.</w:t>
-      </w:r>
-    </w:p>
-    <w:p>
-      <w:r>
-        <w:t>Файлы по номерам:</w:t>
-      </w:r>
-    </w:p>
-    <w:p>
-      <w:pPr>
-        <w:pStyle w:val="ListNumber"/>
-      </w:pPr>
-      <w:r>
-        <w:t>FlySpire.png — «Поднять Шпиль»</w:t>
-      </w:r>
-    </w:p>
-    <w:p>
-      <w:pPr>
-        <w:pStyle w:val="ListNumber"/>
-      </w:pPr>
-      <w:r>
-        <w:t>LiftZoneExpand.png — «Зона подъёма: расширить»</w:t>
-      </w:r>
-    </w:p>
-    <w:p>
-      <w:pPr>
-        <w:pStyle w:val="ListNumber"/>
-      </w:pPr>
-      <w:r>
-        <w:t>LiftZoneShrink.png — «Зона подъёма: убрать»</w:t>
-      </w:r>
-    </w:p>
-    <w:p>
-      <w:pPr>
-        <w:pStyle w:val="ListNumber"/>
-      </w:pPr>
-      <w:r>
-        <w:t>SinkCore.png — «Погрузить ядро»</w:t>
-      </w:r>
-    </w:p>
-    <w:p>
-      <w:pPr>
-        <w:pStyle w:val="ListNumber"/>
-      </w:pPr>
-      <w:r>
-        <w:t>TakeCore.png — «Вынуть ядро»</w:t>
-      </w:r>
-    </w:p>
-    <w:p>
-      <w:pPr>
-        <w:pStyle w:val="ListNumber"/>
-      </w:pPr>
-      <w:r>
-        <w:t>SpireBarrier.png — «Барьер»</w:t>
-      </w:r>
-    </w:p>
-    <w:p>
-      <w:pPr>
-        <w:pStyle w:val="ListNumber"/>
-      </w:pPr>
-      <w:r>
-        <w:t>BarrierColour.png — «Цвет барьера»</w:t>
-      </w:r>
-    </w:p>
-    <w:p>
-      <w:pPr>
-        <w:pStyle w:val="ListNumber"/>
-      </w:pPr>
-      <w:r>
-        <w:t>BeamArc.png — «Дуга луча»</w:t>
-      </w:r>
-    </w:p>
-    <w:p>
-      <w:pPr>
-        <w:pStyle w:val="ListNumber"/>
-      </w:pPr>
-      <w:r>
-        <w:t>KeeperCharge.png — «Подзаряжать вокруг»</w:t>
-      </w:r>
-    </w:p>
-    <w:p>
-      <w:pPr>
-        <w:pStyle w:val="ListNumber"/>
-      </w:pPr>
-      <w:r>
-        <w:t>ConstellationFunctions.png — «Функции созвездия»</w:t>
-      </w:r>
-    </w:p>
-    <w:p>
-      <w:pPr>
-        <w:pStyle w:val="ListNumber"/>
-      </w:pPr>
-      <w:r>
-        <w:t>PutChicksDown.png — «Опустить птенцов»</w:t>
+        <w:t>Лист иконок нарисован и стоит в моде (тёмную кайму иконкам добавляет обработка). Иконка «опустить птенцов» не используется — на этой кнопке остаётся ванильная.</w:t>
       </w:r>
     </w:p>
     <w:p>

</xml_diff>

<commit_message>
Spire pylon console art in, its working seat in the middle faces the instruments; turret head prompt redone strictly top-down; updates now go out as a small archive of what changed
Co-Authored-By: Claude Opus 5.5 <noreply@anthropic.com>
Claude-Session: https://claude.ai/code/session_01YCWNLtj9zFsogxZeNiDKcG
</commit_message>
<xml_diff>
--- a/Промпты-арт.docx
+++ b/Промпты-арт.docx
@@ -54,69 +54,7 @@
     </w:p>
     <w:p>
       <w:r>
-        <w:t>Уже нарисовано и стоит в моде: ядро Шпиля, колыбель Шпиля, хранитель энергии, иконка провода, линия секции круга, рамка и печать круга (обе версии), лист иконок кнопок.</w:t>
-      </w:r>
-    </w:p>
-    <w:p>
-      <w:pPr>
-        <w:pStyle w:val="Heading1"/>
-      </w:pPr>
-      <w:r>
-        <w:t>Шпиль</w:t>
-      </w:r>
-    </w:p>
-    <w:p>
-      <w:pPr>
-        <w:pStyle w:val="Heading2"/>
-      </w:pPr>
-      <w:r>
-        <w:t>Ядро Шпиля (переделка: меньше созвездий)</w:t>
-      </w:r>
-    </w:p>
-    <w:p>
-      <w:r>
-        <w:t xml:space="preserve">Файл: </w:t>
-      </w:r>
-      <w:r>
-        <w:rPr>
-          <w:rFonts w:ascii="Consolas" w:hAnsi="Consolas"/>
-        </w:rPr>
-        <w:t>Textures/Things/Item/Spire/SpireCore.png</w:t>
-      </w:r>
-    </w:p>
-    <w:p>
-      <w:pPr>
-        <w:pStyle w:val="IntenseQuote"/>
-      </w:pPr>
-      <w:r>
-        <w:t>A great sphere of polished pale violet essentium seen from slightly above, transparent background: a band of engraved silver around its equator set with three small feather-shaped inlays of antique gold, two thin silver orbit lines crossing its surface, one small eight-pointed star sigil on its face, a soft inner glow showing through the stone. Avir style: a synthesis of dark worked stone, polished silver and antique gold, pale violet essentium and bird-like motifs, with only light celestial accents, never a star map. Painterly RimWorld item style, soft even lighting, a thin dark outline around the whole object. 512×512.</w:t>
-      </w:r>
-    </w:p>
-    <w:p>
-      <w:pPr>
-        <w:pStyle w:val="Heading2"/>
-      </w:pPr>
-      <w:r>
-        <w:t>Пилон Шпиля (консоль 3×3, вровень с землёй)</w:t>
-      </w:r>
-    </w:p>
-    <w:p>
-      <w:r>
-        <w:t xml:space="preserve">Файл: </w:t>
-      </w:r>
-      <w:r>
-        <w:rPr>
-          <w:rFonts w:ascii="Consolas" w:hAnsi="Consolas"/>
-        </w:rPr>
-        <w:t>Textures/Things/Building/Spire/SpirePylon.png</w:t>
-      </w:r>
-    </w:p>
-    <w:p>
-      <w:pPr>
-        <w:pStyle w:val="IntenseQuote"/>
-      </w:pPr>
-      <w:r>
-        <w:t>A round console set flush into the ground, seen from directly above, transparent background, like a ritual work table sunk into the floor: a wide ring of dark worked stone edged with polished silver; in its middle a low round working seat surrounded by a horseshoe of small instruments, levers and a lens of pale violet essentium; three curved feather-shaped silver inlays sweeping around the ring, one small crescent and one small star as accents. Avir style: a synthesis of dark worked stone, polished silver and antique gold, pale violet essentium and bird-like motifs, with only light celestial accents, never a star map. Painterly RimWorld building style, top-down, a thin dark outline around the whole object. 1024×1024.</w:t>
+        <w:t>Уже нарисовано и стоит в моде: ядро Шпиля, колыбель Шпиля, пилон Шпиля (консоль), хранитель энергии, иконка провода, линия секции круга, рамка и печать круга (обе версии), лист иконок кнопок.</w:t>
       </w:r>
     </w:p>
     <w:p>
@@ -224,7 +162,7 @@
         <w:pStyle w:val="Heading2"/>
       </w:pPr>
       <w:r>
-        <w:t>Голова эссенциевой наводки</w:t>
+        <w:t>Голова эссенциевой наводки (переделка: строго сверху)</w:t>
       </w:r>
     </w:p>
     <w:p>
@@ -238,7 +176,7 @@
         <w:t>Textures/Things/Building/Artifactorics/EssentiumProjector_Top.png</w:t>
       </w:r>
       <w:r>
-        <w:t xml:space="preserve">. Ствол на картинке смотрит </w:t>
+        <w:t xml:space="preserve">. Ствол смотрит </w:t>
       </w:r>
       <w:r>
         <w:rPr>
@@ -247,7 +185,7 @@
         <w:t>вправо</w:t>
       </w:r>
       <w:r>
-        <w:t xml:space="preserve"> (так RimWorld поворачивает головы турелей), ось поворота — центр картинки.</w:t>
+        <w:t xml:space="preserve"> (так RimWorld поворачивает головы турелей), ось поворота — центр картинки. Прошлая версия вышла в ракурсе 3/4: видны бока и низ ствола, основание показано наклонно. Голова турели в игре вращается, поэтому её рисуют строго сверху и плоско.</w:t>
       </w:r>
     </w:p>
     <w:p>
@@ -255,7 +193,7 @@
         <w:pStyle w:val="IntenseQuote"/>
       </w:pPr>
       <w:r>
-        <w:t>The turning head of a heavy light-projector, seen from directly above, transparent background: a round swivel of dark worked stone with an antique gold ring in the centre of the image, and from it a long slender emitter of gold and pale essentium pointing to the RIGHT, shaped like a folded wing with feather-like plates along it, ending in a small violet crystal lens. Avir style: a synthesis of dark worked stone, polished silver and antique gold, pale violet essentium and bird-like motifs, with only light celestial accents, never a star map. Painterly RimWorld turret style, soft even lighting, a thin dark outline around the whole object. 512×512.</w:t>
+        <w:t>The turning head of a heavy light-projector turret for RimWorld, drawn in a strict orthographic top-down view like the vanilla turret heads: we look straight down on it, no perspective, no visible sides or underside, no tilt, soft flat lighting from above. In the centre of the image a compact round swivel ring of dark worked stone with a thin antique gold rim; from it one long slender emitter points straight to the RIGHT along the horizontal middle line, its top surface plated with overlapping silver feather-shaped scales and a gold spine, ending in a small round violet essentium lens. Symmetric along the horizontal axis. Avir style: a synthesis of dark worked stone, polished silver and antique gold, pale violet essentium and bird-like motifs, with only light celestial accents. Painterly RimWorld style, a thin dark outline, transparent background. 512×512, the swivel centred exactly in the image.</w:t>
       </w:r>
     </w:p>
     <w:p>

</xml_diff>

<commit_message>
Projector head and beam art, workbench pylon art; the spire raises its barrier by itself in orbit (toggle); ritual book cover prompt
Co-Authored-By: Claude Opus 5.5 <noreply@anthropic.com>
Claude-Session: https://claude.ai/code/session_01YCWNLtj9zFsogxZeNiDKcG
</commit_message>
<xml_diff>
--- a/Промпты-арт.docx
+++ b/Промпты-арт.docx
@@ -54,7 +54,7 @@
     </w:p>
     <w:p>
       <w:r>
-        <w:t>Уже нарисовано и стоит в моде: ядро Шпиля, колыбель Шпиля, пилон Шпиля (консоль), хранитель энергии, иконка провода, линия секции круга, рамка и печать круга (обе версии), лист иконок кнопок.</w:t>
+        <w:t>Уже нарисовано и стоит в моде: ядро Шпиля, колыбель Шпиля, пилон Шпиля (консоль), голова и луч эссенциевой наводки, пилон верстака, хранитель энергии, иконка провода, линия секции круга, рамка и печать круга (обе версии), лист иконок кнопок.</w:t>
       </w:r>
     </w:p>
     <w:p>
@@ -97,110 +97,6 @@
         <w:pStyle w:val="Heading1"/>
       </w:pPr>
       <w:r>
-        <w:t>Артефакторика</w:t>
-      </w:r>
-    </w:p>
-    <w:p>
-      <w:pPr>
-        <w:pStyle w:val="Heading2"/>
-      </w:pPr>
-      <w:r>
-        <w:t>Пилон верстака (3 гнезда)</w:t>
-      </w:r>
-    </w:p>
-    <w:p>
-      <w:r>
-        <w:t xml:space="preserve">Файл: по defName постройки, в </w:t>
-      </w:r>
-      <w:r>
-        <w:rPr>
-          <w:rFonts w:ascii="Consolas" w:hAnsi="Consolas"/>
-        </w:rPr>
-        <w:t>Textures/Things/Building/Artifactorics/</w:t>
-      </w:r>
-    </w:p>
-    <w:p>
-      <w:pPr>
-        <w:pStyle w:val="IntenseQuote"/>
-      </w:pPr>
-      <w:r>
-        <w:t>A carved wooden post with bronze fittings and hanging tools, seen in the RimWorld top-down 3/4 view facing south; three empty round sockets stacked down its front. Hand-painted flat shading, muted earthy palette with antique bronze, a thick dark outline. 1024×1400.</w:t>
-      </w:r>
-    </w:p>
-    <w:p>
-      <w:pPr>
-        <w:pStyle w:val="Heading2"/>
-      </w:pPr>
-      <w:r>
-        <w:t>Луч эссенциевой наводки</w:t>
-      </w:r>
-    </w:p>
-    <w:p>
-      <w:r>
-        <w:t xml:space="preserve">Файл: </w:t>
-      </w:r>
-      <w:r>
-        <w:rPr>
-          <w:rFonts w:ascii="Consolas" w:hAnsi="Consolas"/>
-        </w:rPr>
-        <w:t>Textures/Things/Mote/Avir/EssentiumBeam.png</w:t>
-      </w:r>
-      <w:r>
-        <w:t xml:space="preserve"> (растягивается от наводки до цели и красится в золото или лунное серебро, поэтому белый)</w:t>
-      </w:r>
-    </w:p>
-    <w:p>
-      <w:pPr>
-        <w:pStyle w:val="IntenseQuote"/>
-      </w:pPr>
-      <w:r>
-        <w:t>A single straight beam of pure light, seen flat and vertical, filling the image top to bottom, transparent background, pure white so it can be tinted in game: a narrow blinding core about one fifth of the image width, wrapped in a soft glow that fades to nothing at the left and right edges; faint drifting motes and thin streaks along its length, evenly spread so it can be stretched; no ends, no flares, no outline. 128×512.</w:t>
-      </w:r>
-    </w:p>
-    <w:p>
-      <w:pPr>
-        <w:pStyle w:val="Heading2"/>
-      </w:pPr>
-      <w:r>
-        <w:t>Голова эссенциевой наводки (переделка: строго сверху)</w:t>
-      </w:r>
-    </w:p>
-    <w:p>
-      <w:r>
-        <w:t xml:space="preserve">Файл: </w:t>
-      </w:r>
-      <w:r>
-        <w:rPr>
-          <w:rFonts w:ascii="Consolas" w:hAnsi="Consolas"/>
-        </w:rPr>
-        <w:t>Textures/Things/Building/Artifactorics/EssentiumProjector_Top.png</w:t>
-      </w:r>
-      <w:r>
-        <w:t xml:space="preserve">. Ствол смотрит </w:t>
-      </w:r>
-      <w:r>
-        <w:rPr>
-          <w:b/>
-        </w:rPr>
-        <w:t>вправо</w:t>
-      </w:r>
-      <w:r>
-        <w:t xml:space="preserve"> (так RimWorld поворачивает головы турелей), ось поворота — центр картинки. Прошлая версия вышла в ракурсе 3/4: видны бока и низ ствола, основание показано наклонно. Голова турели в игре вращается, поэтому её рисуют строго сверху и плоско.</w:t>
-      </w:r>
-    </w:p>
-    <w:p>
-      <w:pPr>
-        <w:pStyle w:val="IntenseQuote"/>
-      </w:pPr>
-      <w:r>
-        <w:t>The turning head of a heavy light-projector turret for RimWorld, drawn in a strict orthographic top-down view like the vanilla turret heads: we look straight down on it, no perspective, no visible sides or underside, no tilt, soft flat lighting from above. In the centre of the image a compact round swivel ring of dark worked stone with a thin antique gold rim; from it one long slender emitter points straight to the RIGHT along the horizontal middle line, its top surface plated with overlapping silver feather-shaped scales and a gold spine, ending in a small round violet essentium lens. Symmetric along the horizontal axis. Avir style: a synthesis of dark worked stone, polished silver and antique gold, pale violet essentium and bird-like motifs, with only light celestial accents. Painterly RimWorld style, a thin dark outline, transparent background. 512×512, the swivel centred exactly in the image.</w:t>
-      </w:r>
-    </w:p>
-    <w:p>
-      <w:pPr>
-        <w:pStyle w:val="Heading1"/>
-      </w:pPr>
-      <w:r>
         <w:t>Иконки кнопок</w:t>
       </w:r>
     </w:p>
@@ -214,21 +110,37 @@
         <w:pStyle w:val="Heading1"/>
       </w:pPr>
       <w:r>
-        <w:t>Ещё без промпта</w:t>
+        <w:t>Ритуальная книга</w:t>
       </w:r>
     </w:p>
     <w:p>
       <w:pPr>
-        <w:pStyle w:val="ListBullet"/>
+        <w:pStyle w:val="Heading2"/>
       </w:pPr>
       <w:r>
-        <w:rPr>
-          <w:b/>
-        </w:rPr>
-        <w:t>Обёртка ритуальной книги</w:t>
+        <w:t>Обложка (как у альманаха)</w:t>
+      </w:r>
+    </w:p>
+    <w:p>
+      <w:r>
+        <w:t xml:space="preserve">Файл: </w:t>
       </w:r>
       <w:r>
-        <w:t>: ждёт обсуждения.</w:t>
+        <w:rPr>
+          <w:rFonts w:ascii="Consolas" w:hAnsi="Consolas"/>
+        </w:rPr>
+        <w:t>Textures/UI/Ritualistics/Book/Cover.png</w:t>
+      </w:r>
+      <w:r>
+        <w:t xml:space="preserve"> (обложка книги ритуалов: открывается первой, по ней книга узнаётся)</w:t>
+      </w:r>
+    </w:p>
+    <w:p>
+      <w:pPr>
+        <w:pStyle w:val="IntenseQuote"/>
+      </w:pPr>
+      <w:r>
+        <w:t>The front cover of an old almanac of rituals, seen flat and straight on, filling the image edge to edge, portrait: dark leather over boards, worn soft at the edges, with polished silver corner pieces shaped like folded wing tips and a silver clasp on the right side; in the middle a round medallion of antique gold set with a disc of pale violet essentium, around it a thin engraved ring of small rune marks and two crossed feathers beneath it; a narrow tooled border runs around the whole cover; one small crescent and one small star above the medallion as the only celestial accents; an empty dark plate under the medallion for a title (no text on it). Avir style: a synthesis of dark worked leather and stone, polished silver and antique gold, pale violet essentium and bird-like motifs, with only light celestial accents, never a star map. Painterly RimWorld style, soft even lighting, a thin dark outline around the cover. 1024×1400.</w:t>
       </w:r>
     </w:p>
     <w:sectPr>

</xml_diff>

<commit_message>
Attuners mend the spire's raised barrier at a spire pylon's console; art prompts for the core hearth (with core vessel and link) and for the old Avicce buildings
Co-Authored-By: Claude Opus 5.5 <noreply@anthropic.com>
Claude-Session: https://claude.ai/code/session_01YCWNLtj9zFsogxZeNiDKcG
</commit_message>
<xml_diff>
--- a/Промпты-арт.docx
+++ b/Промпты-арт.docx
@@ -90,6 +90,395 @@
       </w:pPr>
       <w:r>
         <w:t>Top-down vortex in the flat painterly style of RimWorld: a simple swirl of 5–6 broad, soft, slightly desaturated violet bands spiralling into a darker centre, a few small grey stones caught in the arms, faint dust. Transparent background, no lines or threads crossing it, nothing touching the edges of the image. 512×512.</w:t>
+      </w:r>
+    </w:p>
+    <w:p>
+      <w:pPr>
+        <w:pStyle w:val="Heading1"/>
+      </w:pPr>
+      <w:r>
+        <w:t>Новый артефакт: очаг ядер (рабочее название)</w:t>
+      </w:r>
+    </w:p>
+    <w:p>
+      <w:r>
+        <w:t>3×3, не летает: держит 3 ядра Шпиля в контейнерах и питает большие авийские постройки; мелкие артефакты-связки подключают к нему шпили. Механику обсуждаем, пока только арт.</w:t>
+      </w:r>
+    </w:p>
+    <w:p>
+      <w:pPr>
+        <w:pStyle w:val="Heading2"/>
+      </w:pPr>
+      <w:r>
+        <w:t>Очаг ядер (3×3, вровень с землёй)</w:t>
+      </w:r>
+    </w:p>
+    <w:p>
+      <w:r>
+        <w:t xml:space="preserve">Файл: </w:t>
+      </w:r>
+      <w:r>
+        <w:rPr>
+          <w:rFonts w:ascii="Consolas" w:hAnsi="Consolas"/>
+        </w:rPr>
+        <w:t>Textures/Things/Building/Spire/CoreHearth.png</w:t>
+      </w:r>
+    </w:p>
+    <w:p>
+      <w:pPr>
+        <w:pStyle w:val="IntenseQuote"/>
+      </w:pPr>
+      <w:r>
+        <w:t>A square-round heavy platform of dark worked stone sunk flush into the ground, seen from directly above, transparent background: three deep round recesses grouped in a triangle around the centre, each lined with polished silver and sized to take a cylindrical vessel; thick antique gold channels run from the recesses to a small violet essentium node in the very middle; feather-shaped silver inlays curve along the rim, one small star and one crescent as accents. The recesses are empty and dark. Avir style: a synthesis of dark worked stone, polished silver and antique gold, pale violet essentium and bird-like motifs (feathers, talon and wing curves), with only light celestial accents - one or two small stars, a crescent or a single orbit line, never a star map. Painterly RimWorld building style, top-down, a thin dark outline around the whole object. 1024×1024.</w:t>
+      </w:r>
+    </w:p>
+    <w:p>
+      <w:pPr>
+        <w:pStyle w:val="Heading2"/>
+      </w:pPr>
+      <w:r>
+        <w:t>Контейнер с ядром (предмет)</w:t>
+      </w:r>
+    </w:p>
+    <w:p>
+      <w:r>
+        <w:t xml:space="preserve">Файл: </w:t>
+      </w:r>
+      <w:r>
+        <w:rPr>
+          <w:rFonts w:ascii="Consolas" w:hAnsi="Consolas"/>
+        </w:rPr>
+        <w:t>Textures/Things/Item/Spire/CoreVessel.png</w:t>
+      </w:r>
+    </w:p>
+    <w:p>
+      <w:pPr>
+        <w:pStyle w:val="IntenseQuote"/>
+      </w:pPr>
+      <w:r>
+        <w:t>A short cylindrical vessel seen from slightly above, transparent background: a cage of polished silver bands and antique gold rings holding a glowing sphere of pale violet essentium inside, a feather-shaped handle on the lid, small clasps around the base. Avir style: a synthesis of dark worked stone, polished silver and antique gold, pale violet essentium and bird-like motifs (feathers, talon and wing curves), with only light celestial accents - one or two small stars, a crescent or a single orbit line, never a star map. Painterly RimWorld item style, soft even lighting, a thin dark outline. 512×512.</w:t>
+      </w:r>
+    </w:p>
+    <w:p>
+      <w:pPr>
+        <w:pStyle w:val="Heading2"/>
+      </w:pPr>
+      <w:r>
+        <w:t>Связка (мелкий артефакт, подключает шпиль к очагу)</w:t>
+      </w:r>
+    </w:p>
+    <w:p>
+      <w:r>
+        <w:t xml:space="preserve">Файл: </w:t>
+      </w:r>
+      <w:r>
+        <w:rPr>
+          <w:rFonts w:ascii="Consolas" w:hAnsi="Consolas"/>
+        </w:rPr>
+        <w:t>Textures/Things/Item/Spire/SpireLink.png</w:t>
+      </w:r>
+    </w:p>
+    <w:p>
+      <w:pPr>
+        <w:pStyle w:val="IntenseQuote"/>
+      </w:pPr>
+      <w:r>
+        <w:t>A small artifact seen from slightly above, transparent background: two thin silver feathers bound together at the quill by an antique gold ring set with a tiny violet essentium bead, a fine silver thread looping from one tip to the other. Avir style: a synthesis of dark worked stone, polished silver and antique gold, pale violet essentium and bird-like motifs (feathers, talon and wing curves), with only light celestial accents - one or two small stars, a crescent or a single orbit line, never a star map. Painterly RimWorld item style, a thin dark outline. 256×256.</w:t>
+      </w:r>
+    </w:p>
+    <w:p>
+      <w:pPr>
+        <w:pStyle w:val="Heading1"/>
+      </w:pPr>
+      <w:r>
+        <w:t>Старые авийские постройки (Авичче)</w:t>
+      </w:r>
+    </w:p>
+    <w:p>
+      <w:r>
+        <w:t xml:space="preserve">До меня они стояли на чужих текстурах. Все </w:t>
+      </w:r>
+      <w:r>
+        <w:rPr>
+          <w:rFonts w:ascii="Consolas" w:hAnsi="Consolas"/>
+        </w:rPr>
+        <w:t>rotatable=false</w:t>
+      </w:r>
+      <w:r>
+        <w:t>, кроме бочки. Вид — привычный для RimWorld 3/4 с юга, если не сказано «сверху».</w:t>
+      </w:r>
+    </w:p>
+    <w:p>
+      <w:pPr>
+        <w:pStyle w:val="Heading2"/>
+      </w:pPr>
+      <w:r>
+        <w:t>Авийский ткач материи (Genesis Loom, 5×5)</w:t>
+      </w:r>
+    </w:p>
+    <w:p>
+      <w:r>
+        <w:t xml:space="preserve">Файл: </w:t>
+      </w:r>
+      <w:r>
+        <w:rPr>
+          <w:rFonts w:ascii="Consolas" w:hAnsi="Consolas"/>
+        </w:rPr>
+        <w:t>Textures/Things/Building/Production/OmniCrafter2_l.png</w:t>
+      </w:r>
+      <w:r>
+        <w:t xml:space="preserve"> (та же текстура у узорного ткача 3×3 — после арта разведу на два файла)</w:t>
+      </w:r>
+    </w:p>
+    <w:p>
+      <w:pPr>
+        <w:pStyle w:val="IntenseQuote"/>
+      </w:pPr>
+      <w:r>
+        <w:t>A large relic machine seen in the RimWorld top-down 3/4 view facing south, transparent background: a broad round base of dark worked stone; above it a tall arched frame of polished silver shaped like two raised wings, between them a hanging lattice of fine threads glowing pale violet, and a small lens of essentium where the threads meet; antique gold fittings, small instruments at the base. Avir style: a synthesis of dark worked stone, polished silver and antique gold, pale violet essentium and bird-like motifs (feathers, talon and wing curves), with only light celestial accents - one or two small stars, a crescent or a single orbit line, never a star map. Painterly RimWorld building style, a thin dark outline around the whole object. 1024×1024.</w:t>
+      </w:r>
+    </w:p>
+    <w:p>
+      <w:pPr>
+        <w:pStyle w:val="Heading2"/>
+      </w:pPr>
+      <w:r>
+        <w:t>Узорный ткач (Pattern Loom, 3×3)</w:t>
+      </w:r>
+    </w:p>
+    <w:p>
+      <w:r>
+        <w:t xml:space="preserve">Файл: </w:t>
+      </w:r>
+      <w:r>
+        <w:rPr>
+          <w:rFonts w:ascii="Consolas" w:hAnsi="Consolas"/>
+        </w:rPr>
+        <w:t>Textures/Things/Building/Production/PatternLoom.png</w:t>
+      </w:r>
+      <w:r>
+        <w:t xml:space="preserve"> (новый файл)</w:t>
+      </w:r>
+    </w:p>
+    <w:p>
+      <w:pPr>
+        <w:pStyle w:val="IntenseQuote"/>
+      </w:pPr>
+      <w:r>
+        <w:t>A frame of suspended threads seen in the RimWorld top-down 3/4 view facing south, transparent background: a square loom of dark wood and polished silver, its threads hanging in mid-air and fading at the ends as if not quite in the room; a small pale violet shape half-formed among them; feather-shaped silver finials on the corners. Avir style: a synthesis of dark worked stone, polished silver and antique gold, pale violet essentium and bird-like motifs (feathers, talon and wing curves), with only light celestial accents - one or two small stars, a crescent or a single orbit line, never a star map. Painterly RimWorld building style, a thin dark outline. 1024×1024.</w:t>
+      </w:r>
+    </w:p>
+    <w:p>
+      <w:pPr>
+        <w:pStyle w:val="Heading2"/>
+      </w:pPr>
+      <w:r>
+        <w:t>Растворитель (Dissolution Engine, 3×3)</w:t>
+      </w:r>
+    </w:p>
+    <w:p>
+      <w:r>
+        <w:t xml:space="preserve">Файл: </w:t>
+      </w:r>
+      <w:r>
+        <w:rPr>
+          <w:rFonts w:ascii="Consolas" w:hAnsi="Consolas"/>
+        </w:rPr>
+        <w:t>Textures/Things/Building/Production/MatterEnergyConverter.png</w:t>
+      </w:r>
+    </w:p>
+    <w:p>
+      <w:pPr>
+        <w:pStyle w:val="IntenseQuote"/>
+      </w:pPr>
+      <w:r>
+        <w:t>The same loom run backwards, seen in the RimWorld top-down 3/4 view facing south, transparent background: a low round basin of dark worked stone with a ring of polished silver, threads of pale violet light unravelling upward out of it into nothing, an antique gold collar around the basin with feather-shaped vents. Avir style: a synthesis of dark worked stone, polished silver and antique gold, pale violet essentium and bird-like motifs (feathers, talon and wing curves), with only light celestial accents - one or two small stars, a crescent or a single orbit line, never a star map. Painterly RimWorld building style, a thin dark outline. 1024×1024.</w:t>
+      </w:r>
+    </w:p>
+    <w:p>
+      <w:pPr>
+        <w:pStyle w:val="Heading2"/>
+      </w:pPr>
+      <w:r>
+        <w:t>Миротворец (Worldweaver, 3×3)</w:t>
+      </w:r>
+    </w:p>
+    <w:p>
+      <w:r>
+        <w:t xml:space="preserve">Файл: </w:t>
+      </w:r>
+      <w:r>
+        <w:rPr>
+          <w:rFonts w:ascii="Consolas" w:hAnsi="Consolas"/>
+        </w:rPr>
+        <w:t>Textures/Things/Building/Production/RealityWeaver.png</w:t>
+      </w:r>
+      <w:r>
+        <w:t xml:space="preserve"> (та же текстура у авийского столпа — после арта разведу)</w:t>
+      </w:r>
+    </w:p>
+    <w:p>
+      <w:pPr>
+        <w:pStyle w:val="IntenseQuote"/>
+      </w:pPr>
+      <w:r>
+        <w:t>A builder's loom seen in the RimWorld top-down 3/4 view facing south, transparent background: a round base of dark worked stone carrying a slowly turning ring of polished silver, from which three thin arms reach out holding tiny floating blocks of stone and steel; a pale violet essentium core in the middle; antique gold fittings, a small feather crest on top. Avir style: a synthesis of dark worked stone, polished silver and antique gold, pale violet essentium and bird-like motifs (feathers, talon and wing curves), with only light celestial accents - one or two small stars, a crescent or a single orbit line, never a star map. Painterly RimWorld building style, a thin dark outline. 1024×1024.</w:t>
+      </w:r>
+    </w:p>
+    <w:p>
+      <w:pPr>
+        <w:pStyle w:val="Heading2"/>
+      </w:pPr>
+      <w:r>
+        <w:t>Пепельный страж (Cinderward, 3×3)</w:t>
+      </w:r>
+    </w:p>
+    <w:p>
+      <w:r>
+        <w:t xml:space="preserve">Файл: </w:t>
+      </w:r>
+      <w:r>
+        <w:rPr>
+          <w:rFonts w:ascii="Consolas" w:hAnsi="Consolas"/>
+        </w:rPr>
+        <w:t>Textures/Things/Building/Production/GlobalFireExtinguisher.png</w:t>
+      </w:r>
+    </w:p>
+    <w:p>
+      <w:pPr>
+        <w:pStyle w:val="IntenseQuote"/>
+      </w:pPr>
+      <w:r>
+        <w:t>A ward that swallows fire, seen in the RimWorld top-down 3/4 view facing south, transparent background: a wide shallow bowl of dark worked stone on three talon-shaped feet of antique gold, inside it a cold pale violet flame folding into itself, a silver ring of small feather-shaped vanes around the rim, a little ash on the stone. Avir style: a synthesis of dark worked stone, polished silver and antique gold, pale violet essentium and bird-like motifs (feathers, talon and wing curves), with only light celestial accents - one or two small stars, a crescent or a single orbit line, never a star map. Painterly RimWorld building style, a thin dark outline. 1024×1024.</w:t>
+      </w:r>
+    </w:p>
+    <w:p>
+      <w:pPr>
+        <w:pStyle w:val="Heading2"/>
+      </w:pPr>
+      <w:r>
+        <w:t>Сосуд сути (Essence Reservoir, 3×3)</w:t>
+      </w:r>
+    </w:p>
+    <w:p>
+      <w:r>
+        <w:t xml:space="preserve">Файл: </w:t>
+      </w:r>
+      <w:r>
+        <w:rPr>
+          <w:rFonts w:ascii="Consolas" w:hAnsi="Consolas"/>
+        </w:rPr>
+        <w:t>Textures/Things/Building/Production/OmniBattery.png</w:t>
+      </w:r>
+    </w:p>
+    <w:p>
+      <w:pPr>
+        <w:pStyle w:val="IntenseQuote"/>
+      </w:pPr>
+      <w:r>
+        <w:t>A standing vessel of amber and drawn silver seen in the RimWorld top-down 3/4 view facing south, transparent background: a tall rounded amber tank held in a cage of polished silver wire, a soft violet glow inside it, a palm-shaped silver plate on its front where a hand is laid, an antique gold collar and base of dark worked stone, a thin wire leading away from the base. Avir style: a synthesis of dark worked stone, polished silver and antique gold, pale violet essentium and bird-like motifs (feathers, talon and wing curves), with only light celestial accents - one or two small stars, a crescent or a single orbit line, never a star map. Painterly RimWorld building style, a thin dark outline. 1024×1024.</w:t>
+      </w:r>
+    </w:p>
+    <w:p>
+      <w:pPr>
+        <w:pStyle w:val="Heading2"/>
+      </w:pPr>
+      <w:r>
+        <w:t>Авийский столп света (Avir Pylon, 3×3)</w:t>
+      </w:r>
+    </w:p>
+    <w:p>
+      <w:r>
+        <w:t xml:space="preserve">Файл: </w:t>
+      </w:r>
+      <w:r>
+        <w:rPr>
+          <w:rFonts w:ascii="Consolas" w:hAnsi="Consolas"/>
+        </w:rPr>
+        <w:t>Textures/Things/Building/Production/AvirPylon.png</w:t>
+      </w:r>
+      <w:r>
+        <w:t xml:space="preserve"> (новый файл)</w:t>
+      </w:r>
+    </w:p>
+    <w:p>
+      <w:pPr>
+        <w:pStyle w:val="IntenseQuote"/>
+      </w:pPr>
+      <w:r>
+        <w:t>A tall slender standing column of dark worked stone and polished silver seen in the RimWorld top-down 3/4 view facing south, transparent background: at its crown a lantern of pale violet essentium held by four silver feather-shaped ribs, warm light around it; wide antique gold brackets near the top as if carrying a roof; a broad round foot. Avir style: a synthesis of dark worked stone, polished silver and antique gold, pale violet essentium and bird-like motifs (feathers, talon and wing curves), with only light celestial accents - one or two small stars, a crescent or a single orbit line, never a star map. Painterly RimWorld building style, a thin dark outline. 1024×1536.</w:t>
+      </w:r>
+    </w:p>
+    <w:p>
+      <w:pPr>
+        <w:pStyle w:val="Heading2"/>
+      </w:pPr>
+      <w:r>
+        <w:t>Ядро фейналлита (Feignallite Core, 3×3, вровень с полом)</w:t>
+      </w:r>
+    </w:p>
+    <w:p>
+      <w:r>
+        <w:t xml:space="preserve">Файл: </w:t>
+      </w:r>
+      <w:r>
+        <w:rPr>
+          <w:rFonts w:ascii="Consolas" w:hAnsi="Consolas"/>
+        </w:rPr>
+        <w:t>Textures/Things/Building/Production/Avir_FeignalliteCore.png</w:t>
+      </w:r>
+    </w:p>
+    <w:p>
+      <w:pPr>
+        <w:pStyle w:val="IntenseQuote"/>
+      </w:pPr>
+      <w:r>
+        <w:t>A seed of singing stone grown into the floor, seen from directly above, transparent background: a round cluster of pale grey-green crystal facets rising only slightly from a ring of dark worked stone, fine silver veins spreading outward from it into the floor like roots, a faint violet shimmer in the crystal's heart, small feather-shaped silver clasps holding the ring. Avir style: a synthesis of dark worked stone, polished silver and antique gold, pale violet essentium and bird-like motifs (feathers, talon and wing curves), with only light celestial accents - one or two small stars, a crescent or a single orbit line, never a star map. Painterly RimWorld building style, top-down, a thin dark outline. 1024×1024.</w:t>
+      </w:r>
+    </w:p>
+    <w:p>
+      <w:pPr>
+        <w:pStyle w:val="Heading2"/>
+      </w:pPr>
+      <w:r>
+        <w:t>Бочка теней (Shadowsong Barrel, 1×1, поворачивается)</w:t>
+      </w:r>
+    </w:p>
+    <w:p>
+      <w:r>
+        <w:t xml:space="preserve">Файлы: </w:t>
+      </w:r>
+      <w:r>
+        <w:rPr>
+          <w:rFonts w:ascii="Consolas" w:hAnsi="Consolas"/>
+        </w:rPr>
+        <w:t>Textures/Things/Building/AvirFermentingBarrel/Avir_FermentingBarrel_south.png</w:t>
+      </w:r>
+      <w:r>
+        <w:t xml:space="preserve">, </w:t>
+      </w:r>
+      <w:r>
+        <w:rPr>
+          <w:rFonts w:ascii="Consolas" w:hAnsi="Consolas"/>
+        </w:rPr>
+        <w:t>_east.png</w:t>
+      </w:r>
+      <w:r>
+        <w:t xml:space="preserve">, </w:t>
+      </w:r>
+      <w:r>
+        <w:rPr>
+          <w:rFonts w:ascii="Consolas" w:hAnsi="Consolas"/>
+        </w:rPr>
+        <w:t>_north.png</w:t>
+      </w:r>
+    </w:p>
+    <w:p>
+      <w:pPr>
+        <w:pStyle w:val="IntenseQuote"/>
+      </w:pPr>
+      <w:r>
+        <w:t>A small ornate fermenting cask seen in the RimWorld top-down 3/4 view, three views on one sheet - facing south, facing east, facing north - side by side with space between them, transparent background: dark wood staves bound with polished silver hoops, an antique gold spigot shaped like a bird's beak on the front (seen on the south view, in profile on the east view, absent on the north view), a faint violet sheen of wine at the seams, one small crescent stamped on the lid. Avir style: a synthesis of dark worked stone, polished silver and antique gold, pale violet essentium and bird-like motifs (feathers, talon and wing curves), with only light celestial accents - one or two small stars, a crescent or a single orbit line, never a star map. Painterly RimWorld style, a thin dark outline. 1536×512.</w:t>
       </w:r>
     </w:p>
     <w:p>

</xml_diff>

<commit_message>
Core hearth: a 3x3 battery of up to three spire cores (6000 Wd each) on the grid and the stream network, charged by Fill and vortex and in the void, cracks now and then (event) and is mended by a Fill ritual; the core-sinking job serves any core holder
Co-Authored-By: Claude Opus 5.5 <noreply@anthropic.com>
Claude-Session: https://claude.ai/code/session_01YCWNLtj9zFsogxZeNiDKcG
</commit_message>
<xml_diff>
--- a/Промпты-арт.docx
+++ b/Промпты-арт.docx
@@ -97,20 +97,7 @@
         <w:pStyle w:val="Heading1"/>
       </w:pPr>
       <w:r>
-        <w:t>Новый артефакт: очаг ядер (рабочее название)</w:t>
-      </w:r>
-    </w:p>
-    <w:p>
-      <w:r>
-        <w:t>3×3, не летает: держит 3 ядра Шпиля в контейнерах и питает большие авийские постройки; мелкие артефакты-связки подключают к нему шпили. Механику обсуждаем, пока только арт.</w:t>
-      </w:r>
-    </w:p>
-    <w:p>
-      <w:pPr>
-        <w:pStyle w:val="Heading2"/>
-      </w:pPr>
-      <w:r>
-        <w:t>Очаг ядер (3×3, вровень с землёй)</w:t>
+        <w:t>Очаг ядер (Core Hearth, 3×3, вровень с землёй)</w:t>
       </w:r>
     </w:p>
     <w:p>
@@ -123,32 +110,8 @@
         </w:rPr>
         <w:t>Textures/Things/Building/Spire/CoreHearth.png</w:t>
       </w:r>
-    </w:p>
-    <w:p>
-      <w:pPr>
-        <w:pStyle w:val="IntenseQuote"/>
-      </w:pPr>
       <w:r>
-        <w:t>A square-round heavy platform of dark worked stone sunk flush into the ground, seen from directly above, transparent background: three deep round recesses grouped in a triangle around the centre, each lined with polished silver and sized to take a cylindrical vessel; thick antique gold channels run from the recesses to a small violet essentium node in the very middle; feather-shaped silver inlays curve along the rim, one small star and one crescent as accents. The recesses are empty and dark. Avir style: a synthesis of dark worked stone, polished silver and antique gold, pale violet essentium and bird-like motifs (feathers, talon and wing curves), with only light celestial accents - one or two small stars, a crescent or a single orbit line, never a star map. Painterly RimWorld building style, top-down, a thin dark outline around the whole object. 1024×1024.</w:t>
-      </w:r>
-    </w:p>
-    <w:p>
-      <w:pPr>
-        <w:pStyle w:val="Heading2"/>
-      </w:pPr>
-      <w:r>
-        <w:t>Контейнер с ядром (предмет)</w:t>
-      </w:r>
-    </w:p>
-    <w:p>
-      <w:r>
-        <w:t xml:space="preserve">Файл: </w:t>
-      </w:r>
-      <w:r>
-        <w:rPr>
-          <w:rFonts w:ascii="Consolas" w:hAnsi="Consolas"/>
-        </w:rPr>
-        <w:t>Textures/Things/Item/Spire/CoreVessel.png</w:t>
+        <w:t xml:space="preserve"> (сейчас стоит заглушка). Батарея на 3 ядра Шпиля для обычного электричества и узел сети потока. Контейнеры — часть постройки; ядра в них рисует игра, поэтому на картинке контейнеры пустые. Ставятся треугольником: один сверху, два снизу слева и справа, на расстоянии примерно пятой части ширины от центра.</w:t>
       </w:r>
     </w:p>
     <w:p>
@@ -156,34 +119,7 @@
         <w:pStyle w:val="IntenseQuote"/>
       </w:pPr>
       <w:r>
-        <w:t>A short cylindrical vessel seen from slightly above, transparent background: a cage of polished silver bands and antique gold rings holding a glowing sphere of pale violet essentium inside, a feather-shaped handle on the lid, small clasps around the base. Avir style: a synthesis of dark worked stone, polished silver and antique gold, pale violet essentium and bird-like motifs (feathers, talon and wing curves), with only light celestial accents - one or two small stars, a crescent or a single orbit line, never a star map. Painterly RimWorld item style, soft even lighting, a thin dark outline. 512×512.</w:t>
-      </w:r>
-    </w:p>
-    <w:p>
-      <w:pPr>
-        <w:pStyle w:val="Heading2"/>
-      </w:pPr>
-      <w:r>
-        <w:t>Связка (мелкий артефакт, подключает шпиль к очагу)</w:t>
-      </w:r>
-    </w:p>
-    <w:p>
-      <w:r>
-        <w:t xml:space="preserve">Файл: </w:t>
-      </w:r>
-      <w:r>
-        <w:rPr>
-          <w:rFonts w:ascii="Consolas" w:hAnsi="Consolas"/>
-        </w:rPr>
-        <w:t>Textures/Things/Item/Spire/SpireLink.png</w:t>
-      </w:r>
-    </w:p>
-    <w:p>
-      <w:pPr>
-        <w:pStyle w:val="IntenseQuote"/>
-      </w:pPr>
-      <w:r>
-        <w:t>A small artifact seen from slightly above, transparent background: two thin silver feathers bound together at the quill by an antique gold ring set with a tiny violet essentium bead, a fine silver thread looping from one tip to the other. Avir style: a synthesis of dark worked stone, polished silver and antique gold, pale violet essentium and bird-like motifs (feathers, talon and wing curves), with only light celestial accents - one or two small stars, a crescent or a single orbit line, never a star map. Painterly RimWorld item style, a thin dark outline. 256×256.</w:t>
+        <w:t>A heavy round hearth of dark worked stone sunk flush into the ground, seen from directly above, transparent background: three round open containers set into it in a triangle around the centre (one at the top, two at the lower left and lower right), each a cage of polished silver bands with an antique gold rim, empty and dark inside; thick antique gold channels run from the containers to a small violet essentium node in the very middle; feather-shaped silver inlays curve along the outer rim, one small star and one crescent as accents. Avir style: a synthesis of dark worked stone, polished silver and antique gold, pale violet essentium and bird-like motifs (feathers, talon and wing curves), with only light celestial accents - one or two small stars, a crescent or a single orbit line, never a star map. Painterly RimWorld building style, top-down, a thin dark outline around the whole object. 1024×1024.</w:t>
       </w:r>
     </w:p>
     <w:p>

</xml_diff>

<commit_message>
Vortex and core hearth art (cores drawn in the hearth's measured containers); the ritual panels take a 9-slice wrapper frame when its art exists; wrapper prompt instead of a cover
Co-Authored-By: Claude Opus 5.5 <noreply@anthropic.com>
Claude-Session: https://claude.ai/code/session_01YCWNLtj9zFsogxZeNiDKcG
</commit_message>
<xml_diff>
--- a/Промпты-арт.docx
+++ b/Промпты-арт.docx
@@ -54,72 +54,7 @@
     </w:p>
     <w:p>
       <w:r>
-        <w:t>Уже нарисовано и стоит в моде: ядро Шпиля, колыбель Шпиля, пилон Шпиля (консоль), голова и луч эссенциевой наводки, пилон верстака, хранитель энергии, иконка провода, линия секции круга, рамка и печать круга (обе версии), лист иконок кнопок.</w:t>
-      </w:r>
-    </w:p>
-    <w:p>
-      <w:pPr>
-        <w:pStyle w:val="Heading1"/>
-      </w:pPr>
-      <w:r>
-        <w:t>Ритуалистика</w:t>
-      </w:r>
-    </w:p>
-    <w:p>
-      <w:pPr>
-        <w:pStyle w:val="Heading2"/>
-      </w:pPr>
-      <w:r>
-        <w:t>Вихрь (по желанию)</w:t>
-      </w:r>
-    </w:p>
-    <w:p>
-      <w:r>
-        <w:t xml:space="preserve">Файл: </w:t>
-      </w:r>
-      <w:r>
-        <w:rPr>
-          <w:rFonts w:ascii="Consolas" w:hAnsi="Consolas"/>
-        </w:rPr>
-        <w:t>Textures/Things/Mote/Avir/Vortex.png</w:t>
-      </w:r>
-    </w:p>
-    <w:p>
-      <w:pPr>
-        <w:pStyle w:val="IntenseQuote"/>
-      </w:pPr>
-      <w:r>
-        <w:t>Top-down vortex in the flat painterly style of RimWorld: a simple swirl of 5–6 broad, soft, slightly desaturated violet bands spiralling into a darker centre, a few small grey stones caught in the arms, faint dust. Transparent background, no lines or threads crossing it, nothing touching the edges of the image. 512×512.</w:t>
-      </w:r>
-    </w:p>
-    <w:p>
-      <w:pPr>
-        <w:pStyle w:val="Heading1"/>
-      </w:pPr>
-      <w:r>
-        <w:t>Очаг ядер (Core Hearth, 3×3, вровень с землёй)</w:t>
-      </w:r>
-    </w:p>
-    <w:p>
-      <w:r>
-        <w:t xml:space="preserve">Файл: </w:t>
-      </w:r>
-      <w:r>
-        <w:rPr>
-          <w:rFonts w:ascii="Consolas" w:hAnsi="Consolas"/>
-        </w:rPr>
-        <w:t>Textures/Things/Building/Spire/CoreHearth.png</w:t>
-      </w:r>
-      <w:r>
-        <w:t xml:space="preserve"> (сейчас стоит заглушка). Батарея на 3 ядра Шпиля для обычного электричества и узел сети потока. Контейнеры — часть постройки; ядра в них рисует игра, поэтому на картинке контейнеры пустые. Ставятся треугольником: один сверху, два снизу слева и справа, на расстоянии примерно пятой части ширины от центра.</w:t>
-      </w:r>
-    </w:p>
-    <w:p>
-      <w:pPr>
-        <w:pStyle w:val="IntenseQuote"/>
-      </w:pPr>
-      <w:r>
-        <w:t>A heavy round hearth of dark worked stone sunk flush into the ground, seen from directly above, transparent background: three round open containers set into it in a triangle around the centre (one at the top, two at the lower left and lower right), each a cage of polished silver bands with an antique gold rim, empty and dark inside; thick antique gold channels run from the containers to a small violet essentium node in the very middle; feather-shaped silver inlays curve along the outer rim, one small star and one crescent as accents. Avir style: a synthesis of dark worked stone, polished silver and antique gold, pale violet essentium and bird-like motifs (feathers, talon and wing curves), with only light celestial accents - one or two small stars, a crescent or a single orbit line, never a star map. Painterly RimWorld building style, top-down, a thin dark outline around the whole object. 1024×1024.</w:t>
+        <w:t>Уже нарисовано и стоит в моде: ядро Шпиля, колыбель Шпиля, пилон Шпиля (консоль), голова и луч эссенциевой наводки, пилон верстака, вихрь, очаг ядер, хранитель энергии, иконка провода, линия секции круга, рамка и печать круга (обе версии), лист иконок кнопок.</w:t>
       </w:r>
     </w:p>
     <w:p>
@@ -435,15 +370,7 @@
         <w:pStyle w:val="Heading1"/>
       </w:pPr>
       <w:r>
-        <w:t>Ритуальная книга</w:t>
-      </w:r>
-    </w:p>
-    <w:p>
-      <w:pPr>
-        <w:pStyle w:val="Heading2"/>
-      </w:pPr>
-      <w:r>
-        <w:t>Обложка (как у альманаха)</w:t>
+        <w:t>Ритуальная книга: обёртка по краям панели</w:t>
       </w:r>
     </w:p>
     <w:p>
@@ -454,10 +381,10 @@
         <w:rPr>
           <w:rFonts w:ascii="Consolas" w:hAnsi="Consolas"/>
         </w:rPr>
-        <w:t>Textures/UI/Ritualistics/Book/Cover.png</w:t>
+        <w:t>Textures/UI/Ritualistics/Book/Frame.png</w:t>
       </w:r>
       <w:r>
-        <w:t xml:space="preserve"> (обложка книги ритуалов: открывается первой, по ней книга узнаётся)</w:t>
+        <w:t>. Рисуется вокруг всех окон ритуалистики (книга, редактор): углы остаются как нарисованы, стороны растягиваются, середина — прозрачная (там пергамент). Поэтому полоса рамки занимает ровно 1/7 ширины картинки с каждой стороны, а середины сторон — ровные, без украшений, которые испортятся при растяжении.</w:t>
       </w:r>
     </w:p>
     <w:p>
@@ -465,7 +392,7 @@
         <w:pStyle w:val="IntenseQuote"/>
       </w:pPr>
       <w:r>
-        <w:t>The front cover of an old almanac of rituals, seen flat and straight on, filling the image edge to edge, portrait: dark leather over boards, worn soft at the edges, with polished silver corner pieces shaped like folded wing tips and a silver clasp on the right side; in the middle a round medallion of antique gold set with a disc of pale violet essentium, around it a thin engraved ring of small rune marks and two crossed feathers beneath it; a narrow tooled border runs around the whole cover; one small crescent and one small star above the medallion as the only celestial accents; an empty dark plate under the medallion for a title (no text on it). Avir style: a synthesis of dark worked leather and stone, polished silver and antique gold, pale violet essentium and bird-like motifs, with only light celestial accents, never a star map. Painterly RimWorld style, soft even lighting, a thin dark outline around the cover. 1024×1400.</w:t>
+        <w:t>A square ornamental frame for a game window, seen flat and straight on, the whole image is the frame: a band of dark tooled leather like the edge of an old book's binding runs along all four sides, exactly one seventh of the image wide; in each of the four corners a polished silver corner piece shaped like a folded wing tip with a small antique gold rivet; a fine gold line runs along the inner edge of the band; the leather along the sides is plain and even, with no ornaments in the middle of the sides, so it can be stretched; the whole middle of the image is completely empty and transparent. Avir style: a synthesis of dark worked stone and leather, polished silver and antique gold, pale violet essentium and bird-like motifs (feathers, talon and wing curves), with only light celestial accents - one or two small stars, a crescent or a single orbit line, never a star map. Painterly RimWorld UI style, crisp edges, no text. 1024×1024, transparent background.</w:t>
       </w:r>
     </w:p>
     <w:sectPr>

</xml_diff>

<commit_message>
Hushleaf and the heartwing draught: a tenth of an Avir female's fertility for ten days, triple desire in a male, white barrenness on overuse (cured by the Phoenix's essence); prompts for the vessel, herb and leaves
Co-Authored-By: Claude Opus 5.5 <noreply@anthropic.com>
Claude-Session: https://claude.ai/code/session_01YCWNLtj9zFsogxZeNiDKcG
</commit_message>
<xml_diff>
--- a/Промпты-арт.docx
+++ b/Промпты-арт.docx
@@ -357,6 +357,122 @@
         <w:pStyle w:val="Heading1"/>
       </w:pPr>
       <w:r>
+        <w:t>Лекарства</w:t>
+      </w:r>
+    </w:p>
+    <w:p>
+      <w:pPr>
+        <w:pStyle w:val="Heading2"/>
+      </w:pPr>
+      <w:r>
+        <w:t>Сердцекрыл — склянка (белая)</w:t>
+      </w:r>
+    </w:p>
+    <w:p>
+      <w:r>
+        <w:t xml:space="preserve">Файл: </w:t>
+      </w:r>
+      <w:r>
+        <w:rPr>
+          <w:rFonts w:ascii="Consolas" w:hAnsi="Consolas"/>
+        </w:rPr>
+        <w:t>Textures/Things/Item/Drugs/Avir_HeartwingDraught.png</w:t>
+      </w:r>
+      <w:r>
+        <w:t xml:space="preserve"> (сейчас заглушка). Стиль как у уже нарисованных склянок мода: толстая тёмная обводка-«стикер», мягкий рисованный объём.</w:t>
+      </w:r>
+    </w:p>
+    <w:p>
+      <w:pPr>
+        <w:pStyle w:val="IntenseQuote"/>
+      </w:pPr>
+      <w:r>
+        <w:t>A single small potion vessel shaped like a rounded vase with a short narrow neck and a smooth dark stopper, seen straight on, transparent background: thick milky-white viscous liquid fills it almost to the neck, slowly swirling, with a soft pearly sheen; on its belly a raised silver emblem of a heart made of two folded bird wings. RimWorld drug item style like a painted sticker: soft painterly shading, a thick dark outline around the whole vessel. 512×512.</w:t>
+      </w:r>
+    </w:p>
+    <w:p>
+      <w:pPr>
+        <w:pStyle w:val="Heading2"/>
+      </w:pPr>
+      <w:r>
+        <w:t>Бледная тишь-трава — растение</w:t>
+      </w:r>
+    </w:p>
+    <w:p>
+      <w:r>
+        <w:t xml:space="preserve">Файлы: </w:t>
+      </w:r>
+      <w:r>
+        <w:rPr>
+          <w:rFonts w:ascii="Consolas" w:hAnsi="Consolas"/>
+        </w:rPr>
+        <w:t>Textures/Things/Plant/Avir_Hushleaf/Avir_Hushleaf_A.png</w:t>
+      </w:r>
+      <w:r>
+        <w:t xml:space="preserve">, </w:t>
+      </w:r>
+      <w:r>
+        <w:rPr>
+          <w:rFonts w:ascii="Consolas" w:hAnsi="Consolas"/>
+        </w:rPr>
+        <w:t>_B.png</w:t>
+      </w:r>
+      <w:r>
+        <w:t xml:space="preserve">, </w:t>
+      </w:r>
+      <w:r>
+        <w:rPr>
+          <w:rFonts w:ascii="Consolas" w:hAnsi="Consolas"/>
+        </w:rPr>
+        <w:t>_C.png</w:t>
+      </w:r>
+      <w:r>
+        <w:t xml:space="preserve"> (три варианта одного куста; пока стоит перекрашенный ванильный психоид)</w:t>
+      </w:r>
+    </w:p>
+    <w:p>
+      <w:pPr>
+        <w:pStyle w:val="IntenseQuote"/>
+      </w:pPr>
+      <w:r>
+        <w:t>Three variants of one low herb plant for RimWorld on one sheet, side by side with space between them, seen in the RimWorld top-down 3/4 view, transparent background: a small round tuft of soft pale leaves, almost white with a faint grey-green tint and silvery undersides, a few thin stems with tiny white buds; each variant slightly different in shape. Painterly RimWorld plant style, a thin dark outline. 1536×512.</w:t>
+      </w:r>
+    </w:p>
+    <w:p>
+      <w:pPr>
+        <w:pStyle w:val="Heading2"/>
+      </w:pPr>
+      <w:r>
+        <w:t>Листья тишь-травы — предмет</w:t>
+      </w:r>
+    </w:p>
+    <w:p>
+      <w:r>
+        <w:t xml:space="preserve">Файл: </w:t>
+      </w:r>
+      <w:r>
+        <w:rPr>
+          <w:rFonts w:ascii="Consolas" w:hAnsi="Consolas"/>
+        </w:rPr>
+        <w:t>Textures/Things/Item/Resource/Avir_Hushleaf.png</w:t>
+      </w:r>
+      <w:r>
+        <w:t xml:space="preserve"> (сейчас заглушка)</w:t>
+      </w:r>
+    </w:p>
+    <w:p>
+      <w:pPr>
+        <w:pStyle w:val="IntenseQuote"/>
+      </w:pPr>
+      <w:r>
+        <w:t>A small bundle of dried pale leaves, almost white with a faint grey-green tint, tied with a thin silver-grey thread, seen from slightly above, transparent background. RimWorld resource item style, soft painterly shading, a thin dark outline. 256×256.</w:t>
+      </w:r>
+    </w:p>
+    <w:p>
+      <w:pPr>
+        <w:pStyle w:val="Heading1"/>
+      </w:pPr>
+      <w:r>
         <w:t>Иконки кнопок</w:t>
       </w:r>
     </w:p>

</xml_diff>

<commit_message>
Heartwing draught works on anyone, its vessel varies with the stack, and with RJW the male's fire triples SexFrequency; prompts: the vessel as a three-variant sheet, the old Avicce buildings described as flush round seals
Co-Authored-By: Claude Opus 5.5 <noreply@anthropic.com>
Claude-Session: https://claude.ai/code/session_01YCWNLtj9zFsogxZeNiDKcG
</commit_message>
<xml_diff>
--- a/Промпты-арт.docx
+++ b/Промпты-арт.docx
@@ -67,16 +67,7 @@
     </w:p>
     <w:p>
       <w:r>
-        <w:t xml:space="preserve">До меня они стояли на чужих текстурах. Все </w:t>
-      </w:r>
-      <w:r>
-        <w:rPr>
-          <w:rFonts w:ascii="Consolas" w:hAnsi="Consolas"/>
-        </w:rPr>
-        <w:t>rotatable=false</w:t>
-      </w:r>
-      <w:r>
-        <w:t>, кроме бочки. Вид — привычный для RimWorld 3/4 с юга, если не сказано «сверху».</w:t>
+        <w:t>Хранятся на будущее, сейчас ими не занимаемся. В моде они выглядят как круглые печати, вписанные в пол и показанные строго сверху, поэтому и промпты такие (кроме бочки).</w:t>
       </w:r>
     </w:p>
     <w:p>
@@ -106,7 +97,7 @@
         <w:pStyle w:val="IntenseQuote"/>
       </w:pPr>
       <w:r>
-        <w:t>A large relic machine seen in the RimWorld top-down 3/4 view facing south, transparent background: a broad round base of dark worked stone; above it a tall arched frame of polished silver shaped like two raised wings, between them a hanging lattice of fine threads glowing pale violet, and a small lens of essentium where the threads meet; antique gold fittings, small instruments at the base. Avir style: a synthesis of dark worked stone, polished silver and antique gold, pale violet essentium and bird-like motifs (feathers, talon and wing curves), with only light celestial accents - one or two small stars, a crescent or a single orbit line, never a star map. Painterly RimWorld building style, a thin dark outline around the whole object. 1024×1024.</w:t>
+        <w:t>A large relic machine seen from directly above as a round plate set flush into the floor, like a carved seal of dark metal and stone, transparent background: a broad round base of dark worked stone; above it a tall arched frame of polished silver shaped like two raised wings, between them a hanging lattice of fine threads glowing pale violet, and a small lens of essentium where the threads meet; antique gold fittings, small instruments at the base. Avir style: a synthesis of dark worked stone, polished silver and antique gold, pale violet essentium and bird-like motifs (feathers, talon and wing curves), with only light celestial accents - one or two small stars, a crescent or a single orbit line, never a star map. Painterly RimWorld building style, a thin dark outline around the whole object. 1024×1024.</w:t>
       </w:r>
     </w:p>
     <w:p>
@@ -136,7 +127,7 @@
         <w:pStyle w:val="IntenseQuote"/>
       </w:pPr>
       <w:r>
-        <w:t>A frame of suspended threads seen in the RimWorld top-down 3/4 view facing south, transparent background: a square loom of dark wood and polished silver, its threads hanging in mid-air and fading at the ends as if not quite in the room; a small pale violet shape half-formed among them; feather-shaped silver finials on the corners. Avir style: a synthesis of dark worked stone, polished silver and antique gold, pale violet essentium and bird-like motifs (feathers, talon and wing curves), with only light celestial accents - one or two small stars, a crescent or a single orbit line, never a star map. Painterly RimWorld building style, a thin dark outline. 1024×1024.</w:t>
+        <w:t>A frame of suspended threads seen from directly above as a round plate set flush into the floor, like a carved seal of dark metal and stone, transparent background: a square loom of dark wood and polished silver, its threads hanging in mid-air and fading at the ends as if not quite in the room; a small pale violet shape half-formed among them; feather-shaped silver finials on the corners. Avir style: a synthesis of dark worked stone, polished silver and antique gold, pale violet essentium and bird-like motifs (feathers, talon and wing curves), with only light celestial accents - one or two small stars, a crescent or a single orbit line, never a star map. Painterly RimWorld building style, a thin dark outline. 1024×1024.</w:t>
       </w:r>
     </w:p>
     <w:p>
@@ -163,7 +154,7 @@
         <w:pStyle w:val="IntenseQuote"/>
       </w:pPr>
       <w:r>
-        <w:t>The same loom run backwards, seen in the RimWorld top-down 3/4 view facing south, transparent background: a low round basin of dark worked stone with a ring of polished silver, threads of pale violet light unravelling upward out of it into nothing, an antique gold collar around the basin with feather-shaped vents. Avir style: a synthesis of dark worked stone, polished silver and antique gold, pale violet essentium and bird-like motifs (feathers, talon and wing curves), with only light celestial accents - one or two small stars, a crescent or a single orbit line, never a star map. Painterly RimWorld building style, a thin dark outline. 1024×1024.</w:t>
+        <w:t>The same loom run backwards, seen from directly above as a round plate set flush into the floor, like a carved seal of dark metal and stone, transparent background: a low round basin of dark worked stone with a ring of polished silver, threads of pale violet light unravelling upward out of it into nothing, an antique gold collar around the basin with feather-shaped vents. Avir style: a synthesis of dark worked stone, polished silver and antique gold, pale violet essentium and bird-like motifs (feathers, talon and wing curves), with only light celestial accents - one or two small stars, a crescent or a single orbit line, never a star map. Painterly RimWorld building style, a thin dark outline. 1024×1024.</w:t>
       </w:r>
     </w:p>
     <w:p>
@@ -193,7 +184,7 @@
         <w:pStyle w:val="IntenseQuote"/>
       </w:pPr>
       <w:r>
-        <w:t>A builder's loom seen in the RimWorld top-down 3/4 view facing south, transparent background: a round base of dark worked stone carrying a slowly turning ring of polished silver, from which three thin arms reach out holding tiny floating blocks of stone and steel; a pale violet essentium core in the middle; antique gold fittings, a small feather crest on top. Avir style: a synthesis of dark worked stone, polished silver and antique gold, pale violet essentium and bird-like motifs (feathers, talon and wing curves), with only light celestial accents - one or two small stars, a crescent or a single orbit line, never a star map. Painterly RimWorld building style, a thin dark outline. 1024×1024.</w:t>
+        <w:t>A builder's loom seen from directly above as a round plate set flush into the floor, like a carved seal of dark metal and stone, transparent background: a round base of dark worked stone carrying a slowly turning ring of polished silver, from which three thin arms reach out holding tiny floating blocks of stone and steel; a pale violet essentium core in the middle; antique gold fittings, a small feather crest on top. Avir style: a synthesis of dark worked stone, polished silver and antique gold, pale violet essentium and bird-like motifs (feathers, talon and wing curves), with only light celestial accents - one or two small stars, a crescent or a single orbit line, never a star map. Painterly RimWorld building style, a thin dark outline. 1024×1024.</w:t>
       </w:r>
     </w:p>
     <w:p>
@@ -220,7 +211,7 @@
         <w:pStyle w:val="IntenseQuote"/>
       </w:pPr>
       <w:r>
-        <w:t>A ward that swallows fire, seen in the RimWorld top-down 3/4 view facing south, transparent background: a wide shallow bowl of dark worked stone on three talon-shaped feet of antique gold, inside it a cold pale violet flame folding into itself, a silver ring of small feather-shaped vanes around the rim, a little ash on the stone. Avir style: a synthesis of dark worked stone, polished silver and antique gold, pale violet essentium and bird-like motifs (feathers, talon and wing curves), with only light celestial accents - one or two small stars, a crescent or a single orbit line, never a star map. Painterly RimWorld building style, a thin dark outline. 1024×1024.</w:t>
+        <w:t>A ward that swallows fire, seen from directly above as a round plate set flush into the floor, like a carved seal of dark metal and stone, transparent background: a wide shallow bowl of dark worked stone on three talon-shaped feet of antique gold, inside it a cold pale violet flame folding into itself, a silver ring of small feather-shaped vanes around the rim, a little ash on the stone. Avir style: a synthesis of dark worked stone, polished silver and antique gold, pale violet essentium and bird-like motifs (feathers, talon and wing curves), with only light celestial accents - one or two small stars, a crescent or a single orbit line, never a star map. Painterly RimWorld building style, a thin dark outline. 1024×1024.</w:t>
       </w:r>
     </w:p>
     <w:p>
@@ -247,7 +238,7 @@
         <w:pStyle w:val="IntenseQuote"/>
       </w:pPr>
       <w:r>
-        <w:t>A standing vessel of amber and drawn silver seen in the RimWorld top-down 3/4 view facing south, transparent background: a tall rounded amber tank held in a cage of polished silver wire, a soft violet glow inside it, a palm-shaped silver plate on its front where a hand is laid, an antique gold collar and base of dark worked stone, a thin wire leading away from the base. Avir style: a synthesis of dark worked stone, polished silver and antique gold, pale violet essentium and bird-like motifs (feathers, talon and wing curves), with only light celestial accents - one or two small stars, a crescent or a single orbit line, never a star map. Painterly RimWorld building style, a thin dark outline. 1024×1024.</w:t>
+        <w:t>A standing vessel of amber and drawn silver seen from directly above as a round plate set flush into the floor, like a carved seal of dark metal and stone, transparent background: a tall rounded amber tank held in a cage of polished silver wire, a soft violet glow inside it, a palm-shaped silver plate on its front where a hand is laid, an antique gold collar and base of dark worked stone, a thin wire leading away from the base. Avir style: a synthesis of dark worked stone, polished silver and antique gold, pale violet essentium and bird-like motifs (feathers, talon and wing curves), with only light celestial accents - one or two small stars, a crescent or a single orbit line, never a star map. Painterly RimWorld building style, a thin dark outline. 1024×1024.</w:t>
       </w:r>
     </w:p>
     <w:p>
@@ -277,7 +268,7 @@
         <w:pStyle w:val="IntenseQuote"/>
       </w:pPr>
       <w:r>
-        <w:t>A tall slender standing column of dark worked stone and polished silver seen in the RimWorld top-down 3/4 view facing south, transparent background: at its crown a lantern of pale violet essentium held by four silver feather-shaped ribs, warm light around it; wide antique gold brackets near the top as if carrying a roof; a broad round foot. Avir style: a synthesis of dark worked stone, polished silver and antique gold, pale violet essentium and bird-like motifs (feathers, talon and wing curves), with only light celestial accents - one or two small stars, a crescent or a single orbit line, never a star map. Painterly RimWorld building style, a thin dark outline. 1024×1536.</w:t>
+        <w:t>A round floor seal of dark worked stone and polished silver seen from directly above as a round plate set flush into the floor, like a carved seal of dark metal and stone, transparent background: at its crown a lantern of pale violet essentium held by four silver feather-shaped ribs, warm light around it; wide antique gold brackets near the top as if carrying a roof; a broad round foot. Avir style: a synthesis of dark worked stone, polished silver and antique gold, pale violet essentium and bird-like motifs (feathers, talon and wing curves), with only light celestial accents - one or two small stars, a crescent or a single orbit line, never a star map. Painterly RimWorld building style, a thin dark outline. 1024×1536.</w:t>
       </w:r>
     </w:p>
     <w:p>
@@ -365,21 +356,39 @@
         <w:pStyle w:val="Heading2"/>
       </w:pPr>
       <w:r>
-        <w:t>Сердцекрыл — склянка (белая)</w:t>
+        <w:t>Сердцекрыл — склянки (белые), три варианта под стак</w:t>
       </w:r>
     </w:p>
     <w:p>
       <w:r>
-        <w:t xml:space="preserve">Файл: </w:t>
+        <w:t xml:space="preserve">Файлы: </w:t>
       </w:r>
       <w:r>
         <w:rPr>
           <w:rFonts w:ascii="Consolas" w:hAnsi="Consolas"/>
         </w:rPr>
-        <w:t>Textures/Things/Item/Drugs/Avir_HeartwingDraught.png</w:t>
+        <w:t>Textures/Things/Item/Drugs/Avir_HeartwingDraught/Avir_HeartwingDraught_a.png</w:t>
       </w:r>
       <w:r>
-        <w:t xml:space="preserve"> (сейчас заглушка). Стиль как у уже нарисованных склянок мода: толстая тёмная обводка-«стикер», мягкий рисованный объём.</w:t>
+        <w:t xml:space="preserve"> (одна склянка), </w:t>
+      </w:r>
+      <w:r>
+        <w:rPr>
+          <w:rFonts w:ascii="Consolas" w:hAnsi="Consolas"/>
+        </w:rPr>
+        <w:t>_b.png</w:t>
+      </w:r>
+      <w:r>
+        <w:t xml:space="preserve"> (две-три), </w:t>
+      </w:r>
+      <w:r>
+        <w:rPr>
+          <w:rFonts w:ascii="Consolas" w:hAnsi="Consolas"/>
+        </w:rPr>
+        <w:t>_c.png</w:t>
+      </w:r>
+      <w:r>
+        <w:t xml:space="preserve"> (пять-шесть, почти полный стак до 25). Игра сама меняет картинку по числу в стопке. Стиль как у уже нарисованных склянок мода: толстая тёмная обводка-«стикер», мягкий рисованный объём.</w:t>
       </w:r>
     </w:p>
     <w:p>
@@ -387,7 +396,7 @@
         <w:pStyle w:val="IntenseQuote"/>
       </w:pPr>
       <w:r>
-        <w:t>A single small potion vessel shaped like a rounded vase with a short narrow neck and a smooth dark stopper, seen straight on, transparent background: thick milky-white viscous liquid fills it almost to the neck, slowly swirling, with a soft pearly sheen; on its belly a raised silver emblem of a heart made of two folded bird wings. RimWorld drug item style like a painted sticker: soft painterly shading, a thick dark outline around the whole vessel. 512×512.</w:t>
+        <w:t>A sheet of three item icons side by side with space between them, transparent background, the same small potion vessel in each: a rounded vase with a short narrow neck and a smooth dark stopper, filled almost to the neck with thick milky-white viscous liquid with a soft pearly sheen, on its belly a raised silver emblem of a heart made of two folded bird wings. Icon one: a single vessel. Icon two: two or three of them standing together, slightly overlapping. Icon three: a small cluster of five or six of them, as a full stack. RimWorld drug item style like a painted sticker: soft painterly shading, a thick dark outline around each group. 1536×512.</w:t>
       </w:r>
     </w:p>
     <w:p>

</xml_diff>

<commit_message>
Heartwing draught stack pictures by bands (1-5, 6-15, 16-25: one, three, five vessels); lore notes on the Avir as chimeras and their subraces
Co-Authored-By: Claude Opus 5.5 <noreply@anthropic.com>
Claude-Session: https://claude.ai/code/session_01YCWNLtj9zFsogxZeNiDKcG
</commit_message>
<xml_diff>
--- a/Промпты-арт.docx
+++ b/Промпты-арт.docx
@@ -370,7 +370,7 @@
         <w:t>Textures/Things/Item/Drugs/Avir_HeartwingDraught/Avir_HeartwingDraught_a.png</w:t>
       </w:r>
       <w:r>
-        <w:t xml:space="preserve"> (одна склянка), </w:t>
+        <w:t xml:space="preserve"> (одна склянка — в стопке до 5), </w:t>
       </w:r>
       <w:r>
         <w:rPr>
@@ -379,7 +379,7 @@
         <w:t>_b.png</w:t>
       </w:r>
       <w:r>
-        <w:t xml:space="preserve"> (две-три), </w:t>
+        <w:t xml:space="preserve"> (три склянки — до 15), </w:t>
       </w:r>
       <w:r>
         <w:rPr>
@@ -388,7 +388,7 @@
         <w:t>_c.png</w:t>
       </w:r>
       <w:r>
-        <w:t xml:space="preserve"> (пять-шесть, почти полный стак до 25). Игра сама меняет картинку по числу в стопке. Стиль как у уже нарисованных склянок мода: толстая тёмная обводка-«стикер», мягкий рисованный объём.</w:t>
+        <w:t xml:space="preserve"> (пять склянок — до 25). Игра сама меняет картинку по числу в стопке. Стиль как у уже нарисованных склянок мода: толстая тёмная обводка-«стикер», мягкий рисованный объём.</w:t>
       </w:r>
     </w:p>
     <w:p>
@@ -396,7 +396,7 @@
         <w:pStyle w:val="IntenseQuote"/>
       </w:pPr>
       <w:r>
-        <w:t>A sheet of three item icons side by side with space between them, transparent background, the same small potion vessel in each: a rounded vase with a short narrow neck and a smooth dark stopper, filled almost to the neck with thick milky-white viscous liquid with a soft pearly sheen, on its belly a raised silver emblem of a heart made of two folded bird wings. Icon one: a single vessel. Icon two: two or three of them standing together, slightly overlapping. Icon three: a small cluster of five or six of them, as a full stack. RimWorld drug item style like a painted sticker: soft painterly shading, a thick dark outline around each group. 1536×512.</w:t>
+        <w:t>A sheet of three item icons side by side with space between them, transparent background, the same small potion vessel in each: a rounded vase with a short narrow neck and a smooth dark stopper, filled almost to the neck with thick milky-white viscous liquid with a soft pearly sheen, on its belly a raised silver emblem of a heart made of two folded bird wings. Icon one: a single vessel. Icon two: exactly three of them standing together, slightly overlapping. Icon three: exactly five of them in a small cluster. RimWorld drug item style like a painted sticker: soft painterly shading, a thick dark outline around each group. 1536×512.</w:t>
       </w:r>
     </w:p>
     <w:p>

</xml_diff>

<commit_message>
Small breasts for Avir females, bird milk from hushleaf (RJW), new heartwing/hushleaf/frame art
Co-Authored-By: Claude Opus 5.5 <noreply@anthropic.com>
Claude-Session: https://claude.ai/code/session_01YCWNLtj9zFsogxZeNiDKcG
</commit_message>
<xml_diff>
--- a/Промпты-арт.docx
+++ b/Промпты-арт.docx
@@ -4,7 +4,7 @@
   <w:body>
     <w:p>
       <w:pPr>
-        <w:pStyle w:val="Title"/>
+        <w:pStyle w:val="Heading1"/>
       </w:pPr>
       <w:r>
         <w:t>Промпты для арта (ChatGPT): что ещё не нарисовано</w:t>
@@ -54,12 +54,12 @@
     </w:p>
     <w:p>
       <w:r>
-        <w:t>Уже нарисовано и стоит в моде: ядро Шпиля, колыбель Шпиля, пилон Шпиля (консоль), голова и луч эссенциевой наводки, пилон верстака, вихрь, очаг ядер, хранитель энергии, иконка провода, линия секции круга, рамка и печать круга (обе версии), лист иконок кнопок.</w:t>
+        <w:t>Уже нарисовано и стоит в моде: ядро Шпиля, колыбель Шпиля, пилон Шпиля (консоль), голова и луч эссенциевой наводки, пилон верстака, вихрь, очаг ядер, хранитель энергии, иконка провода, линия секции круга, рамка и печать круга (обе версии), лист иконок кнопок, склянки «Сердцекрыла» (1/3/5), тишь-трава (растение и листья), рамка окон ритуалистики.</w:t>
       </w:r>
     </w:p>
     <w:p>
       <w:pPr>
-        <w:pStyle w:val="Heading1"/>
+        <w:pStyle w:val="Heading2"/>
       </w:pPr>
       <w:r>
         <w:t>Старые авийские постройки (Авичче)</w:t>
@@ -72,7 +72,7 @@
     </w:p>
     <w:p>
       <w:pPr>
-        <w:pStyle w:val="Heading2"/>
+        <w:pStyle w:val="Heading3"/>
       </w:pPr>
       <w:r>
         <w:t>Авийский ткач материи (Genesis Loom, 5×5)</w:t>
@@ -80,16 +80,7 @@
     </w:p>
     <w:p>
       <w:r>
-        <w:t xml:space="preserve">Файл: </w:t>
-      </w:r>
-      <w:r>
-        <w:rPr>
-          <w:rFonts w:ascii="Consolas" w:hAnsi="Consolas"/>
-        </w:rPr>
-        <w:t>Textures/Things/Building/Production/OmniCrafter2_l.png</w:t>
-      </w:r>
-      <w:r>
-        <w:t xml:space="preserve"> (та же текстура у узорного ткача 3×3 — после арта разведу на два файла)</w:t>
+        <w:t>Файл: Textures/Things/Building/Production/OmniCrafter2_l.png (та же текстура у узорного ткача 3×3 — после арта разведу на два файла)</w:t>
       </w:r>
     </w:p>
     <w:p>
@@ -102,7 +93,7 @@
     </w:p>
     <w:p>
       <w:pPr>
-        <w:pStyle w:val="Heading2"/>
+        <w:pStyle w:val="Heading3"/>
       </w:pPr>
       <w:r>
         <w:t>Узорный ткач (Pattern Loom, 3×3)</w:t>
@@ -110,16 +101,7 @@
     </w:p>
     <w:p>
       <w:r>
-        <w:t xml:space="preserve">Файл: </w:t>
-      </w:r>
-      <w:r>
-        <w:rPr>
-          <w:rFonts w:ascii="Consolas" w:hAnsi="Consolas"/>
-        </w:rPr>
-        <w:t>Textures/Things/Building/Production/PatternLoom.png</w:t>
-      </w:r>
-      <w:r>
-        <w:t xml:space="preserve"> (новый файл)</w:t>
+        <w:t>Файл: Textures/Things/Building/Production/PatternLoom.png (новый файл)</w:t>
       </w:r>
     </w:p>
     <w:p>
@@ -132,7 +114,7 @@
     </w:p>
     <w:p>
       <w:pPr>
-        <w:pStyle w:val="Heading2"/>
+        <w:pStyle w:val="Heading3"/>
       </w:pPr>
       <w:r>
         <w:t>Растворитель (Dissolution Engine, 3×3)</w:t>
@@ -140,13 +122,7 @@
     </w:p>
     <w:p>
       <w:r>
-        <w:t xml:space="preserve">Файл: </w:t>
-      </w:r>
-      <w:r>
-        <w:rPr>
-          <w:rFonts w:ascii="Consolas" w:hAnsi="Consolas"/>
-        </w:rPr>
-        <w:t>Textures/Things/Building/Production/MatterEnergyConverter.png</w:t>
+        <w:t>Файл: Textures/Things/Building/Production/MatterEnergyConverter.png</w:t>
       </w:r>
     </w:p>
     <w:p>
@@ -159,7 +135,7 @@
     </w:p>
     <w:p>
       <w:pPr>
-        <w:pStyle w:val="Heading2"/>
+        <w:pStyle w:val="Heading3"/>
       </w:pPr>
       <w:r>
         <w:t>Миротворец (Worldweaver, 3×3)</w:t>
@@ -167,16 +143,7 @@
     </w:p>
     <w:p>
       <w:r>
-        <w:t xml:space="preserve">Файл: </w:t>
-      </w:r>
-      <w:r>
-        <w:rPr>
-          <w:rFonts w:ascii="Consolas" w:hAnsi="Consolas"/>
-        </w:rPr>
-        <w:t>Textures/Things/Building/Production/RealityWeaver.png</w:t>
-      </w:r>
-      <w:r>
-        <w:t xml:space="preserve"> (та же текстура у авийского столпа — после арта разведу)</w:t>
+        <w:t>Файл: Textures/Things/Building/Production/RealityWeaver.png (та же текстура у авийского столпа — после арта разведу)</w:t>
       </w:r>
     </w:p>
     <w:p>
@@ -189,7 +156,7 @@
     </w:p>
     <w:p>
       <w:pPr>
-        <w:pStyle w:val="Heading2"/>
+        <w:pStyle w:val="Heading3"/>
       </w:pPr>
       <w:r>
         <w:t>Пепельный страж (Cinderward, 3×3)</w:t>
@@ -197,13 +164,7 @@
     </w:p>
     <w:p>
       <w:r>
-        <w:t xml:space="preserve">Файл: </w:t>
-      </w:r>
-      <w:r>
-        <w:rPr>
-          <w:rFonts w:ascii="Consolas" w:hAnsi="Consolas"/>
-        </w:rPr>
-        <w:t>Textures/Things/Building/Production/GlobalFireExtinguisher.png</w:t>
+        <w:t>Файл: Textures/Things/Building/Production/GlobalFireExtinguisher.png</w:t>
       </w:r>
     </w:p>
     <w:p>
@@ -216,7 +177,7 @@
     </w:p>
     <w:p>
       <w:pPr>
-        <w:pStyle w:val="Heading2"/>
+        <w:pStyle w:val="Heading3"/>
       </w:pPr>
       <w:r>
         <w:t>Сосуд сути (Essence Reservoir, 3×3)</w:t>
@@ -224,13 +185,7 @@
     </w:p>
     <w:p>
       <w:r>
-        <w:t xml:space="preserve">Файл: </w:t>
-      </w:r>
-      <w:r>
-        <w:rPr>
-          <w:rFonts w:ascii="Consolas" w:hAnsi="Consolas"/>
-        </w:rPr>
-        <w:t>Textures/Things/Building/Production/OmniBattery.png</w:t>
+        <w:t>Файл: Textures/Things/Building/Production/OmniBattery.png</w:t>
       </w:r>
     </w:p>
     <w:p>
@@ -243,7 +198,7 @@
     </w:p>
     <w:p>
       <w:pPr>
-        <w:pStyle w:val="Heading2"/>
+        <w:pStyle w:val="Heading3"/>
       </w:pPr>
       <w:r>
         <w:t>Авийский столп света (Avir Pylon, 3×3)</w:t>
@@ -251,16 +206,7 @@
     </w:p>
     <w:p>
       <w:r>
-        <w:t xml:space="preserve">Файл: </w:t>
-      </w:r>
-      <w:r>
-        <w:rPr>
-          <w:rFonts w:ascii="Consolas" w:hAnsi="Consolas"/>
-        </w:rPr>
-        <w:t>Textures/Things/Building/Production/AvirPylon.png</w:t>
-      </w:r>
-      <w:r>
-        <w:t xml:space="preserve"> (новый файл)</w:t>
+        <w:t>Файл: Textures/Things/Building/Production/AvirPylon.png (новый файл)</w:t>
       </w:r>
     </w:p>
     <w:p>
@@ -273,7 +219,7 @@
     </w:p>
     <w:p>
       <w:pPr>
-        <w:pStyle w:val="Heading2"/>
+        <w:pStyle w:val="Heading3"/>
       </w:pPr>
       <w:r>
         <w:t>Ядро фейналлита (Feignallite Core, 3×3, вровень с полом)</w:t>
@@ -281,13 +227,7 @@
     </w:p>
     <w:p>
       <w:r>
-        <w:t xml:space="preserve">Файл: </w:t>
-      </w:r>
-      <w:r>
-        <w:rPr>
-          <w:rFonts w:ascii="Consolas" w:hAnsi="Consolas"/>
-        </w:rPr>
-        <w:t>Textures/Things/Building/Production/Avir_FeignalliteCore.png</w:t>
+        <w:t>Файл: Textures/Things/Building/Production/Avir_FeignalliteCore.png</w:t>
       </w:r>
     </w:p>
     <w:p>
@@ -300,7 +240,7 @@
     </w:p>
     <w:p>
       <w:pPr>
-        <w:pStyle w:val="Heading2"/>
+        <w:pStyle w:val="Heading3"/>
       </w:pPr>
       <w:r>
         <w:t>Бочка теней (Shadowsong Barrel, 1×1, поворачивается)</w:t>
@@ -308,31 +248,7 @@
     </w:p>
     <w:p>
       <w:r>
-        <w:t xml:space="preserve">Файлы: </w:t>
-      </w:r>
-      <w:r>
-        <w:rPr>
-          <w:rFonts w:ascii="Consolas" w:hAnsi="Consolas"/>
-        </w:rPr>
-        <w:t>Textures/Things/Building/AvirFermentingBarrel/Avir_FermentingBarrel_south.png</w:t>
-      </w:r>
-      <w:r>
-        <w:t xml:space="preserve">, </w:t>
-      </w:r>
-      <w:r>
-        <w:rPr>
-          <w:rFonts w:ascii="Consolas" w:hAnsi="Consolas"/>
-        </w:rPr>
-        <w:t>_east.png</w:t>
-      </w:r>
-      <w:r>
-        <w:t xml:space="preserve">, </w:t>
-      </w:r>
-      <w:r>
-        <w:rPr>
-          <w:rFonts w:ascii="Consolas" w:hAnsi="Consolas"/>
-        </w:rPr>
-        <w:t>_north.png</w:t>
+        <w:t>Файлы: Textures/Things/Building/AvirFermentingBarrel/Avir_FermentingBarrel_south.png, _east.png, _north.png</w:t>
       </w:r>
     </w:p>
     <w:p>
@@ -345,50 +261,23 @@
     </w:p>
     <w:p>
       <w:pPr>
-        <w:pStyle w:val="Heading1"/>
+        <w:pStyle w:val="Heading2"/>
       </w:pPr>
       <w:r>
-        <w:t>Лекарства</w:t>
+        <w:t>Еда</w:t>
       </w:r>
     </w:p>
     <w:p>
       <w:pPr>
-        <w:pStyle w:val="Heading2"/>
+        <w:pStyle w:val="Heading3"/>
       </w:pPr>
       <w:r>
-        <w:t>Сердцекрыл — склянки (белые), три варианта под стак</w:t>
+        <w:t>Птичье молоко — кувшин (только с RJW)</w:t>
       </w:r>
     </w:p>
     <w:p>
       <w:r>
-        <w:t xml:space="preserve">Файлы: </w:t>
-      </w:r>
-      <w:r>
-        <w:rPr>
-          <w:rFonts w:ascii="Consolas" w:hAnsi="Consolas"/>
-        </w:rPr>
-        <w:t>Textures/Things/Item/Drugs/Avir_HeartwingDraught/Avir_HeartwingDraught_a.png</w:t>
-      </w:r>
-      <w:r>
-        <w:t xml:space="preserve"> (одна склянка — в стопке до 5), </w:t>
-      </w:r>
-      <w:r>
-        <w:rPr>
-          <w:rFonts w:ascii="Consolas" w:hAnsi="Consolas"/>
-        </w:rPr>
-        <w:t>_b.png</w:t>
-      </w:r>
-      <w:r>
-        <w:t xml:space="preserve"> (три склянки — до 15), </w:t>
-      </w:r>
-      <w:r>
-        <w:rPr>
-          <w:rFonts w:ascii="Consolas" w:hAnsi="Consolas"/>
-        </w:rPr>
-        <w:t>_c.png</w:t>
-      </w:r>
-      <w:r>
-        <w:t xml:space="preserve"> (пять склянок — до 25). Игра сама меняет картинку по числу в стопке. Стиль как у уже нарисованных склянок мода: толстая тёмная обводка-«стикер», мягкий рисованный объём.</w:t>
+        <w:t>Файл: Things/Item/Resource/Avir_BirdMilk — три картинки под стак, как у ванильного молока: _a.png (один кувшин), _b.png (два-три), _c.png (полная стопка). Пока стоит ванильное молоко.</w:t>
       </w:r>
     </w:p>
     <w:p>
@@ -396,90 +285,12 @@
         <w:pStyle w:val="IntenseQuote"/>
       </w:pPr>
       <w:r>
-        <w:t>A sheet of three item icons side by side with space between them, transparent background, the same small potion vessel in each: a rounded vase with a short narrow neck and a smooth dark stopper, filled almost to the neck with thick milky-white viscous liquid with a soft pearly sheen, on its belly a raised silver emblem of a heart made of two folded bird wings. Icon one: a single vessel. Icon two: exactly three of them standing together, slightly overlapping. Icon three: exactly five of them in a small cluster. RimWorld drug item style like a painted sticker: soft painterly shading, a thick dark outline around each group. 1536×512.</w:t>
+        <w:t>A sheet of three item icons side by side with space between them, transparent background, the same small jug in each: a rounded jug of pale glazed clay with a long narrow neck and a small lip for pouring, a thin antique gold band around the neck, filled with thick, slightly golden creamy milk, a drop of it on the lip; on its belly a small pressed feather mark. Icon one: a single jug. Icon two: exactly three of them standing together, slightly overlapping. Icon three: exactly five of them in a small cluster. RimWorld item style like a painted sticker: soft painterly shading, a thick dark outline around each group. 1536×512.</w:t>
       </w:r>
     </w:p>
     <w:p>
       <w:pPr>
         <w:pStyle w:val="Heading2"/>
-      </w:pPr>
-      <w:r>
-        <w:t>Бледная тишь-трава — растение</w:t>
-      </w:r>
-    </w:p>
-    <w:p>
-      <w:r>
-        <w:t xml:space="preserve">Файлы: </w:t>
-      </w:r>
-      <w:r>
-        <w:rPr>
-          <w:rFonts w:ascii="Consolas" w:hAnsi="Consolas"/>
-        </w:rPr>
-        <w:t>Textures/Things/Plant/Avir_Hushleaf/Avir_Hushleaf_A.png</w:t>
-      </w:r>
-      <w:r>
-        <w:t xml:space="preserve">, </w:t>
-      </w:r>
-      <w:r>
-        <w:rPr>
-          <w:rFonts w:ascii="Consolas" w:hAnsi="Consolas"/>
-        </w:rPr>
-        <w:t>_B.png</w:t>
-      </w:r>
-      <w:r>
-        <w:t xml:space="preserve">, </w:t>
-      </w:r>
-      <w:r>
-        <w:rPr>
-          <w:rFonts w:ascii="Consolas" w:hAnsi="Consolas"/>
-        </w:rPr>
-        <w:t>_C.png</w:t>
-      </w:r>
-      <w:r>
-        <w:t xml:space="preserve"> (три варианта одного куста; пока стоит перекрашенный ванильный психоид)</w:t>
-      </w:r>
-    </w:p>
-    <w:p>
-      <w:pPr>
-        <w:pStyle w:val="IntenseQuote"/>
-      </w:pPr>
-      <w:r>
-        <w:t>Three variants of one low herb plant for RimWorld on one sheet, side by side with space between them, seen in the RimWorld top-down 3/4 view, transparent background: a small round tuft of soft pale leaves, almost white with a faint grey-green tint and silvery undersides, a few thin stems with tiny white buds; each variant slightly different in shape. Painterly RimWorld plant style, a thin dark outline. 1536×512.</w:t>
-      </w:r>
-    </w:p>
-    <w:p>
-      <w:pPr>
-        <w:pStyle w:val="Heading2"/>
-      </w:pPr>
-      <w:r>
-        <w:t>Листья тишь-травы — предмет</w:t>
-      </w:r>
-    </w:p>
-    <w:p>
-      <w:r>
-        <w:t xml:space="preserve">Файл: </w:t>
-      </w:r>
-      <w:r>
-        <w:rPr>
-          <w:rFonts w:ascii="Consolas" w:hAnsi="Consolas"/>
-        </w:rPr>
-        <w:t>Textures/Things/Item/Resource/Avir_Hushleaf.png</w:t>
-      </w:r>
-      <w:r>
-        <w:t xml:space="preserve"> (сейчас заглушка)</w:t>
-      </w:r>
-    </w:p>
-    <w:p>
-      <w:pPr>
-        <w:pStyle w:val="IntenseQuote"/>
-      </w:pPr>
-      <w:r>
-        <w:t>A small bundle of dried pale leaves, almost white with a faint grey-green tint, tied with a thin silver-grey thread, seen from slightly above, transparent background. RimWorld resource item style, soft painterly shading, a thin dark outline. 256×256.</w:t>
-      </w:r>
-    </w:p>
-    <w:p>
-      <w:pPr>
-        <w:pStyle w:val="Heading1"/>
       </w:pPr>
       <w:r>
         <w:t>Иконки кнопок</w:t>
@@ -488,36 +299,6 @@
     <w:p>
       <w:r>
         <w:t>Лист иконок нарисован и стоит в моде (тёмную кайму иконкам добавляет обработка). Иконка «опустить птенцов» не используется — на этой кнопке остаётся ванильная.</w:t>
-      </w:r>
-    </w:p>
-    <w:p>
-      <w:pPr>
-        <w:pStyle w:val="Heading1"/>
-      </w:pPr>
-      <w:r>
-        <w:t>Ритуальная книга: обёртка по краям панели</w:t>
-      </w:r>
-    </w:p>
-    <w:p>
-      <w:r>
-        <w:t xml:space="preserve">Файл: </w:t>
-      </w:r>
-      <w:r>
-        <w:rPr>
-          <w:rFonts w:ascii="Consolas" w:hAnsi="Consolas"/>
-        </w:rPr>
-        <w:t>Textures/UI/Ritualistics/Book/Frame.png</w:t>
-      </w:r>
-      <w:r>
-        <w:t>. Рисуется вокруг всех окон ритуалистики (книга, редактор): углы остаются как нарисованы, стороны растягиваются, середина — прозрачная (там пергамент). Поэтому полоса рамки занимает ровно 1/7 ширины картинки с каждой стороны, а середины сторон — ровные, без украшений, которые испортятся при растяжении.</w:t>
-      </w:r>
-    </w:p>
-    <w:p>
-      <w:pPr>
-        <w:pStyle w:val="IntenseQuote"/>
-      </w:pPr>
-      <w:r>
-        <w:t>A square ornamental frame for a game window, seen flat and straight on, the whole image is the frame: a band of dark tooled leather like the edge of an old book's binding runs along all four sides, exactly one seventh of the image wide; in each of the four corners a polished silver corner piece shaped like a folded wing tip with a small antique gold rivet; a fine gold line runs along the inner edge of the band; the leather along the sides is plain and even, with no ornaments in the middle of the sides, so it can be stretched; the whole middle of the image is completely empty and transparent. Avir style: a synthesis of dark worked stone and leather, polished silver and antique gold, pale violet essentium and bird-like motifs (feathers, talon and wing curves), with only light celestial accents - one or two small stars, a crescent or a single orbit line, never a star map. Painterly RimWorld UI style, crisp edges, no text. 1024×1024, transparent background.</w:t>
       </w:r>
     </w:p>
     <w:sectPr>
@@ -893,10 +674,6 @@
     <w:name w:val="Normal"/>
     <w:qFormat/>
     <w:rsid w:val="00FC693F"/>
-    <w:rPr>
-      <w:rFonts w:ascii="Calibri" w:hAnsi="Calibri"/>
-      <w:sz w:val="22"/>
-    </w:rPr>
   </w:style>
   <w:style w:type="paragraph" w:styleId="Header">
     <w:name w:val="header"/>

</xml_diff>

<commit_message>
Bird milk jug art; prompts updated
Co-Authored-By: Claude Opus 5.5 <noreply@anthropic.com>
Claude-Session: https://claude.ai/code/session_01YCWNLtj9zFsogxZeNiDKcG
</commit_message>
<xml_diff>
--- a/Промпты-арт.docx
+++ b/Промпты-арт.docx
@@ -54,7 +54,7 @@
     </w:p>
     <w:p>
       <w:r>
-        <w:t>Уже нарисовано и стоит в моде: ядро Шпиля, колыбель Шпиля, пилон Шпиля (консоль), голова и луч эссенциевой наводки, пилон верстака, вихрь, очаг ядер, хранитель энергии, иконка провода, линия секции круга, рамка и печать круга (обе версии), лист иконок кнопок, склянки «Сердцекрыла» (1/3/5), тишь-трава (растение и листья), рамка окон ритуалистики.</w:t>
+        <w:t>Уже нарисовано и стоит в моде: ядро Шпиля, колыбель Шпиля, пилон Шпиля (консоль), голова и луч эссенциевой наводки, пилон верстака, вихрь, очаг ядер, хранитель энергии, иконка провода, линия секции круга, рамка и печать круга (обе версии), лист иконок кнопок, склянки «Сердцекрыла» (1/3/5), тишь-трава (растение и листья), рамка окон ритуалистики, кувшины птичьего молока.</w:t>
       </w:r>
     </w:p>
     <w:p>
@@ -257,35 +257,6 @@
       </w:pPr>
       <w:r>
         <w:t>A small ornate fermenting cask seen in the RimWorld top-down 3/4 view, three views on one sheet - facing south, facing east, facing north - side by side with space between them, transparent background: dark wood staves bound with polished silver hoops, an antique gold spigot shaped like a bird's beak on the front (seen on the south view, in profile on the east view, absent on the north view), a faint violet sheen of wine at the seams, one small crescent stamped on the lid. Avir style: a synthesis of dark worked stone, polished silver and antique gold, pale violet essentium and bird-like motifs (feathers, talon and wing curves), with only light celestial accents - one or two small stars, a crescent or a single orbit line, never a star map. Painterly RimWorld style, a thin dark outline. 1536×512.</w:t>
-      </w:r>
-    </w:p>
-    <w:p>
-      <w:pPr>
-        <w:pStyle w:val="Heading2"/>
-      </w:pPr>
-      <w:r>
-        <w:t>Еда</w:t>
-      </w:r>
-    </w:p>
-    <w:p>
-      <w:pPr>
-        <w:pStyle w:val="Heading3"/>
-      </w:pPr>
-      <w:r>
-        <w:t>Птичье молоко — кувшин (только с RJW)</w:t>
-      </w:r>
-    </w:p>
-    <w:p>
-      <w:r>
-        <w:t>Файл: Things/Item/Resource/Avir_BirdMilk — три картинки под стак, как у ванильного молока: _a.png (один кувшин), _b.png (два-три), _c.png (полная стопка). Пока стоит ванильное молоко.</w:t>
-      </w:r>
-    </w:p>
-    <w:p>
-      <w:pPr>
-        <w:pStyle w:val="IntenseQuote"/>
-      </w:pPr>
-      <w:r>
-        <w:t>A sheet of three item icons side by side with space between them, transparent background, the same small jug in each: a rounded jug of pale glazed clay with a long narrow neck and a small lip for pouring, a thin antique gold band around the neck, filled with thick, slightly golden creamy milk, a drop of it on the lip; on its belly a small pressed feather mark. Icon one: a single jug. Icon two: exactly three of them standing together, slightly overlapping. Icon three: exactly five of them in a small cluster. RimWorld item style like a painted sticker: soft painterly shading, a thick dark outline around each group. 1536×512.</w:t>
       </w:r>
     </w:p>
     <w:p>

</xml_diff>

<commit_message>
Northern magic forest: frozen waste and frost oasis biomes, own climate, northern plants with tints, shelter trees with shade, howling blizzard
Co-Authored-By: Claude Opus 5.5 <noreply@anthropic.com>
Claude-Session: https://claude.ai/code/session_01YCWNLtj9zFsogxZeNiDKcG
</commit_message>
<xml_diff>
--- a/Промпты-арт.docx
+++ b/Промпты-арт.docx
@@ -257,6 +257,153 @@
       </w:pPr>
       <w:r>
         <w:t>A small ornate fermenting cask seen in the RimWorld top-down 3/4 view, three views on one sheet - facing south, facing east, facing north - side by side with space between them, transparent background: dark wood staves bound with polished silver hoops, an antique gold spigot shaped like a bird's beak on the front (seen on the south view, in profile on the east view, absent on the north view), a faint violet sheen of wine at the seams, one small crescent stamped on the lid. Avir style: a synthesis of dark worked stone, polished silver and antique gold, pale violet essentium and bird-like motifs (feathers, talon and wing curves), with only light celestial accents - one or two small stars, a crescent or a single orbit line, never a star map. Painterly RimWorld style, a thin dark outline. 1536×512.</w:t>
+      </w:r>
+    </w:p>
+    <w:p>
+      <w:pPr>
+        <w:pStyle w:val="Heading2"/>
+      </w:pPr>
+      <w:r>
+        <w:t>Северный лес (биомы «ледяная пустошь» и «ледяной оазис»)</w:t>
+      </w:r>
+    </w:p>
+    <w:p>
+      <w:r>
+        <w:t>Пока везде ванильные заглушки с подкраской. Растения в игре сами получают цветовые варианты (бледный, бледно-лиловый, серебристый, бледно-синий, бледно-изумрудный), поэтому рисовать их лучше в светлых, малонасыщенных тонах: игра умножает цвет картинки на оттенок. Серебряная трава, арктический психоид, арктическая черника и ели — твои ассеты, промпты для них не нужны.</w:t>
+      </w:r>
+    </w:p>
+    <w:p>
+      <w:pPr>
+        <w:pStyle w:val="Heading3"/>
+      </w:pPr>
+      <w:r>
+        <w:t>Дерево-укрыватель — раскрытое (день)</w:t>
+      </w:r>
+    </w:p>
+    <w:p>
+      <w:r>
+        <w:t>Файлы: Textures/Things/Plant/Avir_TreeShelterwing/Avir_TreeShelterwing_A.png, _B.png (два варианта)</w:t>
+      </w:r>
+    </w:p>
+    <w:p>
+      <w:pPr>
+        <w:pStyle w:val="IntenseQuote"/>
+      </w:pPr>
+      <w:r>
+        <w:t>Two variants of one northern tree for RimWorld on one sheet, side by side with space between them, seen in the RimWorld top-down 3/4 view, transparent background: a slender pale trunk with smooth silvery bark, its branches spread wide and flat like the opened wings of a great bird, long feather-shaped pale leaves with a faint lilac sheen forming a broad canopy that would cast a wide shade; light frost on the bark. Very light, desaturated colours. Painterly RimWorld plant style, a thin dark outline. 1536×1024.</w:t>
+      </w:r>
+    </w:p>
+    <w:p>
+      <w:pPr>
+        <w:pStyle w:val="Heading3"/>
+      </w:pPr>
+      <w:r>
+        <w:t>Дерево-укрыватель — сложенное (ночь)</w:t>
+      </w:r>
+    </w:p>
+    <w:p>
+      <w:r>
+        <w:t>Файлы: Textures/Things/Plant/Avir_TreeShelterwing_Closed/Avir_TreeShelterwing_Closed_A.png, _B.png — те же два дерева, тот же размер и положение ствола.</w:t>
+      </w:r>
+    </w:p>
+    <w:p>
+      <w:pPr>
+        <w:pStyle w:val="IntenseQuote"/>
+      </w:pPr>
+      <w:r>
+        <w:t>The same two northern trees as before, side by side, same size, same trunks and same position on the sheet, transparent background, but at night: the wing-like branches folded up and closed tight along the trunk like the wings of a sleeping bird, the feather-shaped pale leaves pressed together, leaving the tree narrow and tall; light frost on the bark. Very light, desaturated colours. Painterly RimWorld plant style, a thin dark outline. 1536×1024.</w:t>
+      </w:r>
+    </w:p>
+    <w:p>
+      <w:pPr>
+        <w:pStyle w:val="Heading3"/>
+      </w:pPr>
+      <w:r>
+        <w:t>Иноледное дерево (frostglass tree)</w:t>
+      </w:r>
+    </w:p>
+    <w:p>
+      <w:r>
+        <w:t>Файлы: Textures/Things/Plant/Avir_TreeFrostglass/Avir_TreeFrostglass_A.png, _B.png</w:t>
+      </w:r>
+    </w:p>
+    <w:p>
+      <w:pPr>
+        <w:pStyle w:val="IntenseQuote"/>
+      </w:pPr>
+      <w:r>
+        <w:t>Two variants of one crystal tree for RimWorld on one sheet, side by side with space between them, top-down 3/4 view, transparent background: a pale twisted trunk grown through with clear ice-like crystal, its leaves are thin translucent plates of crystal catching a faint pale glow at the edges, frost at the roots. Very light, cool, desaturated colours. Painterly RimWorld plant style, a thin dark outline. 1536×1024.</w:t>
+      </w:r>
+    </w:p>
+    <w:p>
+      <w:pPr>
+        <w:pStyle w:val="Heading3"/>
+      </w:pPr>
+      <w:r>
+        <w:t>Инеевенец (rimecrown tree)</w:t>
+      </w:r>
+    </w:p>
+    <w:p>
+      <w:r>
+        <w:t>Файлы: Textures/Things/Plant/Avir_TreeRimecrown/Avir_TreeRimecrown_A.png, _B.png</w:t>
+      </w:r>
+    </w:p>
+    <w:p>
+      <w:pPr>
+        <w:pStyle w:val="IntenseQuote"/>
+      </w:pPr>
+      <w:r>
+        <w:t>Two variants of one tall, narrow northern tree for RimWorld on one sheet, side by side with space between them, top-down 3/4 view, transparent background: a straight slim pale trunk, short upswept branches, the whole crown thick with crystal rime and small clusters of frost crystals that glow faintly. Very light, cool, desaturated colours. Painterly RimWorld plant style, a thin dark outline. 1536×1024.</w:t>
+      </w:r>
+    </w:p>
+    <w:p>
+      <w:pPr>
+        <w:pStyle w:val="Heading3"/>
+      </w:pPr>
+      <w:r>
+        <w:t>Инеецвет (rimebloom) — кристаллический кустик</w:t>
+      </w:r>
+    </w:p>
+    <w:p>
+      <w:r>
+        <w:t>Файлы: Textures/Things/Plant/Avir_PlantRimebloom/Avir_PlantRimebloom_A.png, _B.png, _C.png</w:t>
+      </w:r>
+    </w:p>
+    <w:p>
+      <w:pPr>
+        <w:pStyle w:val="IntenseQuote"/>
+      </w:pPr>
+      <w:r>
+        <w:t>Three variants of one small crystal shrub for RimWorld on one sheet, side by side with space between them, top-down 3/4 view, transparent background: a low cluster of clear crystal stems growing straight out of snow, tipped with small crystal blossoms that glow faintly, a little powdery snow at the base. Very light, cool, desaturated colours. Painterly RimWorld plant style, a thin dark outline. 1536×512.</w:t>
+      </w:r>
+    </w:p>
+    <w:p>
+      <w:pPr>
+        <w:pStyle w:val="Heading3"/>
+      </w:pPr>
+      <w:r>
+        <w:t>Почвы: рыхлый снег и холодная земля</w:t>
+      </w:r>
+    </w:p>
+    <w:p>
+      <w:r>
+        <w:t>Файлы: Textures/Terrain/Surfaces/Avir_LooseSnow.png, Textures/Terrain/Surfaces/Avir_ColdSoil.png (без каймы — это земля)</w:t>
+      </w:r>
+    </w:p>
+    <w:p>
+      <w:pPr>
+        <w:pStyle w:val="IntenseQuote"/>
+      </w:pPr>
+      <w:r>
+        <w:t>A seamless tileable ground texture for RimWorld seen from directly above: deep loose powdery snow, soft drifts and wind ripples, faint blue shadows in the hollows, no objects, no outline, even lighting. 1024×1024.</w:t>
+      </w:r>
+    </w:p>
+    <w:p>
+      <w:pPr>
+        <w:pStyle w:val="IntenseQuote"/>
+      </w:pPr>
+      <w:r>
+        <w:t>A seamless tileable ground texture for RimWorld seen from directly above: dark cold soil under a thin crust of frost, a few frozen pebbles and pale frost crystals, no objects, no outline, even lighting. 1024×1024.</w:t>
       </w:r>
     </w:p>
     <w:p>

</xml_diff>

<commit_message>
North: terrain and shelter tree art, great fir as northern spruce, huge trees with a stack of wood
Co-Authored-By: Claude Opus 5.5 <noreply@anthropic.com>
Claude-Session: https://claude.ai/code/session_01YCWNLtj9zFsogxZeNiDKcG
</commit_message>
<xml_diff>
--- a/Промпты-арт.docx
+++ b/Промпты-арт.docx
@@ -269,49 +269,7 @@
     </w:p>
     <w:p>
       <w:r>
-        <w:t>Пока везде ванильные заглушки с подкраской. Растения в игре сами получают цветовые варианты (бледный, бледно-лиловый, серебристый, бледно-синий, бледно-изумрудный), поэтому рисовать их лучше в светлых, малонасыщенных тонах: игра умножает цвет картинки на оттенок. Серебряная трава, арктический психоид, арктическая черника и ели — твои ассеты, промпты для них не нужны.</w:t>
-      </w:r>
-    </w:p>
-    <w:p>
-      <w:pPr>
-        <w:pStyle w:val="Heading3"/>
-      </w:pPr>
-      <w:r>
-        <w:t>Дерево-укрыватель — раскрытое (день)</w:t>
-      </w:r>
-    </w:p>
-    <w:p>
-      <w:r>
-        <w:t>Файлы: Textures/Things/Plant/Avir_TreeShelterwing/Avir_TreeShelterwing_A.png, _B.png (два варианта)</w:t>
-      </w:r>
-    </w:p>
-    <w:p>
-      <w:pPr>
-        <w:pStyle w:val="IntenseQuote"/>
-      </w:pPr>
-      <w:r>
-        <w:t>Two variants of one northern tree for RimWorld on one sheet, side by side with space between them, seen in the RimWorld top-down 3/4 view, transparent background: a slender pale trunk with smooth silvery bark, its branches spread wide and flat like the opened wings of a great bird, long feather-shaped pale leaves with a faint lilac sheen forming a broad canopy that would cast a wide shade; light frost on the bark. Very light, desaturated colours. Painterly RimWorld plant style, a thin dark outline. 1536×1024.</w:t>
-      </w:r>
-    </w:p>
-    <w:p>
-      <w:pPr>
-        <w:pStyle w:val="Heading3"/>
-      </w:pPr>
-      <w:r>
-        <w:t>Дерево-укрыватель — сложенное (ночь)</w:t>
-      </w:r>
-    </w:p>
-    <w:p>
-      <w:r>
-        <w:t>Файлы: Textures/Things/Plant/Avir_TreeShelterwing_Closed/Avir_TreeShelterwing_Closed_A.png, _B.png — те же два дерева, тот же размер и положение ствола.</w:t>
-      </w:r>
-    </w:p>
-    <w:p>
-      <w:pPr>
-        <w:pStyle w:val="IntenseQuote"/>
-      </w:pPr>
-      <w:r>
-        <w:t>The same two northern trees as before, side by side, same size, same trunks and same position on the sheet, transparent background, but at night: the wing-like branches folded up and closed tight along the trunk like the wings of a sleeping bird, the feather-shaped pale leaves pressed together, leaving the tree narrow and tall; light frost on the bark. Very light, desaturated colours. Painterly RimWorld plant style, a thin dark outline. 1536×1024.</w:t>
+        <w:t>Пока везде ванильные заглушки с подкраской. Растения в игре сами получают цветовые варианты (бледный, бледно-лиловый, серебристый, бледно-синий, бледно-изумрудный), поэтому рисовать их лучше в светлых, малонасыщенных тонах: игра умножает цвет картинки на оттенок. Серебряная трава, арктический психоид, арктическая черника и ели — твои ассеты, промпты для них не нужны. Дерево-укрыватель, ель и обе почвы уже стоят.</w:t>
       </w:r>
     </w:p>
     <w:p>
@@ -375,35 +333,6 @@
       </w:pPr>
       <w:r>
         <w:t>Three variants of one small crystal shrub for RimWorld on one sheet, side by side with space between them, top-down 3/4 view, transparent background: a low cluster of clear crystal stems growing straight out of snow, tipped with small crystal blossoms that glow faintly, a little powdery snow at the base. Very light, cool, desaturated colours. Painterly RimWorld plant style, a thin dark outline. 1536×512.</w:t>
-      </w:r>
-    </w:p>
-    <w:p>
-      <w:pPr>
-        <w:pStyle w:val="Heading3"/>
-      </w:pPr>
-      <w:r>
-        <w:t>Почвы: рыхлый снег и холодная земля</w:t>
-      </w:r>
-    </w:p>
-    <w:p>
-      <w:r>
-        <w:t>Файлы: Textures/Terrain/Surfaces/Avir_LooseSnow.png, Textures/Terrain/Surfaces/Avir_ColdSoil.png (без каймы — это земля)</w:t>
-      </w:r>
-    </w:p>
-    <w:p>
-      <w:pPr>
-        <w:pStyle w:val="IntenseQuote"/>
-      </w:pPr>
-      <w:r>
-        <w:t>A seamless tileable ground texture for RimWorld seen from directly above: deep loose powdery snow, soft drifts and wind ripples, faint blue shadows in the hollows, no objects, no outline, even lighting. 1024×1024.</w:t>
-      </w:r>
-    </w:p>
-    <w:p>
-      <w:pPr>
-        <w:pStyle w:val="IntenseQuote"/>
-      </w:pPr>
-      <w:r>
-        <w:t>A seamless tileable ground texture for RimWorld seen from directly above: dark cold soil under a thin crust of frost, a few frozen pebbles and pale frost crystals, no objects, no outline, even lighting. 1024×1024.</w:t>
       </w:r>
     </w:p>
     <w:p>

</xml_diff>

<commit_message>
North: seamless ground, stream-soaked frost soil, visible shelter shade and spacing, ordinary-sized crystal trees, stronger tints, cold grass and snowbalm, rebalanced flora, nicer world map texture
Co-Authored-By: Claude Opus 5.5 <noreply@anthropic.com>
Claude-Session: https://claude.ai/code/session_01YCWNLtj9zFsogxZeNiDKcG
</commit_message>
<xml_diff>
--- a/Промпты-арт.docx
+++ b/Промпты-арт.docx
@@ -269,7 +269,112 @@
     </w:p>
     <w:p>
       <w:r>
-        <w:t>Пока везде ванильные заглушки с подкраской. Растения в игре сами получают цветовые варианты (бледный, бледно-лиловый, серебристый, бледно-синий, бледно-изумрудный), поэтому рисовать их лучше в светлых, малонасыщенных тонах: игра умножает цвет картинки на оттенок. Серебряная трава, арктический психоид, арктическая черника и ели — твои ассеты, промпты для них не нужны. Дерево-укрыватель, ель и обе почвы уже стоят.</w:t>
+        <w:t>Пока везде ванильные заглушки с подкраской. Растения в игре сами получают цветовые варианты (бледный, бледно-лиловый, серебристый, бледно-синий, бледно-изумрудный), поэтому рисовать их лучше в светлых, малонасыщенных тонах: игра умножает цвет картинки на оттенок. Серебряная трава — твой ассет. Уже стоят: дерево-укрыватель, ель (GreatFir), арктический психоид (из Better Looking Plants), обе почвы и насыщенная потоком земля (сделана из холодной земли).</w:t>
+      </w:r>
+    </w:p>
+    <w:p>
+      <w:pPr>
+        <w:pStyle w:val="Heading3"/>
+      </w:pPr>
+      <w:r>
+        <w:t>Дерево-укрыватель — раскрытое, гуще (замена нынешнему)</w:t>
+      </w:r>
+    </w:p>
+    <w:p>
+      <w:r>
+        <w:t>Файлы: Textures/Things/Plant/Avir_TreeShelterwing/Avir_TreeShelterwing_A.png, _B.png. Нынешние кажутся редкими: ветвей мало, тени «нет». Закрытые варианты остаются те же — ствол и корни держать такими же.</w:t>
+      </w:r>
+    </w:p>
+    <w:p>
+      <w:pPr>
+        <w:pStyle w:val="IntenseQuote"/>
+      </w:pPr>
+      <w:r>
+        <w:t>Two variants of one giant northern tree for RimWorld on one sheet, side by side with space between them, seen in the RimWorld top-down 3/4 view, transparent background: a thick pale trunk with smooth silvery bark and splayed root-claws at the base; many layered branches spread wide and flat like the opened wings of a great bird, tier above tier, their long feather-shaped pale leaves overlapping into one broad, dense, umbrella-like canopy much wider than the tree is tall, with no gaps to the sky; light frost on the bark. Very light, desaturated colours, no glow, no haze around the tree. Painterly RimWorld plant style, a thin dark outline. 1536×1024.</w:t>
+      </w:r>
+    </w:p>
+    <w:p>
+      <w:pPr>
+        <w:pStyle w:val="Heading3"/>
+      </w:pPr>
+      <w:r>
+        <w:t>Снежный бальзам (snowbalm) — северная лечебная трава</w:t>
+      </w:r>
+    </w:p>
+    <w:p>
+      <w:r>
+        <w:t>Файлы: Textures/Things/Plant/Avir_PlantSnowbalm/Avir_PlantSnowbalm_A.png, _B.png, _C.png (сейчас стоит ванильный хилрут). Даёт обычную травяную медицину.</w:t>
+      </w:r>
+    </w:p>
+    <w:p>
+      <w:pPr>
+        <w:pStyle w:val="IntenseQuote"/>
+      </w:pPr>
+      <w:r>
+        <w:t>Three variants of one low healing herb for RimWorld on one sheet, side by side with space between them, seen in the RimWorld top-down 3/4 view, transparent background: a compact rosette of thick, waxy, rounded leaves, pale green with silvery frost on the edges, a few short stems with small white bell-like flowers, a little powdery snow at the base; each variant slightly different. Very light, desaturated colours, no glow. Painterly RimWorld plant style, a thin dark outline. 1536×512.</w:t>
+      </w:r>
+    </w:p>
+    <w:p>
+      <w:pPr>
+        <w:pStyle w:val="Heading3"/>
+      </w:pPr>
+      <w:r>
+        <w:t>Арктическая черника — куст</w:t>
+      </w:r>
+    </w:p>
+    <w:p>
+      <w:r>
+        <w:t>Файлы: Textures/Things/Plant/Avir_PlantArcticBerry/Avir_PlantArcticBerry_A.png, _B.png (сейчас ванильный ягодный куст, подкрашенный)</w:t>
+      </w:r>
+    </w:p>
+    <w:p>
+      <w:pPr>
+        <w:pStyle w:val="IntenseQuote"/>
+      </w:pPr>
+      <w:r>
+        <w:t>Two variants of one low northern berry bush for RimWorld on one sheet, side by side with space between them, seen in the RimWorld top-down 3/4 view, transparent background: a dense, rounded bush of small tough oval leaves, pale grey-green with frost on the tips, hung with clusters of round dusky-blue berries with a pale bloom on them, a little snow caught in the branches. Very light, desaturated leaves, the berries the only deeper colour, no glow. Painterly RimWorld plant style, a thin dark outline. 1536×768.</w:t>
+      </w:r>
+    </w:p>
+    <w:p>
+      <w:pPr>
+        <w:pStyle w:val="Heading3"/>
+      </w:pPr>
+      <w:r>
+        <w:t>Холодная трава (cold grass) — растёт прямо из снега</w:t>
+      </w:r>
+    </w:p>
+    <w:p>
+      <w:r>
+        <w:t>Файлы: Textures/Things/Plant/Avir_PlantFrostgrass/Avir_PlantFrostgrass_A.png, _B.png, _C.png (сейчас ванильная трава, подкрашенная). Это мелкая трава, которую игра рисует много раз на клетке, поэтому каждый вариант — один маленький пучок.</w:t>
+      </w:r>
+    </w:p>
+    <w:p>
+      <w:pPr>
+        <w:pStyle w:val="IntenseQuote"/>
+      </w:pPr>
+      <w:r>
+        <w:t>Three variants of one small tuft of northern grass for RimWorld on one sheet, side by side with space between them, seen in the RimWorld top-down 3/4 view, transparent background: a small clump of short, stiff, thin blades rising out of a little mound of powdery snow, the blades pale grey-blue and coated in white rime, a few bent by the wind; each variant slightly different. Very light, desaturated colours, no glow. Painterly RimWorld plant style, a thin dark outline. 1536×512.</w:t>
+      </w:r>
+    </w:p>
+    <w:p>
+      <w:pPr>
+        <w:pStyle w:val="Heading3"/>
+      </w:pPr>
+      <w:r>
+        <w:t>Насыщенная потоком ледяная земля (по желанию — сейчас сделана из холодной)</w:t>
+      </w:r>
+    </w:p>
+    <w:p>
+      <w:r>
+        <w:t>Файл: Textures/Terrain/Surfaces/Avir_ImbuedFrostSoil.png (без каймы)</w:t>
+      </w:r>
+    </w:p>
+    <w:p>
+      <w:pPr>
+        <w:pStyle w:val="IntenseQuote"/>
+      </w:pPr>
+      <w:r>
+        <w:t>A seamless tileable ground texture for RimWorld seen from directly above: dark cold soil under a crust of frost, the frost crystals faintly glowing pale lilac as if soaked with gentle magic, a few frozen pebbles, no objects, no outline, even lighting. 1024×1024.</w:t>
       </w:r>
     </w:p>
     <w:p>

</xml_diff>

<commit_message>
North: real recoloured variants (pale, lilac, silver, blue, emerald) for shelter tree, spruce, arctic psychoid, snowbalm, arctic blueberry, cold grass; new art
Co-Authored-By: Claude Opus 5.5 <noreply@anthropic.com>
Claude-Session: https://claude.ai/code/session_01YCWNLtj9zFsogxZeNiDKcG
</commit_message>
<xml_diff>
--- a/Промпты-арт.docx
+++ b/Промпты-арт.docx
@@ -269,91 +269,7 @@
     </w:p>
     <w:p>
       <w:r>
-        <w:t>Пока везде ванильные заглушки с подкраской. Растения в игре сами получают цветовые варианты (бледный, бледно-лиловый, серебристый, бледно-синий, бледно-изумрудный), поэтому рисовать их лучше в светлых, малонасыщенных тонах: игра умножает цвет картинки на оттенок. Серебряная трава — твой ассет. Уже стоят: дерево-укрыватель, ель (GreatFir), арктический психоид (из Better Looking Plants), обе почвы и насыщенная потоком земля (сделана из холодной земли).</w:t>
-      </w:r>
-    </w:p>
-    <w:p>
-      <w:pPr>
-        <w:pStyle w:val="Heading3"/>
-      </w:pPr>
-      <w:r>
-        <w:t>Дерево-укрыватель — раскрытое, гуще (замена нынешнему)</w:t>
-      </w:r>
-    </w:p>
-    <w:p>
-      <w:r>
-        <w:t>Файлы: Textures/Things/Plant/Avir_TreeShelterwing/Avir_TreeShelterwing_A.png, _B.png. Нынешние кажутся редкими: ветвей мало, тени «нет». Закрытые варианты остаются те же — ствол и корни держать такими же.</w:t>
-      </w:r>
-    </w:p>
-    <w:p>
-      <w:pPr>
-        <w:pStyle w:val="IntenseQuote"/>
-      </w:pPr>
-      <w:r>
-        <w:t>Two variants of one giant northern tree for RimWorld on one sheet, side by side with space between them, seen in the RimWorld top-down 3/4 view, transparent background: a thick pale trunk with smooth silvery bark and splayed root-claws at the base; many layered branches spread wide and flat like the opened wings of a great bird, tier above tier, their long feather-shaped pale leaves overlapping into one broad, dense, umbrella-like canopy much wider than the tree is tall, with no gaps to the sky; light frost on the bark. Very light, desaturated colours, no glow, no haze around the tree. Painterly RimWorld plant style, a thin dark outline. 1536×1024.</w:t>
-      </w:r>
-    </w:p>
-    <w:p>
-      <w:pPr>
-        <w:pStyle w:val="Heading3"/>
-      </w:pPr>
-      <w:r>
-        <w:t>Снежный бальзам (snowbalm) — северная лечебная трава</w:t>
-      </w:r>
-    </w:p>
-    <w:p>
-      <w:r>
-        <w:t>Файлы: Textures/Things/Plant/Avir_PlantSnowbalm/Avir_PlantSnowbalm_A.png, _B.png, _C.png (сейчас стоит ванильный хилрут). Даёт обычную травяную медицину.</w:t>
-      </w:r>
-    </w:p>
-    <w:p>
-      <w:pPr>
-        <w:pStyle w:val="IntenseQuote"/>
-      </w:pPr>
-      <w:r>
-        <w:t>Three variants of one low healing herb for RimWorld on one sheet, side by side with space between them, seen in the RimWorld top-down 3/4 view, transparent background: a compact rosette of thick, waxy, rounded leaves, pale green with silvery frost on the edges, a few short stems with small white bell-like flowers, a little powdery snow at the base; each variant slightly different. Very light, desaturated colours, no glow. Painterly RimWorld plant style, a thin dark outline. 1536×512.</w:t>
-      </w:r>
-    </w:p>
-    <w:p>
-      <w:pPr>
-        <w:pStyle w:val="Heading3"/>
-      </w:pPr>
-      <w:r>
-        <w:t>Арктическая черника — куст</w:t>
-      </w:r>
-    </w:p>
-    <w:p>
-      <w:r>
-        <w:t>Файлы: Textures/Things/Plant/Avir_PlantArcticBerry/Avir_PlantArcticBerry_A.png, _B.png (сейчас ванильный ягодный куст, подкрашенный)</w:t>
-      </w:r>
-    </w:p>
-    <w:p>
-      <w:pPr>
-        <w:pStyle w:val="IntenseQuote"/>
-      </w:pPr>
-      <w:r>
-        <w:t>Two variants of one low northern berry bush for RimWorld on one sheet, side by side with space between them, seen in the RimWorld top-down 3/4 view, transparent background: a dense, rounded bush of small tough oval leaves, pale grey-green with frost on the tips, hung with clusters of round dusky-blue berries with a pale bloom on them, a little snow caught in the branches. Very light, desaturated leaves, the berries the only deeper colour, no glow. Painterly RimWorld plant style, a thin dark outline. 1536×768.</w:t>
-      </w:r>
-    </w:p>
-    <w:p>
-      <w:pPr>
-        <w:pStyle w:val="Heading3"/>
-      </w:pPr>
-      <w:r>
-        <w:t>Холодная трава (cold grass) — растёт прямо из снега</w:t>
-      </w:r>
-    </w:p>
-    <w:p>
-      <w:r>
-        <w:t>Файлы: Textures/Things/Plant/Avir_PlantFrostgrass/Avir_PlantFrostgrass_A.png, _B.png, _C.png (сейчас ванильная трава, подкрашенная). Это мелкая трава, которую игра рисует много раз на клетке, поэтому каждый вариант — один маленький пучок.</w:t>
-      </w:r>
-    </w:p>
-    <w:p>
-      <w:pPr>
-        <w:pStyle w:val="IntenseQuote"/>
-      </w:pPr>
-      <w:r>
-        <w:t>Three variants of one small tuft of northern grass for RimWorld on one sheet, side by side with space between them, seen in the RimWorld top-down 3/4 view, transparent background: a small clump of short, stiff, thin blades rising out of a little mound of powdery snow, the blades pale grey-blue and coated in white rime, a few bent by the wind; each variant slightly different. Very light, desaturated colours, no glow. Painterly RimWorld plant style, a thin dark outline. 1536×512.</w:t>
+        <w:t>Пока везде ванильные заглушки с подкраской. Растения в игре сами получают цветовые варианты (бледный, бледно-лиловый, серебристый, бледно-синий, бледно-изумрудный), поэтому рисовать их лучше в светлых, малонасыщенных тонах: игра умножает цвет картинки на оттенок. Серебряная трава — твой ассет. Уже стоят (с настоящими цветовыми вариантами, как у кхарассийских растений): дерево-укрыватель, ель (GreatFir), арктический психоид (из Better Looking Plants), снежный бальзам, арктическая черника, холодная трава; обе почвы и насыщенная потоком земля.</w:t>
       </w:r>
     </w:p>
     <w:p>

</xml_diff>

<commit_message>
North: leaf-only pale recolour variants, crystal trees and rimebloom art, Odyssey and Medieval Overhaul animals in the northern biomes
Co-Authored-By: Claude Opus 5.5 <noreply@anthropic.com>
Claude-Session: https://claude.ai/code/session_01YCWNLtj9zFsogxZeNiDKcG
</commit_message>
<xml_diff>
--- a/Промпты-арт.docx
+++ b/Промпты-арт.docx
@@ -269,7 +269,7 @@
     </w:p>
     <w:p>
       <w:r>
-        <w:t>Пока везде ванильные заглушки с подкраской. Растения в игре сами получают цветовые варианты (бледный, бледно-лиловый, серебристый, бледно-синий, бледно-изумрудный), поэтому рисовать их лучше в светлых, малонасыщенных тонах: игра умножает цвет картинки на оттенок. Серебряная трава — твой ассет. Уже стоят (с настоящими цветовыми вариантами, как у кхарассийских растений): дерево-укрыватель, ель (GreatFir), арктический психоид (из Better Looking Plants), снежный бальзам, арктическая черника, холодная трава; обе почвы и насыщенная потоком земля.</w:t>
+        <w:t>Пока везде ванильные заглушки с подкраской. Растения в игре сами получают цветовые варианты (бледный, бледно-лиловый, серебристый, бледно-синий, бледно-изумрудный), поэтому рисовать их лучше в светлых, малонасыщенных тонах: игра умножает цвет картинки на оттенок. Серебряная трава — твой ассет (пока подкрашенная ванильная). Всё остальное стоит, с настоящими цветовыми вариантами (перекрашена только листва): дерево-укрыватель, ель (GreatFir), иноледное дерево, инеевенец, инеецвет, арктический психоид (из Better Looking Plants), снежный бальзам, арктическая черника, холодная трава; обе почвы и насыщенная потоком земля.</w:t>
       </w:r>
     </w:p>
     <w:p>
@@ -291,69 +291,6 @@
       </w:pPr>
       <w:r>
         <w:t>A seamless tileable ground texture for RimWorld seen from directly above: dark cold soil under a crust of frost, the frost crystals faintly glowing pale lilac as if soaked with gentle magic, a few frozen pebbles, no objects, no outline, even lighting. 1024×1024.</w:t>
-      </w:r>
-    </w:p>
-    <w:p>
-      <w:pPr>
-        <w:pStyle w:val="Heading3"/>
-      </w:pPr>
-      <w:r>
-        <w:t>Иноледное дерево (frostglass tree)</w:t>
-      </w:r>
-    </w:p>
-    <w:p>
-      <w:r>
-        <w:t>Файлы: Textures/Things/Plant/Avir_TreeFrostglass/Avir_TreeFrostglass_A.png, _B.png</w:t>
-      </w:r>
-    </w:p>
-    <w:p>
-      <w:pPr>
-        <w:pStyle w:val="IntenseQuote"/>
-      </w:pPr>
-      <w:r>
-        <w:t>Two variants of one crystal tree for RimWorld on one sheet, side by side with space between them, top-down 3/4 view, transparent background: a pale twisted trunk grown through with clear ice-like crystal, its leaves are thin translucent plates of crystal catching a faint pale glow at the edges, frost at the roots. Very light, cool, desaturated colours. Painterly RimWorld plant style, a thin dark outline. 1536×1024.</w:t>
-      </w:r>
-    </w:p>
-    <w:p>
-      <w:pPr>
-        <w:pStyle w:val="Heading3"/>
-      </w:pPr>
-      <w:r>
-        <w:t>Инеевенец (rimecrown tree)</w:t>
-      </w:r>
-    </w:p>
-    <w:p>
-      <w:r>
-        <w:t>Файлы: Textures/Things/Plant/Avir_TreeRimecrown/Avir_TreeRimecrown_A.png, _B.png</w:t>
-      </w:r>
-    </w:p>
-    <w:p>
-      <w:pPr>
-        <w:pStyle w:val="IntenseQuote"/>
-      </w:pPr>
-      <w:r>
-        <w:t>Two variants of one tall, narrow northern tree for RimWorld on one sheet, side by side with space between them, top-down 3/4 view, transparent background: a straight slim pale trunk, short upswept branches, the whole crown thick with crystal rime and small clusters of frost crystals that glow faintly. Very light, cool, desaturated colours. Painterly RimWorld plant style, a thin dark outline. 1536×1024.</w:t>
-      </w:r>
-    </w:p>
-    <w:p>
-      <w:pPr>
-        <w:pStyle w:val="Heading3"/>
-      </w:pPr>
-      <w:r>
-        <w:t>Инеецвет (rimebloom) — кристаллический кустик</w:t>
-      </w:r>
-    </w:p>
-    <w:p>
-      <w:r>
-        <w:t>Файлы: Textures/Things/Plant/Avir_PlantRimebloom/Avir_PlantRimebloom_A.png, _B.png, _C.png</w:t>
-      </w:r>
-    </w:p>
-    <w:p>
-      <w:pPr>
-        <w:pStyle w:val="IntenseQuote"/>
-      </w:pPr>
-      <w:r>
-        <w:t>Three variants of one small crystal shrub for RimWorld on one sheet, side by side with space between them, top-down 3/4 view, transparent background: a low cluster of clear crystal stems growing straight out of snow, tipped with small crystal blossoms that glow faintly, a little powdery snow at the base. Very light, cool, desaturated colours. Painterly RimWorld plant style, a thin dark outline. 1536×512.</w:t>
       </w:r>
     </w:p>
     <w:p>

</xml_diff>

<commit_message>
North: night glow for herbs and crystal plants, night-waking moonshard and starbell, young blueberry bushes without berries, cleaner snow and soil, Alpha Animals in the north
Co-Authored-By: Claude Opus 5.5 <noreply@anthropic.com>
Claude-Session: https://claude.ai/code/session_01YCWNLtj9zFsogxZeNiDKcG
</commit_message>
<xml_diff>
--- a/Промпты-арт.docx
+++ b/Промпты-арт.docx
@@ -291,6 +291,48 @@
       </w:pPr>
       <w:r>
         <w:t>A seamless tileable ground texture for RimWorld seen from directly above: dark cold soil under a crust of frost, the frost crystals faintly glowing pale lilac as if soaked with gentle magic, a few frozen pebbles, no objects, no outline, even lighting. 1024×1024.</w:t>
+      </w:r>
+    </w:p>
+    <w:p>
+      <w:pPr>
+        <w:pStyle w:val="Heading3"/>
+      </w:pPr>
+      <w:r>
+        <w:t>Лунный осколок (moonshard) — декоративное, днём спит, ночью светится</w:t>
+      </w:r>
+    </w:p>
+    <w:p>
+      <w:r>
+        <w:t>Файлы: Textures/Things/Plant/Avir_PlantMoonshard/…_A.png, _B.png, _C.png (день) и Textures/Things/Plant/Avir_PlantMoonshard_Night/…_A.png, _B.png, _C.png (ночь). Сейчас — заглушки из инеецвета. Цветовые варианты сделаю сам.</w:t>
+      </w:r>
+    </w:p>
+    <w:p>
+      <w:pPr>
+        <w:pStyle w:val="IntenseQuote"/>
+      </w:pPr>
+      <w:r>
+        <w:t>Three variants of one small crystal plant for RimWorld, two rows on one sheet, transparent background, top-down 3/4 view, space between all of them. Top row, by day, asleep: a low cluster of closed crystal shards folded together like buds, dull grey-white and frosted, on a little mound of snow. Bottom row, the same three plants at night, awake: the same shards opened outward like petals, clear and shining from within with a soft pale lilac light. Same shapes and positions in both rows. Very light, cool, desaturated colours. Painterly RimWorld plant style, a thin dark outline. 1536×1024.</w:t>
+      </w:r>
+    </w:p>
+    <w:p>
+      <w:pPr>
+        <w:pStyle w:val="Heading3"/>
+      </w:pPr>
+      <w:r>
+        <w:t>Звёздный колокольчик (starbell) — декоративное, днём спит, ночью светится</w:t>
+      </w:r>
+    </w:p>
+    <w:p>
+      <w:r>
+        <w:t>Файлы: Textures/Things/Plant/Avir_PlantStarbell/…_A.png, _B.png, _C.png (день) и Textures/Things/Plant/Avir_PlantStarbell_Night/…_A.png, _B.png, _C.png (ночь). Сейчас — заглушки из снежного бальзама.</w:t>
+      </w:r>
+    </w:p>
+    <w:p>
+      <w:pPr>
+        <w:pStyle w:val="IntenseQuote"/>
+      </w:pPr>
+      <w:r>
+        <w:t>Three variants of one low northern flower for RimWorld, two rows on one sheet, transparent background, top-down 3/4 view, space between all of them. Top row, by day, asleep: a small rosette of narrow pale leaves with several thin stems, each ending in a closed bell-shaped bud hanging down, dull and grey-white. Bottom row, the same three plants at night, awake: the bells opened and turned upward, each glowing a cold blue-white like a small star, a faint glow on the leaves around them. Same shapes and positions in both rows. Very light, cool, desaturated colours. Painterly RimWorld plant style, a thin dark outline. 1536×1024.</w:t>
       </w:r>
     </w:p>
     <w:p>

</xml_diff>

<commit_message>
North: starbell and moonshard art (day and night, with colour variants); cumulative archive of the northern forest
Co-Authored-By: Claude Opus 5.5 <noreply@anthropic.com>
Claude-Session: https://claude.ai/code/session_01YCWNLtj9zFsogxZeNiDKcG
</commit_message>
<xml_diff>
--- a/Промпты-арт.docx
+++ b/Промпты-арт.docx
@@ -269,7 +269,7 @@
     </w:p>
     <w:p>
       <w:r>
-        <w:t>Пока везде ванильные заглушки с подкраской. Растения в игре сами получают цветовые варианты (бледный, бледно-лиловый, серебристый, бледно-синий, бледно-изумрудный), поэтому рисовать их лучше в светлых, малонасыщенных тонах: игра умножает цвет картинки на оттенок. Серебряная трава — твой ассет (пока подкрашенная ванильная). Всё остальное стоит, с настоящими цветовыми вариантами (перекрашена только листва): дерево-укрыватель, ель (GreatFir), иноледное дерево, инеевенец, инеецвет, арктический психоид (из Better Looking Plants), снежный бальзам, арктическая черника, холодная трава; обе почвы и насыщенная потоком земля.</w:t>
+        <w:t>Пока везде ванильные заглушки с подкраской. Растения в игре сами получают цветовые варианты (бледный, бледно-лиловый, серебристый, бледно-синий, бледно-изумрудный), поэтому рисовать их лучше в светлых, малонасыщенных тонах: игра умножает цвет картинки на оттенок. Серебряная трава — твой ассет (пока подкрашенная ванильная). Всё остальное стоит, с настоящими цветовыми вариантами (перекрашена только листва), включая лунный осколок и звёздный колокольчик (день и ночь): дерево-укрыватель, ель (GreatFir), иноледное дерево, инеевенец, инеецвет, арктический психоид (из Better Looking Plants), снежный бальзам, арктическая черника, холодная трава; обе почвы и насыщенная потоком земля.</w:t>
       </w:r>
     </w:p>
     <w:p>
@@ -291,48 +291,6 @@
       </w:pPr>
       <w:r>
         <w:t>A seamless tileable ground texture for RimWorld seen from directly above: dark cold soil under a crust of frost, the frost crystals faintly glowing pale lilac as if soaked with gentle magic, a few frozen pebbles, no objects, no outline, even lighting. 1024×1024.</w:t>
-      </w:r>
-    </w:p>
-    <w:p>
-      <w:pPr>
-        <w:pStyle w:val="Heading3"/>
-      </w:pPr>
-      <w:r>
-        <w:t>Лунный осколок (moonshard) — декоративное, днём спит, ночью светится</w:t>
-      </w:r>
-    </w:p>
-    <w:p>
-      <w:r>
-        <w:t>Файлы: Textures/Things/Plant/Avir_PlantMoonshard/…_A.png, _B.png, _C.png (день) и Textures/Things/Plant/Avir_PlantMoonshard_Night/…_A.png, _B.png, _C.png (ночь). Сейчас — заглушки из инеецвета. Цветовые варианты сделаю сам.</w:t>
-      </w:r>
-    </w:p>
-    <w:p>
-      <w:pPr>
-        <w:pStyle w:val="IntenseQuote"/>
-      </w:pPr>
-      <w:r>
-        <w:t>Three variants of one small crystal plant for RimWorld, two rows on one sheet, transparent background, top-down 3/4 view, space between all of them. Top row, by day, asleep: a low cluster of closed crystal shards folded together like buds, dull grey-white and frosted, on a little mound of snow. Bottom row, the same three plants at night, awake: the same shards opened outward like petals, clear and shining from within with a soft pale lilac light. Same shapes and positions in both rows. Very light, cool, desaturated colours. Painterly RimWorld plant style, a thin dark outline. 1536×1024.</w:t>
-      </w:r>
-    </w:p>
-    <w:p>
-      <w:pPr>
-        <w:pStyle w:val="Heading3"/>
-      </w:pPr>
-      <w:r>
-        <w:t>Звёздный колокольчик (starbell) — декоративное, днём спит, ночью светится</w:t>
-      </w:r>
-    </w:p>
-    <w:p>
-      <w:r>
-        <w:t>Файлы: Textures/Things/Plant/Avir_PlantStarbell/…_A.png, _B.png, _C.png (день) и Textures/Things/Plant/Avir_PlantStarbell_Night/…_A.png, _B.png, _C.png (ночь). Сейчас — заглушки из снежного бальзама.</w:t>
-      </w:r>
-    </w:p>
-    <w:p>
-      <w:pPr>
-        <w:pStyle w:val="IntenseQuote"/>
-      </w:pPr>
-      <w:r>
-        <w:t>Three variants of one low northern flower for RimWorld, two rows on one sheet, transparent background, top-down 3/4 view, space between all of them. Top row, by day, asleep: a small rosette of narrow pale leaves with several thin stems, each ending in a closed bell-shaped bud hanging down, dull and grey-white. Bottom row, the same three plants at night, awake: the bells opened and turned upward, each glowing a cold blue-white like a small star, a faint glow on the leaves around them. Same shapes and positions in both rows. Very light, cool, desaturated colours. Painterly RimWorld plant style, a thin dark outline. 1536×1024.</w:t>
       </w:r>
     </w:p>
     <w:p>

</xml_diff>

<commit_message>
North: three cold soil variants laid in patches; new ground prompts
Co-Authored-By: Claude Opus 5.5 <noreply@anthropic.com>
Claude-Session: https://claude.ai/code/session_01YCWNLtj9zFsogxZeNiDKcG
</commit_message>
<xml_diff>
--- a/Промпты-арт.docx
+++ b/Промпты-арт.docx
@@ -277,6 +277,32 @@
         <w:pStyle w:val="Heading3"/>
       </w:pPr>
       <w:r>
+        <w:t>Холодная земля — три варианта (замена нынешней, каменистой)</w:t>
+      </w:r>
+    </w:p>
+    <w:p>
+      <w:r>
+        <w:t>Файлы: Textures/Terrain/Surfaces/Avir_ColdSoil.png, Avir_ColdSoil_B.png, Avir_ColdSoil_C.png (без каймы). Игра кладёт их пятнами вперемешку. Нынешняя повторяется на глазах из-за крупных заметных деталей (камни, звёзды инея) — у земли их быть не должно: только мелкое ровное зерно, как у ванильной почвы. Каждый вариант — отдельная картинка, отдельным запросом.</w:t>
+      </w:r>
+    </w:p>
+    <w:p>
+      <w:pPr>
+        <w:pStyle w:val="IntenseQuote"/>
+      </w:pPr>
+      <w:r>
+        <w:t>A seamless tileable ground texture for a top-down game, seen from directly above: dark, slightly cool brown-grey soil with a fine, even, granular grain and a very faint dusting of frost in soft irregular patches; low contrast, uniform density, no stones, no crystals, no snowflake shapes, no cracks, no distinct objects or patterns of any kind that the eye could pick out and recognise when the texture repeats; flat even lighting, no shadows, no outline. Painterly but subtle, in the style of RimWorld's own soil textures. 1024×1024.</w:t>
+      </w:r>
+    </w:p>
+    <w:p>
+      <w:r>
+        <w:t>Для вариантов B и C — тот же запрос, в конце добавить: «a slightly different variation of the same soil: a little more frost» (B) или «a little darker and damper, almost no frost» (C).</w:t>
+      </w:r>
+    </w:p>
+    <w:p>
+      <w:pPr>
+        <w:pStyle w:val="Heading3"/>
+      </w:pPr>
+      <w:r>
         <w:t>Насыщенная потоком ледяная земля (по желанию — сейчас сделана из холодной)</w:t>
       </w:r>
     </w:p>
@@ -290,7 +316,7 @@
         <w:pStyle w:val="IntenseQuote"/>
       </w:pPr>
       <w:r>
-        <w:t>A seamless tileable ground texture for RimWorld seen from directly above: dark cold soil under a crust of frost, the frost crystals faintly glowing pale lilac as if soaked with gentle magic, a few frozen pebbles, no objects, no outline, even lighting. 1024×1024.</w:t>
+        <w:t>A seamless tileable ground texture for a top-down game, seen from directly above: dark, slightly cool soil with a fine, even, granular grain, a soft faint lilac shimmer through it in irregular patches as if soaked with gentle magic; low contrast, no stones, no crystals, no snowflake shapes, no distinct objects that would stand out when the texture repeats; flat even lighting, no outline. Subtle, in the style of RimWorld's own soil textures. 1024×1024.</w:t>
       </w:r>
     </w:p>
     <w:p>

</xml_diff>

<commit_message>
North: new cold soil art (three variants) and stream-imbued soil; Harmony walk only touches [HarmonyPatch] classes, no more false patch errors; absent-wing patch fixed for 1.6
Co-Authored-By: Claude Opus 5.5 <noreply@anthropic.com>
Claude-Session: https://claude.ai/code/session_01YCWNLtj9zFsogxZeNiDKcG
</commit_message>
<xml_diff>
--- a/Промпты-арт.docx
+++ b/Промпты-арт.docx
@@ -257,66 +257,6 @@
       </w:pPr>
       <w:r>
         <w:t>A small ornate fermenting cask seen in the RimWorld top-down 3/4 view, three views on one sheet - facing south, facing east, facing north - side by side with space between them, transparent background: dark wood staves bound with polished silver hoops, an antique gold spigot shaped like a bird's beak on the front (seen on the south view, in profile on the east view, absent on the north view), a faint violet sheen of wine at the seams, one small crescent stamped on the lid. Avir style: a synthesis of dark worked stone, polished silver and antique gold, pale violet essentium and bird-like motifs (feathers, talon and wing curves), with only light celestial accents - one or two small stars, a crescent or a single orbit line, never a star map. Painterly RimWorld style, a thin dark outline. 1536×512.</w:t>
-      </w:r>
-    </w:p>
-    <w:p>
-      <w:pPr>
-        <w:pStyle w:val="Heading2"/>
-      </w:pPr>
-      <w:r>
-        <w:t>Северный лес (биомы «ледяная пустошь» и «ледяной оазис»)</w:t>
-      </w:r>
-    </w:p>
-    <w:p>
-      <w:r>
-        <w:t>Пока везде ванильные заглушки с подкраской. Растения в игре сами получают цветовые варианты (бледный, бледно-лиловый, серебристый, бледно-синий, бледно-изумрудный), поэтому рисовать их лучше в светлых, малонасыщенных тонах: игра умножает цвет картинки на оттенок. Серебряная трава — твой ассет (пока подкрашенная ванильная). Всё остальное стоит, с настоящими цветовыми вариантами (перекрашена только листва), включая лунный осколок и звёздный колокольчик (день и ночь): дерево-укрыватель, ель (GreatFir), иноледное дерево, инеевенец, инеецвет, арктический психоид (из Better Looking Plants), снежный бальзам, арктическая черника, холодная трава; обе почвы и насыщенная потоком земля.</w:t>
-      </w:r>
-    </w:p>
-    <w:p>
-      <w:pPr>
-        <w:pStyle w:val="Heading3"/>
-      </w:pPr>
-      <w:r>
-        <w:t>Холодная земля — три варианта (замена нынешней, каменистой)</w:t>
-      </w:r>
-    </w:p>
-    <w:p>
-      <w:r>
-        <w:t>Файлы: Textures/Terrain/Surfaces/Avir_ColdSoil.png, Avir_ColdSoil_B.png, Avir_ColdSoil_C.png (без каймы). Игра кладёт их пятнами вперемешку. Нынешняя повторяется на глазах из-за крупных заметных деталей (камни, звёзды инея) — у земли их быть не должно: только мелкое ровное зерно, как у ванильной почвы. Каждый вариант — отдельная картинка, отдельным запросом.</w:t>
-      </w:r>
-    </w:p>
-    <w:p>
-      <w:pPr>
-        <w:pStyle w:val="IntenseQuote"/>
-      </w:pPr>
-      <w:r>
-        <w:t>A seamless tileable ground texture for a top-down game, seen from directly above: dark, slightly cool brown-grey soil with a fine, even, granular grain and a very faint dusting of frost in soft irregular patches; low contrast, uniform density, no stones, no crystals, no snowflake shapes, no cracks, no distinct objects or patterns of any kind that the eye could pick out and recognise when the texture repeats; flat even lighting, no shadows, no outline. Painterly but subtle, in the style of RimWorld's own soil textures. 1024×1024.</w:t>
-      </w:r>
-    </w:p>
-    <w:p>
-      <w:r>
-        <w:t>Для вариантов B и C — тот же запрос, в конце добавить: «a slightly different variation of the same soil: a little more frost» (B) или «a little darker and damper, almost no frost» (C).</w:t>
-      </w:r>
-    </w:p>
-    <w:p>
-      <w:pPr>
-        <w:pStyle w:val="Heading3"/>
-      </w:pPr>
-      <w:r>
-        <w:t>Насыщенная потоком ледяная земля (по желанию — сейчас сделана из холодной)</w:t>
-      </w:r>
-    </w:p>
-    <w:p>
-      <w:r>
-        <w:t>Файл: Textures/Terrain/Surfaces/Avir_ImbuedFrostSoil.png (без каймы)</w:t>
-      </w:r>
-    </w:p>
-    <w:p>
-      <w:pPr>
-        <w:pStyle w:val="IntenseQuote"/>
-      </w:pPr>
-      <w:r>
-        <w:t>A seamless tileable ground texture for a top-down game, seen from directly above: dark, slightly cool soil with a fine, even, granular grain, a soft faint lilac shimmer through it in irregular patches as if soaked with gentle magic; low contrast, no stones, no crystals, no snowflake shapes, no distinct objects that would stand out when the texture repeats; flat even lighting, no outline. Subtle, in the style of RimWorld's own soil textures. 1024×1024.</w:t>
       </w:r>
     </w:p>
     <w:p>

</xml_diff>

<commit_message>
North: ponds gather in the snowfields, rarely elsewhere; snow texture prompts
Co-Authored-By: Claude Opus 5.5 <noreply@anthropic.com>
Claude-Session: https://claude.ai/code/session_01YCWNLtj9zFsogxZeNiDKcG
</commit_message>
<xml_diff>
--- a/Промпты-арт.docx
+++ b/Промпты-арт.docx
@@ -257,6 +257,64 @@
       </w:pPr>
       <w:r>
         <w:t>A small ornate fermenting cask seen in the RimWorld top-down 3/4 view, three views on one sheet - facing south, facing east, facing north - side by side with space between them, transparent background: dark wood staves bound with polished silver hoops, an antique gold spigot shaped like a bird's beak on the front (seen on the south view, in profile on the east view, absent on the north view), a faint violet sheen of wine at the seams, one small crescent stamped on the lid. Avir style: a synthesis of dark worked stone, polished silver and antique gold, pale violet essentium and bird-like motifs (feathers, talon and wing curves), with only light celestial accents - one or two small stars, a crescent or a single orbit line, never a star map. Painterly RimWorld style, a thin dark outline. 1536×512.</w:t>
+      </w:r>
+    </w:p>
+    <w:p>
+      <w:pPr>
+        <w:pStyle w:val="Heading2"/>
+      </w:pPr>
+      <w:r>
+        <w:t>Северный лес: снег</w:t>
+      </w:r>
+    </w:p>
+    <w:p>
+      <w:pPr/>
+      <w:r>
+        <w:t>Без каймы. Бесшовная текстура 1024×1024; лучше без отдельных предметов (камней, следов, веток), чтобы повтор не бросался в глаза.</w:t>
+      </w:r>
+    </w:p>
+    <w:p>
+      <w:pPr>
+        <w:pStyle w:val="Heading3"/>
+      </w:pPr>
+      <w:r>
+        <w:t>Затвердевший снег — основной</w:t>
+      </w:r>
+    </w:p>
+    <w:p>
+      <w:pPr/>
+      <w:r>
+        <w:t>Файл: Textures/Terrain/Surfaces/Avir_LooseSnow.png</w:t>
+      </w:r>
+    </w:p>
+    <w:p>
+      <w:pPr>
+        <w:pStyle w:val="IntenseQuote"/>
+      </w:pPr>
+      <w:r>
+        <w:t>A seamless tileable ground texture for a top-down game, seen from directly above: old snow packed hard by wind, clean and almost white with a very faint cool lilac-blue tint, soft wind-carved ripples and shallow drifts, a fine granular crust that catches the light, very gentle blue-violet shadows in the hollows; even, low contrast, no distinct objects, no footprints, no stones, no plants, no seams. Painterly RimWorld terrain style, flat lighting from above. 1024×1024.</w:t>
+      </w:r>
+    </w:p>
+    <w:p>
+      <w:pPr>
+        <w:pStyle w:val="Heading3"/>
+      </w:pPr>
+      <w:r>
+        <w:t>Затвердевший снег — второй вариант (по желанию)</w:t>
+      </w:r>
+    </w:p>
+    <w:p>
+      <w:pPr/>
+      <w:r>
+        <w:t>Файл: Textures/Terrain/Surfaces/Avir_LooseSnow_B.png — для пятен разнообразия, как у холодной почвы.</w:t>
+      </w:r>
+    </w:p>
+    <w:p>
+      <w:pPr>
+        <w:pStyle w:val="IntenseQuote"/>
+      </w:pPr>
+      <w:r>
+        <w:t>The same seamless snow texture, a slightly different variation of it: smoother, wind-polished patches of icy crust with a faint sheen, a little more blue in the shadows; same palette and brightness so the two can sit side by side. 1024×1024.</w:t>
       </w:r>
     </w:p>
     <w:p>

</xml_diff>

<commit_message>
North: canopy roof under the drawn crown (not around the trunk); exactly 2-3 ponds per map in the snowfields; the artist's snow (main + wind-crusted patches); full northern package
Co-Authored-By: Claude Opus 5.5 <noreply@anthropic.com>
Claude-Session: https://claude.ai/code/session_01YCWNLtj9zFsogxZeNiDKcG
</commit_message>
<xml_diff>
--- a/Промпты-арт.docx
+++ b/Промпты-арт.docx
@@ -257,64 +257,6 @@
       </w:pPr>
       <w:r>
         <w:t>A small ornate fermenting cask seen in the RimWorld top-down 3/4 view, three views on one sheet - facing south, facing east, facing north - side by side with space between them, transparent background: dark wood staves bound with polished silver hoops, an antique gold spigot shaped like a bird's beak on the front (seen on the south view, in profile on the east view, absent on the north view), a faint violet sheen of wine at the seams, one small crescent stamped on the lid. Avir style: a synthesis of dark worked stone, polished silver and antique gold, pale violet essentium and bird-like motifs (feathers, talon and wing curves), with only light celestial accents - one or two small stars, a crescent or a single orbit line, never a star map. Painterly RimWorld style, a thin dark outline. 1536×512.</w:t>
-      </w:r>
-    </w:p>
-    <w:p>
-      <w:pPr>
-        <w:pStyle w:val="Heading2"/>
-      </w:pPr>
-      <w:r>
-        <w:t>Северный лес: снег</w:t>
-      </w:r>
-    </w:p>
-    <w:p>
-      <w:pPr/>
-      <w:r>
-        <w:t>Без каймы. Бесшовная текстура 1024×1024; лучше без отдельных предметов (камней, следов, веток), чтобы повтор не бросался в глаза.</w:t>
-      </w:r>
-    </w:p>
-    <w:p>
-      <w:pPr>
-        <w:pStyle w:val="Heading3"/>
-      </w:pPr>
-      <w:r>
-        <w:t>Затвердевший снег — основной</w:t>
-      </w:r>
-    </w:p>
-    <w:p>
-      <w:pPr/>
-      <w:r>
-        <w:t>Файл: Textures/Terrain/Surfaces/Avir_LooseSnow.png</w:t>
-      </w:r>
-    </w:p>
-    <w:p>
-      <w:pPr>
-        <w:pStyle w:val="IntenseQuote"/>
-      </w:pPr>
-      <w:r>
-        <w:t>A seamless tileable ground texture for a top-down game, seen from directly above: old snow packed hard by wind, clean and almost white with a very faint cool lilac-blue tint, soft wind-carved ripples and shallow drifts, a fine granular crust that catches the light, very gentle blue-violet shadows in the hollows; even, low contrast, no distinct objects, no footprints, no stones, no plants, no seams. Painterly RimWorld terrain style, flat lighting from above. 1024×1024.</w:t>
-      </w:r>
-    </w:p>
-    <w:p>
-      <w:pPr>
-        <w:pStyle w:val="Heading3"/>
-      </w:pPr>
-      <w:r>
-        <w:t>Затвердевший снег — второй вариант (по желанию)</w:t>
-      </w:r>
-    </w:p>
-    <w:p>
-      <w:pPr/>
-      <w:r>
-        <w:t>Файл: Textures/Terrain/Surfaces/Avir_LooseSnow_B.png — для пятен разнообразия, как у холодной почвы.</w:t>
-      </w:r>
-    </w:p>
-    <w:p>
-      <w:pPr>
-        <w:pStyle w:val="IntenseQuote"/>
-      </w:pPr>
-      <w:r>
-        <w:t>The same seamless snow texture, a slightly different variation of it: smoother, wind-polished patches of icy crust with a faint sheen, a little more blue in the shadows; same palette and brightness so the two can sit side by side. 1024×1024.</w:t>
       </w:r>
     </w:p>
     <w:p>

</xml_diff>

<commit_message>
North: glowing plants (and now and then a night tree) under every shelter canopy; more silver grass in the waste; northern plants drawn above plant pots; chicks drawn well above the carrier; wing prompts (folded/spread)
Co-Authored-By: Claude Opus 5.5 <noreply@anthropic.com>
Claude-Session: https://claude.ai/code/session_01YCWNLtj9zFsogxZeNiDKcG
</commit_message>
<xml_diff>
--- a/Промпты-арт.docx
+++ b/Промпты-арт.docx
@@ -257,6 +257,64 @@
       </w:pPr>
       <w:r>
         <w:t>A small ornate fermenting cask seen in the RimWorld top-down 3/4 view, three views on one sheet - facing south, facing east, facing north - side by side with space between them, transparent background: dark wood staves bound with polished silver hoops, an antique gold spigot shaped like a bird's beak on the front (seen on the south view, in profile on the east view, absent on the north view), a faint violet sheen of wine at the seams, one small crescent stamped on the lid. Avir style: a synthesis of dark worked stone, polished silver and antique gold, pale violet essentium and bird-like motifs (feathers, talon and wing curves), with only light celestial accents - one or two small stars, a crescent or a single orbit line, never a star map. Painterly RimWorld style, a thin dark outline. 1536×512.</w:t>
+      </w:r>
+    </w:p>
+    <w:p>
+      <w:pPr>
+        <w:pStyle w:val="Heading2"/>
+      </w:pPr>
+      <w:r>
+        <w:t>Крылья Авир: сложенные и раскрытые</w:t>
+      </w:r>
+    </w:p>
+    <w:p>
+      <w:pPr/>
+      <w:r>
+        <w:t>Два листа, по три ракурса. Без каймы обработкой: контур рисуется сразу. Кончики маховых перьев — чистый голубой (#00FFFF): из него я сделаю маску (красный канал — основной цвет перьев, зелёный — цвет кончиков), сам рисунок станет серым. Сложенные — в покое и у птенцов (всегда); раскрытые — в движении, бою и полёте.</w:t>
+      </w:r>
+    </w:p>
+    <w:p>
+      <w:pPr>
+        <w:pStyle w:val="Heading3"/>
+      </w:pPr>
+      <w:r>
+        <w:t>Сложенные крылья</w:t>
+      </w:r>
+    </w:p>
+    <w:p>
+      <w:pPr/>
+      <w:r>
+        <w:t>Файлы: Avir/Wings/Folded/Avir_Wings_south, _east, _north (+ маски _m).</w:t>
+      </w:r>
+    </w:p>
+    <w:p>
+      <w:pPr>
+        <w:pStyle w:val="IntenseQuote"/>
+      </w:pPr>
+      <w:r>
+        <w:t>A pair of large feathered griffin-like wings FOLDED against the back, the long flight feathers lying close together and reaching down to the back of the knees, the shoulders of the wings rising just above the shoulders of the wearer. Feathers only - no claws, no hooks, no bones showing on the wings. Coloring for a mask: every feather in plain neutral light grey with soft painterly shading, EXCEPT the outer ends of the long flight feathers, which are painted flat pure cyan (#00FFFF) with the same shading, as a clean band along the tips; nothing else cyan. RimWorld pawn style (bodyless: only the wings, as they would sit on the back of a slim humanoid), a thin dark outline, transparent background, crisp and detailed. Three views side by side with space between them, same scale and same height on the sheet: facing south (seen from behind the pawn's front, wings framing the body), facing east (side view), facing north (seen from the back). 1536×512, each view 512×512.</w:t>
+      </w:r>
+    </w:p>
+    <w:p>
+      <w:pPr>
+        <w:pStyle w:val="Heading3"/>
+      </w:pPr>
+      <w:r>
+        <w:t>Раскрытые крылья</w:t>
+      </w:r>
+    </w:p>
+    <w:p>
+      <w:pPr/>
+      <w:r>
+        <w:t>Файлы: Avir/Wings/Spread/Avir_Wings_south, _east, _north (+ маски _m).</w:t>
+      </w:r>
+    </w:p>
+    <w:p>
+      <w:pPr>
+        <w:pStyle w:val="IntenseQuote"/>
+      </w:pPr>
+      <w:r>
+        <w:t>A pair of large feathered griffin-like wings SPREAD wide and slightly raised, the long flight feathers fanned out like fingers, the span about twice the width of the wearer. Feathers only - no claws, no hooks, no bones showing on the wings. Coloring for a mask: every feather in plain neutral light grey with soft painterly shading, EXCEPT the outer ends of the long flight feathers, which are painted flat pure cyan (#00FFFF) with the same shading, as a clean band along the tips; nothing else cyan. RimWorld pawn style (bodyless: only the wings, as they would sit on the back of a slim humanoid), a thin dark outline, transparent background, crisp and detailed. Three views side by side with space between them, same scale and same height on the sheet: facing south (seen from behind the pawn's front, wings framing the body), facing east (side view), facing north (seen from the back). 1536×512, each view 512×512.</w:t>
       </w:r>
     </w:p>
     <w:p>

</xml_diff>

<commit_message>
Prompts: raised spread wings; A'Shacsaign membranous wings
Co-Authored-By: Claude Opus 5.5 <noreply@anthropic.com>
Claude-Session: https://claude.ai/code/session_01YCWNLtj9zFsogxZeNiDKcG
</commit_message>
<xml_diff>
--- a/Промпты-арт.docx
+++ b/Промпты-арт.docx
@@ -315,6 +315,58 @@
       </w:pPr>
       <w:r>
         <w:t>A pair of large feathered griffin-like wings SPREAD wide and slightly raised, the long flight feathers fanned out like fingers, the span about twice the width of the wearer. Feathers only - no claws, no hooks, no bones showing on the wings. Coloring for a mask: every feather in plain neutral light grey with soft painterly shading, EXCEPT the outer ends of the long flight feathers, which are painted flat pure cyan (#00FFFF) with the same shading, as a clean band along the tips; nothing else cyan. RimWorld pawn style (bodyless: only the wings, as they would sit on the back of a slim humanoid), a thin dark outline, transparent background, crisp and detailed. Three views side by side with space between them, same scale and same height on the sheet: facing south (seen from behind the pawn's front, wings framing the body), facing east (side view), facing north (seen from the back). 1536×512, each view 512×512.</w:t>
+      </w:r>
+    </w:p>
+    <w:p>
+      <w:pPr>
+        <w:pStyle w:val="Heading3"/>
+      </w:pPr>
+      <w:r>
+        <w:t>Раскрытые крылья — вариант 2 (поднятые, как в полёте)</w:t>
+      </w:r>
+    </w:p>
+    <w:p>
+      <w:pPr/>
+      <w:r>
+        <w:t>Если первый вариант раскрытых смотрится обвисшим: крылья подняты вверх и в стороны, маховые веером.</w:t>
+      </w:r>
+    </w:p>
+    <w:p>
+      <w:pPr>
+        <w:pStyle w:val="IntenseQuote"/>
+      </w:pPr>
+      <w:r>
+        <w:t>A pair of large feathered griffin-like wings SPREAD and RAISED as in flight: the wrists lifted above the head, the long flight feathers fanned outward and slightly upward, the span about twice the width of the wearer; no drooping. Feathers only - no claws. Coloring for a mask: every feather plain neutral light grey with soft shading, the outer ends of the long flight feathers flat pure cyan (#00FFFF) with the same shading; nothing else cyan. RimWorld pawn style (bodyless: only the wings, as they would sit on the back of a slim humanoid), a thin dark outline, transparent background, crisp and detailed. Three views side by side with space between them, same scale and same height on the sheet: facing south (the wearer faces us; the wings are behind the body, only their edges and tops visible past the shoulders), facing east (side view), facing north (seen from the back). 1536×512, each view 512×512.</w:t>
+      </w:r>
+    </w:p>
+    <w:p>
+      <w:pPr>
+        <w:pStyle w:val="Heading3"/>
+      </w:pPr>
+      <w:r>
+        <w:t>Крылья Шаксай — перепончатые (сложенные и раскрытые)</w:t>
+      </w:r>
+    </w:p>
+    <w:p>
+      <w:pPr/>
+      <w:r>
+        <w:t>Два листа, как у Авир. Голубым (#00FFFF) — перепонка между пальцами крыла, остальное (кость, кожа каркаса) серое: из этого я сделаю маску (каркас — основной цвет, перепонка — второй).</w:t>
+      </w:r>
+    </w:p>
+    <w:p>
+      <w:pPr>
+        <w:pStyle w:val="IntenseQuote"/>
+      </w:pPr>
+      <w:r>
+        <w:t>A pair of large featherless membranous wings FOLDED against the back, like a bat's or a dragon's: long slender finger bones folded together, the leathery membrane gathered between them in soft folds, a small thumb-hook at each wrist, the folded tips reaching down to the back of the knees. Coloring for a mask: the bones and the skin of the wing frame plain neutral light grey with soft shading; the membrane between the fingers flat pure cyan (#00FFFF) with the same shading, slightly translucent-looking; nothing else cyan. RimWorld pawn style (bodyless: only the wings, as they would sit on the back of a slim humanoid), a thin dark outline, transparent background, crisp and detailed. Three views side by side with space between them, same scale and same height on the sheet: facing south (the wearer faces us; the wings are behind the body, only their edges and tops visible past the shoulders), facing east (side view), facing north (seen from the back). 1536×512, each view 512×512.</w:t>
+      </w:r>
+    </w:p>
+    <w:p>
+      <w:pPr>
+        <w:pStyle w:val="IntenseQuote"/>
+      </w:pPr>
+      <w:r>
+        <w:t>The same pair of featherless membranous wings SPREAD and RAISED as in flight: the long finger bones fanned wide, the leathery membrane stretched taut between them with a scalloped trailing edge, the span about twice the width of the wearer. Same coloring for a mask: frame grey, membrane flat pure cyan (#00FFFF). RimWorld pawn style (bodyless: only the wings, as they would sit on the back of a slim humanoid), a thin dark outline, transparent background, crisp and detailed. Three views side by side with space between them, same scale and same height on the sheet: facing south (the wearer faces us; the wings are behind the body, only their edges and tops visible past the shoulders), facing east (side view), facing north (seen from the back). 1536×512, each view 512×512.</w:t>
       </w:r>
     </w:p>
     <w:p>

</xml_diff>

<commit_message>
Wings: node drawn 2.6 cells (the graphic's drawSize was ignored); spread wings fill it, folded keep their size; prompts for larger wings
Co-Authored-By: Claude Opus 5.5 <noreply@anthropic.com>
Claude-Session: https://claude.ai/code/session_01YCWNLtj9zFsogxZeNiDKcG
</commit_message>
<xml_diff>
--- a/Промпты-арт.docx
+++ b/Промпты-арт.docx
@@ -371,6 +371,36 @@
     </w:p>
     <w:p>
       <w:pPr>
+        <w:pStyle w:val="Heading3"/>
+      </w:pPr>
+      <w:r>
+        <w:t>Крылья, вариант 3: крупные, на всю клетку</w:t>
+      </w:r>
+    </w:p>
+    <w:p>
+      <w:pPr/>
+      <w:r>
+        <w:t>Если нынешние раскрытые всё ещё малы: те же два вида (Авир и Шаксай), но крылья занимают весь квадрат. Голубой (#00FFFF) — как раньше: кончики маховых у Авир, перепонка у Шаксай.</w:t>
+      </w:r>
+    </w:p>
+    <w:p>
+      <w:pPr>
+        <w:pStyle w:val="IntenseQuote"/>
+      </w:pPr>
+      <w:r>
+        <w:t>A pair of huge feathered griffin wings SPREAD WIDE in flight, the wingspan three times the width of the wearer's shoulders, wrists raised above the head, the long flight feathers fanned out and up, a strong, sweeping silhouette. Feathers only, no claws. Coloring for a mask: every feather plain neutral light grey with soft shading, the outer ends of the long flight feathers flat pure cyan (#00FFFF); nothing else cyan. RimWorld pawn style (only the wings, no body), a thin dark outline, plain white background, crisp and detailed. Three views side by side with space between them, same scale: facing south, facing east (side view), facing north. 1536×512, each view 512×512; the wings FILL their 512×512 square edge to edge - as large as the square allows.</w:t>
+      </w:r>
+    </w:p>
+    <w:p>
+      <w:pPr>
+        <w:pStyle w:val="IntenseQuote"/>
+      </w:pPr>
+      <w:r>
+        <w:t>A pair of huge featherless membranous wings SPREAD WIDE in flight, like a dragon's: the wingspan three times the width of the wearer's shoulders, long finger bones fanned wide, the leathery membrane stretched taut with a scalloped trailing edge, a small hook at each wrist. Coloring for a mask: bones and frame plain neutral light grey with soft shading, the membrane flat pure cyan (#00FFFF). RimWorld pawn style (only the wings, no body), a thin dark outline, plain white background, crisp and detailed. Three views side by side with space between them, same scale: facing south, facing east (side view), facing north. 1536×512, each view 512×512; the wings FILL their 512×512 square edge to edge - as large as the square allows.</w:t>
+      </w:r>
+    </w:p>
+    <w:p>
+      <w:pPr>
         <w:pStyle w:val="Heading2"/>
       </w:pPr>
       <w:r>

</xml_diff>

<commit_message>
Potted plants get wind weights (no more flinging); heartwing bands ignore stray textures; architect slot delivers materials; prompts: stream soil, twilight forest plants
Co-Authored-By: Claude Opus 5.5 <noreply@anthropic.com>
Claude-Session: https://claude.ai/code/session_01YCWNLtj9zFsogxZeNiDKcG
</commit_message>
<xml_diff>
--- a/Промпты-арт.docx
+++ b/Промпты-арт.docx
@@ -412,6 +412,130 @@
         <w:t>Лист иконок нарисован и стоит в моде (тёмную кайму иконкам добавляет обработка). Иконка «опустить птенцов» не используется — на этой кнопке остаётся ванильная.</w:t>
       </w:r>
     </w:p>
+    <w:p>
+      <w:pPr>
+        <w:pStyle w:val="Heading2"/>
+      </w:pPr>
+      <w:r>
+        <w:t>Почва потока (рисует артефакт)</w:t>
+      </w:r>
+    </w:p>
+    <w:p>
+      <w:pPr/>
+      <w:r>
+        <w:t>Файл: Textures/Terrain/Surfaces/Avir_StreamSoil.png (сейчас стоит ванильная богатая почва). Это земля, а не предмет: без тёмной каймы, бесшовная плитка.</w:t>
+      </w:r>
+    </w:p>
+    <w:p>
+      <w:pPr>
+        <w:pStyle w:val="IntenseQuote"/>
+      </w:pPr>
+      <w:r>
+        <w:t>A seamless tileable top-down ground texture for RimWorld, seen straight from above: rich dark loamy soil, almost black-brown, crumbly and moist, with very fine threads and specks of pale violet light running through it like faint veins of glowing essence, and a few tiny antique-gold glints; the light is even and soft, no cast shadows, no large features, no stones, no plants, no outline; the pattern is spread evenly so it tiles without visible seams. Painterly RimWorld terrain style, matte. 1024x1024.</w:t>
+      </w:r>
+    </w:p>
+    <w:p>
+      <w:pPr>
+        <w:pStyle w:val="Heading2"/>
+      </w:pPr>
+      <w:r>
+        <w:t>Сумеречный Лес: новые растения</w:t>
+      </w:r>
+    </w:p>
+    <w:p>
+      <w:pPr/>
+      <w:r>
+        <w:t>Для всех растений: картинки уходят в атлас, поэтому каждый вариант после нарезки будет 508x508 (лист 1536x512 подходит). Вид сверху-сбоку, как у растений RimWorld, прозрачный фон, тонкая тёмная обводка.</w:t>
+      </w:r>
+    </w:p>
+    <w:p>
+      <w:pPr>
+        <w:pStyle w:val="Heading3"/>
+      </w:pPr>
+      <w:r>
+        <w:t>Сумеречная ива — дерево (три варианта)</w:t>
+      </w:r>
+    </w:p>
+    <w:p>
+      <w:pPr/>
+      <w:r>
+        <w:t>Файлы: Textures/Things/Plant/Avir_TreeTwilightWillow/Avir_TreeTwilightWillow_A.png, _B.png, _C.png.</w:t>
+      </w:r>
+    </w:p>
+    <w:p>
+      <w:pPr>
+        <w:pStyle w:val="IntenseQuote"/>
+      </w:pPr>
+      <w:r>
+        <w:t>Three variants of one tree for RimWorld on one sheet, side by side with space between them, seen in the RimWorld top-down 3/4 view, transparent background: a weeping willow of a dusky northern forest - a slender dark grey-violet trunk with a few twisting roots at its foot, the crown made of long drooping curtains of thin silvery-green leaves that fall almost to the ground; here and there a hanging strand carries tiny pale lilac catkins that softly glow, like small lanterns in the dusk; each variant slightly different in shape and lean. Painterly RimWorld plant style, a thin dark outline. 1536x512.</w:t>
+      </w:r>
+    </w:p>
+    <w:p>
+      <w:pPr/>
+      <w:r>
+        <w:t>Зимний вариант (без листвы) — по желанию, тем же листом, файлы Avir_TreeTwilightWillow_Leafless_A/B/C.png:</w:t>
+      </w:r>
+    </w:p>
+    <w:p>
+      <w:pPr>
+        <w:pStyle w:val="IntenseQuote"/>
+      </w:pPr>
+      <w:r>
+        <w:t>The same three weeping willows without leaves, in winter: bare slender dark grey-violet trunks, long thin whip-like branches hanging down in curtains, a light dusting of snow on the upper boughs, no catkins. Same view, layout and style: RimWorld top-down 3/4 view, transparent background, a thin dark outline. 1536x512.</w:t>
+      </w:r>
+    </w:p>
+    <w:p>
+      <w:pPr>
+        <w:pStyle w:val="Heading3"/>
+      </w:pPr>
+      <w:r>
+        <w:t>Сумеречный корень — лечебное растение (аналог лечебного корня)</w:t>
+      </w:r>
+    </w:p>
+    <w:p>
+      <w:pPr/>
+      <w:r>
+        <w:t>Файлы: Textures/Things/Plant/Avir_PlantDuskroot/Avir_PlantDuskroot_A/B/C.png (взрослое) и Avir_PlantDuskroot_Immature_A/B/C.png (молодое). Даёт травяное лекарство, чуть больше лечебного корня.</w:t>
+      </w:r>
+    </w:p>
+    <w:p>
+      <w:pPr>
+        <w:pStyle w:val="IntenseQuote"/>
+      </w:pPr>
+      <w:r>
+        <w:t>Three variants of one low medicinal herb for RimWorld on one sheet, side by side with space between them, seen in the RimWorld top-down 3/4 view, transparent background: a small round clump of broad dark green leaves with fine violet veins, from its middle rise a few stems with drooping pale lilac-white bell-shaped flowers, and at its foot a thick gnarled pale root shows above the soil; each variant slightly different. Painterly RimWorld plant style, a thin dark outline. 1536x512.</w:t>
+      </w:r>
+    </w:p>
+    <w:p>
+      <w:pPr>
+        <w:pStyle w:val="IntenseQuote"/>
+      </w:pPr>
+      <w:r>
+        <w:t>The same herb, young: three variants of a small clump of broad dark green leaves with fine violet veins, no flowers yet, the pale root only just showing. Same view, layout and style: RimWorld top-down 3/4 view, transparent background, a thin dark outline. 1536x512.</w:t>
+      </w:r>
+    </w:p>
+    <w:p>
+      <w:pPr>
+        <w:pStyle w:val="Heading3"/>
+      </w:pPr>
+      <w:r>
+        <w:t>Густая сумеречная трава</w:t>
+      </w:r>
+    </w:p>
+    <w:p>
+      <w:pPr/>
+      <w:r>
+        <w:t>Файлы: Textures/Things/Plant/Avir_PlantDuskGrass/Avir_PlantDuskGrass_A/B/C.png. Очень густая и плотная: в одной клетке несколько пучков.</w:t>
+      </w:r>
+    </w:p>
+    <w:p>
+      <w:pPr>
+        <w:pStyle w:val="IntenseQuote"/>
+      </w:pPr>
+      <w:r>
+        <w:t>Three variants of one grass tuft for RimWorld on one sheet, side by side with space between them, seen in the RimWorld top-down 3/4 view, transparent background: a very dense, lush, compact tuft of tall soft grass, deep blue-green blades crowded tightly together with pale silver tips, a few blades bending over, a couple of tiny pale seed heads; full and thick, almost like a small carpet. Painterly RimWorld plant style, a thin dark outline. 1536x512.</w:t>
+      </w:r>
+    </w:p>
     <w:sectPr>
       <w:pgSz w:w="12240" w:h="15840"/>
       <w:pgMar w:top="1440" w:right="1800" w:bottom="1440" w:left="1800" w:header="720" w:footer="720" w:gutter="0"/>

</xml_diff>

<commit_message>
Twilight forest art in place (willow summer/winter, duskroot); more fog in the north; twilight forest prompts in their own file
Co-Authored-By: Claude Opus 5.5 <noreply@anthropic.com>
Claude-Session: https://claude.ai/code/session_01YCWNLtj9zFsogxZeNiDKcG
</commit_message>
<xml_diff>
--- a/Промпты-арт.docx
+++ b/Промпты-арт.docx
@@ -515,25 +515,8 @@
       </w:r>
     </w:p>
     <w:p>
-      <w:pPr>
-        <w:pStyle w:val="Heading3"/>
-      </w:pPr>
       <w:r>
-        <w:t>Густая сумеречная трава</w:t>
-      </w:r>
-    </w:p>
-    <w:p>
-      <w:pPr/>
-      <w:r>
-        <w:t>Файлы: Textures/Things/Plant/Avir_PlantDuskGrass/Avir_PlantDuskGrass_A/B/C.png. Очень густая и плотная: в одной клетке несколько пучков.</w:t>
-      </w:r>
-    </w:p>
-    <w:p>
-      <w:pPr>
-        <w:pStyle w:val="IntenseQuote"/>
-      </w:pPr>
-      <w:r>
-        <w:t>Three variants of one grass tuft for RimWorld on one sheet, side by side with space between them, seen in the RimWorld top-down 3/4 view, transparent background: a very dense, lush, compact tuft of tall soft grass, deep blue-green blades crowded tightly together with pale silver tips, a few blades bending over, a couple of tiny pale seed heads; full and thick, almost like a small carpet. Painterly RimWorld plant style, a thin dark outline. 1536x512.</w:t>
+        <w:t>Дальше по Сумеречному Лесу — отдельный файл Промпты-Сумеречный-лес.docx.</w:t>
       </w:r>
     </w:p>
     <w:sectPr>

</xml_diff>